<commit_message>
Question 2 & 3 Answered
</commit_message>
<xml_diff>
--- a/ST10493664 INSY6211 A1.docx
+++ b/ST10493664 INSY6211 A1.docx
@@ -2,9 +2,18 @@
 <file path=word/document.xml><?xml version="1.0" encoding="utf-8"?>
 <w:document xmlns:wpc="http://schemas.microsoft.com/office/word/2010/wordprocessingCanvas" xmlns:cx="http://schemas.microsoft.com/office/drawing/2014/chartex" xmlns:cx1="http://schemas.microsoft.com/office/drawing/2015/9/8/chartex" xmlns:cx2="http://schemas.microsoft.com/office/drawing/2015/10/21/chartex" xmlns:cx3="http://schemas.microsoft.com/office/drawing/2016/5/9/chartex" xmlns:cx4="http://schemas.microsoft.com/office/drawing/2016/5/10/chartex" xmlns:cx5="http://schemas.microsoft.com/office/drawing/2016/5/11/chartex" xmlns:cx6="http://schemas.microsoft.com/office/drawing/2016/5/12/chartex" xmlns:cx7="http://schemas.microsoft.com/office/drawing/2016/5/13/chartex" xmlns:cx8="http://schemas.microsoft.com/office/drawing/2016/5/14/chartex" xmlns:mc="http://schemas.openxmlformats.org/markup-compatibility/2006" xmlns:aink="http://schemas.microsoft.com/office/drawing/2016/ink" xmlns:am3d="http://schemas.microsoft.com/office/drawing/2017/model3d" xmlns:o="urn:schemas-microsoft-com:office:office" xmlns:oel="http://schemas.microsoft.com/office/2019/extlst" xmlns:r="http://schemas.openxmlformats.org/officeDocument/2006/relationships" xmlns:m="http://schemas.openxmlformats.org/officeDocument/2006/math" xmlns:v="urn:schemas-microsoft-com:vml" xmlns:wp14="http://schemas.microsoft.com/office/word/2010/wordprocessingDrawing" xmlns:wp="http://schemas.openxmlformats.org/drawingml/2006/wordprocessingDrawing" xmlns:w10="urn:schemas-microsoft-com:office:word" xmlns:w="http://schemas.openxmlformats.org/wordprocessingml/2006/main" xmlns:w14="http://schemas.microsoft.com/office/word/2010/wordml" xmlns:w15="http://schemas.microsoft.com/office/word/2012/wordml" xmlns:w16cex="http://schemas.microsoft.com/office/word/2018/wordml/cex" xmlns:w16cid="http://schemas.microsoft.com/office/word/2016/wordml/cid" xmlns:w16="http://schemas.microsoft.com/office/word/2018/wordml" xmlns:w16du="http://schemas.microsoft.com/office/word/2023/wordml/word16du" xmlns:w16sdtdh="http://schemas.microsoft.com/office/word/2020/wordml/sdtdatahash" xmlns:w16sdtfl="http://schemas.microsoft.com/office/word/2024/wordml/sdtformatlock" xmlns:w16se="http://schemas.microsoft.com/office/word/2015/wordml/symex" xmlns:wpg="http://schemas.microsoft.com/office/word/2010/wordprocessingGroup" xmlns:wpi="http://schemas.microsoft.com/office/word/2010/wordprocessingInk" xmlns:wne="http://schemas.microsoft.com/office/word/2006/wordml" xmlns:wps="http://schemas.microsoft.com/office/word/2010/wordprocessingShape" mc:Ignorable="w14 w15 w16se w16cid w16 w16cex w16sdtdh w16sdtfl w16du wp14">
   <w:body>
-    <w:p/>
+    <w:p>
+      <w:pPr>
+        <w:rPr>
+          <w:rFonts w:asciiTheme="minorHAnsi" w:hAnsiTheme="minorHAnsi"/>
+        </w:rPr>
+      </w:pPr>
+    </w:p>
     <w:sdt>
       <w:sdtPr>
+        <w:rPr>
+          <w:rFonts w:asciiTheme="minorHAnsi" w:hAnsiTheme="minorHAnsi"/>
+        </w:rPr>
         <w:id w:val="1497462450"/>
         <w:docPartObj>
           <w:docPartGallery w:val="Cover Pages"/>
@@ -14,8 +23,14 @@
       <w:sdtEndPr/>
       <w:sdtContent>
         <w:p>
+          <w:pPr>
+            <w:rPr>
+              <w:rFonts w:asciiTheme="minorHAnsi" w:hAnsiTheme="minorHAnsi"/>
+            </w:rPr>
+          </w:pPr>
           <w:r>
             <w:rPr>
+              <w:rFonts w:asciiTheme="minorHAnsi" w:hAnsiTheme="minorHAnsi"/>
               <w:noProof/>
             </w:rPr>
             <mc:AlternateContent>
@@ -284,6 +299,7 @@
           </w:r>
           <w:r>
             <w:rPr>
+              <w:rFonts w:asciiTheme="minorHAnsi" w:hAnsiTheme="minorHAnsi"/>
               <w:noProof/>
             </w:rPr>
             <mc:AlternateContent>
@@ -538,9 +554,14 @@
           </w:r>
         </w:p>
         <w:p>
+          <w:pPr>
+            <w:rPr>
+              <w:rFonts w:asciiTheme="minorHAnsi" w:hAnsiTheme="minorHAnsi"/>
+            </w:rPr>
+          </w:pPr>
           <w:r>
             <w:rPr>
-              <w:rFonts w:cs="Calibri"/>
+              <w:rFonts w:asciiTheme="minorHAnsi" w:hAnsiTheme="minorHAnsi" w:cs="Calibri"/>
               <w:noProof/>
             </w:rPr>
             <mc:AlternateContent>
@@ -668,6 +689,9 @@
             </mc:AlternateContent>
           </w:r>
           <w:r>
+            <w:rPr>
+              <w:rFonts w:asciiTheme="minorHAnsi" w:hAnsiTheme="minorHAnsi"/>
+            </w:rPr>
             <w:br w:type="page"/>
           </w:r>
         </w:p>
@@ -676,7 +700,7 @@
     <w:sdt>
       <w:sdtPr>
         <w:rPr>
-          <w:rFonts w:eastAsiaTheme="minorHAnsi" w:cstheme="minorBidi"/>
+          <w:rFonts w:asciiTheme="minorHAnsi" w:eastAsiaTheme="minorHAnsi" w:hAnsiTheme="minorHAnsi" w:cstheme="minorBidi"/>
           <w:color w:val="auto"/>
           <w:kern w:val="2"/>
           <w:sz w:val="22"/>
@@ -702,8 +726,14 @@
         <w:p>
           <w:pPr>
             <w:pStyle w:val="TOCHeading"/>
+            <w:rPr>
+              <w:rFonts w:asciiTheme="minorHAnsi" w:hAnsiTheme="minorHAnsi"/>
+            </w:rPr>
           </w:pPr>
           <w:r>
+            <w:rPr>
+              <w:rFonts w:asciiTheme="minorHAnsi" w:hAnsiTheme="minorHAnsi"/>
+            </w:rPr>
             <w:t>Table of Contents</w:t>
           </w:r>
         </w:p>
@@ -714,28 +744,40 @@
               <w:tab w:val="right" w:leader="dot" w:pos="9016"/>
             </w:tabs>
             <w:rPr>
+              <w:rFonts w:asciiTheme="minorHAnsi" w:hAnsiTheme="minorHAnsi"/>
               <w:noProof/>
             </w:rPr>
           </w:pPr>
           <w:r>
+            <w:rPr>
+              <w:rFonts w:asciiTheme="minorHAnsi" w:hAnsiTheme="minorHAnsi"/>
+            </w:rPr>
             <w:fldChar w:fldCharType="begin"/>
           </w:r>
           <w:r>
+            <w:rPr>
+              <w:rFonts w:asciiTheme="minorHAnsi" w:hAnsiTheme="minorHAnsi"/>
+            </w:rPr>
             <w:instrText xml:space="preserve"> TOC \o "1-3" \h \z \u </w:instrText>
           </w:r>
           <w:r>
+            <w:rPr>
+              <w:rFonts w:asciiTheme="minorHAnsi" w:hAnsiTheme="minorHAnsi"/>
+            </w:rPr>
             <w:fldChar w:fldCharType="separate"/>
           </w:r>
           <w:hyperlink w:anchor="_Toc224114453" w:history="1">
             <w:r>
               <w:rPr>
                 <w:rStyle w:val="Hyperlink"/>
+                <w:rFonts w:asciiTheme="minorHAnsi" w:hAnsiTheme="minorHAnsi"/>
                 <w:noProof/>
               </w:rPr>
               <w:t>Question 1</w:t>
             </w:r>
             <w:r>
               <w:rPr>
+                <w:rFonts w:asciiTheme="minorHAnsi" w:hAnsiTheme="minorHAnsi"/>
                 <w:noProof/>
                 <w:webHidden/>
               </w:rPr>
@@ -743,6 +785,7 @@
             </w:r>
             <w:r>
               <w:rPr>
+                <w:rFonts w:asciiTheme="minorHAnsi" w:hAnsiTheme="minorHAnsi"/>
                 <w:noProof/>
                 <w:webHidden/>
               </w:rPr>
@@ -750,6 +793,7 @@
             </w:r>
             <w:r>
               <w:rPr>
+                <w:rFonts w:asciiTheme="minorHAnsi" w:hAnsiTheme="minorHAnsi"/>
                 <w:noProof/>
                 <w:webHidden/>
               </w:rPr>
@@ -757,12 +801,14 @@
             </w:r>
             <w:r>
               <w:rPr>
+                <w:rFonts w:asciiTheme="minorHAnsi" w:hAnsiTheme="minorHAnsi"/>
                 <w:noProof/>
                 <w:webHidden/>
               </w:rPr>
             </w:r>
             <w:r>
               <w:rPr>
+                <w:rFonts w:asciiTheme="minorHAnsi" w:hAnsiTheme="minorHAnsi"/>
                 <w:noProof/>
                 <w:webHidden/>
               </w:rPr>
@@ -770,6 +816,7 @@
             </w:r>
             <w:r>
               <w:rPr>
+                <w:rFonts w:asciiTheme="minorHAnsi" w:hAnsiTheme="minorHAnsi"/>
                 <w:noProof/>
                 <w:webHidden/>
               </w:rPr>
@@ -777,6 +824,7 @@
             </w:r>
             <w:r>
               <w:rPr>
+                <w:rFonts w:asciiTheme="minorHAnsi" w:hAnsiTheme="minorHAnsi"/>
                 <w:noProof/>
                 <w:webHidden/>
               </w:rPr>
@@ -791,6 +839,7 @@
               <w:tab w:val="right" w:leader="dot" w:pos="9016"/>
             </w:tabs>
             <w:rPr>
+              <w:rFonts w:asciiTheme="minorHAnsi" w:hAnsiTheme="minorHAnsi"/>
               <w:noProof/>
             </w:rPr>
           </w:pPr>
@@ -798,12 +847,14 @@
             <w:r>
               <w:rPr>
                 <w:rStyle w:val="Hyperlink"/>
+                <w:rFonts w:asciiTheme="minorHAnsi" w:hAnsiTheme="minorHAnsi"/>
                 <w:noProof/>
               </w:rPr>
               <w:t>Question 2</w:t>
             </w:r>
             <w:r>
               <w:rPr>
+                <w:rFonts w:asciiTheme="minorHAnsi" w:hAnsiTheme="minorHAnsi"/>
                 <w:noProof/>
                 <w:webHidden/>
               </w:rPr>
@@ -811,6 +862,7 @@
             </w:r>
             <w:r>
               <w:rPr>
+                <w:rFonts w:asciiTheme="minorHAnsi" w:hAnsiTheme="minorHAnsi"/>
                 <w:noProof/>
                 <w:webHidden/>
               </w:rPr>
@@ -818,6 +870,7 @@
             </w:r>
             <w:r>
               <w:rPr>
+                <w:rFonts w:asciiTheme="minorHAnsi" w:hAnsiTheme="minorHAnsi"/>
                 <w:noProof/>
                 <w:webHidden/>
               </w:rPr>
@@ -825,12 +878,14 @@
             </w:r>
             <w:r>
               <w:rPr>
+                <w:rFonts w:asciiTheme="minorHAnsi" w:hAnsiTheme="minorHAnsi"/>
                 <w:noProof/>
                 <w:webHidden/>
               </w:rPr>
             </w:r>
             <w:r>
               <w:rPr>
+                <w:rFonts w:asciiTheme="minorHAnsi" w:hAnsiTheme="minorHAnsi"/>
                 <w:noProof/>
                 <w:webHidden/>
               </w:rPr>
@@ -838,6 +893,7 @@
             </w:r>
             <w:r>
               <w:rPr>
+                <w:rFonts w:asciiTheme="minorHAnsi" w:hAnsiTheme="minorHAnsi"/>
                 <w:noProof/>
                 <w:webHidden/>
               </w:rPr>
@@ -845,6 +901,7 @@
             </w:r>
             <w:r>
               <w:rPr>
+                <w:rFonts w:asciiTheme="minorHAnsi" w:hAnsiTheme="minorHAnsi"/>
                 <w:noProof/>
                 <w:webHidden/>
               </w:rPr>
@@ -859,6 +916,7 @@
               <w:tab w:val="right" w:leader="dot" w:pos="9016"/>
             </w:tabs>
             <w:rPr>
+              <w:rFonts w:asciiTheme="minorHAnsi" w:hAnsiTheme="minorHAnsi"/>
               <w:noProof/>
             </w:rPr>
           </w:pPr>
@@ -866,12 +924,14 @@
             <w:r>
               <w:rPr>
                 <w:rStyle w:val="Hyperlink"/>
+                <w:rFonts w:asciiTheme="minorHAnsi" w:hAnsiTheme="minorHAnsi"/>
                 <w:noProof/>
               </w:rPr>
               <w:t>Question 3</w:t>
             </w:r>
             <w:r>
               <w:rPr>
+                <w:rFonts w:asciiTheme="minorHAnsi" w:hAnsiTheme="minorHAnsi"/>
                 <w:noProof/>
                 <w:webHidden/>
               </w:rPr>
@@ -879,6 +939,7 @@
             </w:r>
             <w:r>
               <w:rPr>
+                <w:rFonts w:asciiTheme="minorHAnsi" w:hAnsiTheme="minorHAnsi"/>
                 <w:noProof/>
                 <w:webHidden/>
               </w:rPr>
@@ -886,6 +947,7 @@
             </w:r>
             <w:r>
               <w:rPr>
+                <w:rFonts w:asciiTheme="minorHAnsi" w:hAnsiTheme="minorHAnsi"/>
                 <w:noProof/>
                 <w:webHidden/>
               </w:rPr>
@@ -893,12 +955,14 @@
             </w:r>
             <w:r>
               <w:rPr>
+                <w:rFonts w:asciiTheme="minorHAnsi" w:hAnsiTheme="minorHAnsi"/>
                 <w:noProof/>
                 <w:webHidden/>
               </w:rPr>
             </w:r>
             <w:r>
               <w:rPr>
+                <w:rFonts w:asciiTheme="minorHAnsi" w:hAnsiTheme="minorHAnsi"/>
                 <w:noProof/>
                 <w:webHidden/>
               </w:rPr>
@@ -906,6 +970,7 @@
             </w:r>
             <w:r>
               <w:rPr>
+                <w:rFonts w:asciiTheme="minorHAnsi" w:hAnsiTheme="minorHAnsi"/>
                 <w:noProof/>
                 <w:webHidden/>
               </w:rPr>
@@ -913,6 +978,7 @@
             </w:r>
             <w:r>
               <w:rPr>
+                <w:rFonts w:asciiTheme="minorHAnsi" w:hAnsiTheme="minorHAnsi"/>
                 <w:noProof/>
                 <w:webHidden/>
               </w:rPr>
@@ -927,6 +993,7 @@
               <w:tab w:val="right" w:leader="dot" w:pos="9016"/>
             </w:tabs>
             <w:rPr>
+              <w:rFonts w:asciiTheme="minorHAnsi" w:hAnsiTheme="minorHAnsi"/>
               <w:noProof/>
             </w:rPr>
           </w:pPr>
@@ -934,12 +1001,14 @@
             <w:r>
               <w:rPr>
                 <w:rStyle w:val="Hyperlink"/>
+                <w:rFonts w:asciiTheme="minorHAnsi" w:hAnsiTheme="minorHAnsi"/>
                 <w:noProof/>
               </w:rPr>
               <w:t>Question 4</w:t>
             </w:r>
             <w:r>
               <w:rPr>
+                <w:rFonts w:asciiTheme="minorHAnsi" w:hAnsiTheme="minorHAnsi"/>
                 <w:noProof/>
                 <w:webHidden/>
               </w:rPr>
@@ -947,6 +1016,7 @@
             </w:r>
             <w:r>
               <w:rPr>
+                <w:rFonts w:asciiTheme="minorHAnsi" w:hAnsiTheme="minorHAnsi"/>
                 <w:noProof/>
                 <w:webHidden/>
               </w:rPr>
@@ -954,6 +1024,7 @@
             </w:r>
             <w:r>
               <w:rPr>
+                <w:rFonts w:asciiTheme="minorHAnsi" w:hAnsiTheme="minorHAnsi"/>
                 <w:noProof/>
                 <w:webHidden/>
               </w:rPr>
@@ -961,12 +1032,14 @@
             </w:r>
             <w:r>
               <w:rPr>
+                <w:rFonts w:asciiTheme="minorHAnsi" w:hAnsiTheme="minorHAnsi"/>
                 <w:noProof/>
                 <w:webHidden/>
               </w:rPr>
             </w:r>
             <w:r>
               <w:rPr>
+                <w:rFonts w:asciiTheme="minorHAnsi" w:hAnsiTheme="minorHAnsi"/>
                 <w:noProof/>
                 <w:webHidden/>
               </w:rPr>
@@ -974,6 +1047,7 @@
             </w:r>
             <w:r>
               <w:rPr>
+                <w:rFonts w:asciiTheme="minorHAnsi" w:hAnsiTheme="minorHAnsi"/>
                 <w:noProof/>
                 <w:webHidden/>
               </w:rPr>
@@ -981,6 +1055,7 @@
             </w:r>
             <w:r>
               <w:rPr>
+                <w:rFonts w:asciiTheme="minorHAnsi" w:hAnsiTheme="minorHAnsi"/>
                 <w:noProof/>
                 <w:webHidden/>
               </w:rPr>
@@ -995,6 +1070,7 @@
               <w:tab w:val="right" w:leader="dot" w:pos="9016"/>
             </w:tabs>
             <w:rPr>
+              <w:rFonts w:asciiTheme="minorHAnsi" w:hAnsiTheme="minorHAnsi"/>
               <w:noProof/>
             </w:rPr>
           </w:pPr>
@@ -1002,12 +1078,14 @@
             <w:r>
               <w:rPr>
                 <w:rStyle w:val="Hyperlink"/>
+                <w:rFonts w:asciiTheme="minorHAnsi" w:hAnsiTheme="minorHAnsi"/>
                 <w:noProof/>
               </w:rPr>
               <w:t>References</w:t>
             </w:r>
             <w:r>
               <w:rPr>
+                <w:rFonts w:asciiTheme="minorHAnsi" w:hAnsiTheme="minorHAnsi"/>
                 <w:noProof/>
                 <w:webHidden/>
               </w:rPr>
@@ -1015,6 +1093,7 @@
             </w:r>
             <w:r>
               <w:rPr>
+                <w:rFonts w:asciiTheme="minorHAnsi" w:hAnsiTheme="minorHAnsi"/>
                 <w:noProof/>
                 <w:webHidden/>
               </w:rPr>
@@ -1022,6 +1101,7 @@
             </w:r>
             <w:r>
               <w:rPr>
+                <w:rFonts w:asciiTheme="minorHAnsi" w:hAnsiTheme="minorHAnsi"/>
                 <w:noProof/>
                 <w:webHidden/>
               </w:rPr>
@@ -1029,12 +1109,14 @@
             </w:r>
             <w:r>
               <w:rPr>
+                <w:rFonts w:asciiTheme="minorHAnsi" w:hAnsiTheme="minorHAnsi"/>
                 <w:noProof/>
                 <w:webHidden/>
               </w:rPr>
             </w:r>
             <w:r>
               <w:rPr>
+                <w:rFonts w:asciiTheme="minorHAnsi" w:hAnsiTheme="minorHAnsi"/>
                 <w:noProof/>
                 <w:webHidden/>
               </w:rPr>
@@ -1042,6 +1124,7 @@
             </w:r>
             <w:r>
               <w:rPr>
+                <w:rFonts w:asciiTheme="minorHAnsi" w:hAnsiTheme="minorHAnsi"/>
                 <w:noProof/>
                 <w:webHidden/>
               </w:rPr>
@@ -1049,6 +1132,7 @@
             </w:r>
             <w:r>
               <w:rPr>
+                <w:rFonts w:asciiTheme="minorHAnsi" w:hAnsiTheme="minorHAnsi"/>
                 <w:noProof/>
                 <w:webHidden/>
               </w:rPr>
@@ -1057,8 +1141,14 @@
           </w:hyperlink>
         </w:p>
         <w:p>
+          <w:pPr>
+            <w:rPr>
+              <w:rFonts w:asciiTheme="minorHAnsi" w:hAnsiTheme="minorHAnsi"/>
+            </w:rPr>
+          </w:pPr>
           <w:r>
             <w:rPr>
+              <w:rFonts w:asciiTheme="minorHAnsi" w:hAnsiTheme="minorHAnsi"/>
               <w:b/>
               <w:bCs/>
               <w:noProof/>
@@ -1068,23 +1158,46 @@
         </w:p>
       </w:sdtContent>
     </w:sdt>
-    <w:p/>
-    <w:p>
-      <w:r>
+    <w:p>
+      <w:pPr>
+        <w:rPr>
+          <w:rFonts w:asciiTheme="minorHAnsi" w:hAnsiTheme="minorHAnsi"/>
+        </w:rPr>
+      </w:pPr>
+    </w:p>
+    <w:p>
+      <w:pPr>
+        <w:rPr>
+          <w:rFonts w:asciiTheme="minorHAnsi" w:hAnsiTheme="minorHAnsi"/>
+        </w:rPr>
+      </w:pPr>
+      <w:r>
+        <w:rPr>
+          <w:rFonts w:asciiTheme="minorHAnsi" w:hAnsiTheme="minorHAnsi"/>
+        </w:rPr>
         <w:br w:type="page"/>
       </w:r>
     </w:p>
     <w:p>
       <w:pPr>
         <w:pStyle w:val="Heading1"/>
+        <w:rPr>
+          <w:rFonts w:asciiTheme="minorHAnsi" w:hAnsiTheme="minorHAnsi"/>
+        </w:rPr>
       </w:pPr>
       <w:bookmarkStart w:id="0" w:name="_Toc224114453"/>
       <w:r>
+        <w:rPr>
+          <w:rFonts w:asciiTheme="minorHAnsi" w:hAnsiTheme="minorHAnsi"/>
+        </w:rPr>
         <w:lastRenderedPageBreak/>
         <w:t>Question 1</w:t>
       </w:r>
       <w:bookmarkEnd w:id="0"/>
       <w:r>
+        <w:rPr>
+          <w:rFonts w:asciiTheme="minorHAnsi" w:hAnsiTheme="minorHAnsi"/>
+        </w:rPr>
         <w:t xml:space="preserve"> - Report</w:t>
       </w:r>
     </w:p>
@@ -1092,6 +1205,7 @@
       <w:pPr>
         <w:jc w:val="center"/>
         <w:rPr>
+          <w:rFonts w:asciiTheme="minorHAnsi" w:hAnsiTheme="minorHAnsi"/>
           <w:b/>
           <w:bCs/>
           <w:sz w:val="24"/>
@@ -1100,6 +1214,7 @@
       </w:pPr>
       <w:r>
         <w:rPr>
+          <w:rFonts w:asciiTheme="minorHAnsi" w:hAnsiTheme="minorHAnsi"/>
           <w:b/>
           <w:bCs/>
           <w:sz w:val="24"/>
@@ -1111,6 +1226,7 @@
     <w:p>
       <w:pPr>
         <w:rPr>
+          <w:rFonts w:asciiTheme="minorHAnsi" w:hAnsiTheme="minorHAnsi"/>
           <w:b/>
           <w:bCs/>
         </w:rPr>
@@ -1119,12 +1235,14 @@
     <w:p>
       <w:pPr>
         <w:rPr>
+          <w:rFonts w:asciiTheme="minorHAnsi" w:hAnsiTheme="minorHAnsi"/>
           <w:b/>
           <w:bCs/>
         </w:rPr>
       </w:pPr>
       <w:r>
         <w:rPr>
+          <w:rFonts w:asciiTheme="minorHAnsi" w:hAnsiTheme="minorHAnsi"/>
           <w:b/>
           <w:bCs/>
         </w:rPr>
@@ -1132,20 +1250,36 @@
       </w:r>
     </w:p>
     <w:p>
-      <w:r>
+      <w:pPr>
+        <w:rPr>
+          <w:rFonts w:asciiTheme="minorHAnsi" w:hAnsiTheme="minorHAnsi"/>
+        </w:rPr>
+      </w:pPr>
+      <w:r>
+        <w:rPr>
+          <w:rFonts w:asciiTheme="minorHAnsi" w:hAnsiTheme="minorHAnsi"/>
+        </w:rPr>
         <w:t>Systems Analysis and Design (SAD) is simply a structured way of solving business problems with technology. In the Analysis part, we focus on understanding the problem. We figure out exactly what the airport needs by talking to the people who will use the system and writing down their requirements. In the Design part, we focus on the solution. We decide exactly how the new system will work, including the software, data, and screens. For the new Airport Customer Relations Management System (ACRMS), SAD gives us the plan we need to turn your ideas about flight info, airport navigation, and emergency alerts into a reliable and easy-to-use system.</w:t>
       </w:r>
     </w:p>
-    <w:p/>
-    <w:p>
-      <w:pPr>
-        <w:rPr>
+    <w:p>
+      <w:pPr>
+        <w:rPr>
+          <w:rFonts w:asciiTheme="minorHAnsi" w:hAnsiTheme="minorHAnsi"/>
+        </w:rPr>
+      </w:pPr>
+    </w:p>
+    <w:p>
+      <w:pPr>
+        <w:rPr>
+          <w:rFonts w:asciiTheme="minorHAnsi" w:hAnsiTheme="minorHAnsi"/>
           <w:b/>
           <w:bCs/>
         </w:rPr>
       </w:pPr>
       <w:r>
         <w:rPr>
+          <w:rFonts w:asciiTheme="minorHAnsi" w:hAnsiTheme="minorHAnsi"/>
           <w:b/>
           <w:bCs/>
         </w:rPr>
@@ -1153,7 +1287,15 @@
       </w:r>
     </w:p>
     <w:p>
-      <w:r>
+      <w:pPr>
+        <w:rPr>
+          <w:rFonts w:asciiTheme="minorHAnsi" w:hAnsiTheme="minorHAnsi"/>
+        </w:rPr>
+      </w:pPr>
+      <w:r>
+        <w:rPr>
+          <w:rFonts w:asciiTheme="minorHAnsi" w:hAnsiTheme="minorHAnsi"/>
+        </w:rPr>
         <w:t>Doing this properly is very important for the ACRMS because an airport is a busy, high-pressure place.</w:t>
       </w:r>
     </w:p>
@@ -1163,15 +1305,15 @@
           <w:ilvl w:val="0"/>
           <w:numId w:val="4"/>
         </w:numPr>
-      </w:pPr>
-      <w:r>
-        <w:t xml:space="preserve">It keeps everyone happy: Different people will use this system, like tourists, airport staff, and medics. SAD gives us tools to balance their different </w:t>
-      </w:r>
-      <w:r>
-        <w:t>needs,</w:t>
-      </w:r>
-      <w:r>
-        <w:t xml:space="preserve"> so the system works well for everyone.</w:t>
+        <w:rPr>
+          <w:rFonts w:asciiTheme="minorHAnsi" w:hAnsiTheme="minorHAnsi"/>
+        </w:rPr>
+      </w:pPr>
+      <w:r>
+        <w:rPr>
+          <w:rFonts w:asciiTheme="minorHAnsi" w:hAnsiTheme="minorHAnsi"/>
+        </w:rPr>
+        <w:t>It keeps everyone happy: Different people will use this system, like tourists, airport staff, and medics. SAD gives us tools to balance their different needs, so the system works well for everyone.</w:t>
       </w:r>
     </w:p>
     <w:p>
@@ -1180,8 +1322,14 @@
           <w:ilvl w:val="0"/>
           <w:numId w:val="4"/>
         </w:numPr>
-      </w:pPr>
-      <w:r>
+        <w:rPr>
+          <w:rFonts w:asciiTheme="minorHAnsi" w:hAnsiTheme="minorHAnsi"/>
+        </w:rPr>
+      </w:pPr>
+      <w:r>
+        <w:rPr>
+          <w:rFonts w:asciiTheme="minorHAnsi" w:hAnsiTheme="minorHAnsi"/>
+        </w:rPr>
         <w:t>It reduces risk: Proper planning helps us find problems early. It’s much cheaper to fix a misunderstanding on paper now than to fix a system crash after it’s been built.</w:t>
       </w:r>
     </w:p>
@@ -1191,21 +1339,35 @@
           <w:ilvl w:val="0"/>
           <w:numId w:val="4"/>
         </w:numPr>
-      </w:pPr>
-      <w:r>
+        <w:rPr>
+          <w:rFonts w:asciiTheme="minorHAnsi" w:hAnsiTheme="minorHAnsi"/>
+        </w:rPr>
+      </w:pPr>
+      <w:r>
+        <w:rPr>
+          <w:rFonts w:asciiTheme="minorHAnsi" w:hAnsiTheme="minorHAnsi"/>
+        </w:rPr>
         <w:t>It covers the important details: It makes sure we don't forget the behind-the-scenes stuff, like making sure the system is reliable during a medical emergency, the GPS is accurate, and the kiosks can handle hundreds of people at once.</w:t>
       </w:r>
     </w:p>
-    <w:p/>
-    <w:p>
-      <w:pPr>
-        <w:rPr>
+    <w:p>
+      <w:pPr>
+        <w:rPr>
+          <w:rFonts w:asciiTheme="minorHAnsi" w:hAnsiTheme="minorHAnsi"/>
+        </w:rPr>
+      </w:pPr>
+    </w:p>
+    <w:p>
+      <w:pPr>
+        <w:rPr>
+          <w:rFonts w:asciiTheme="minorHAnsi" w:hAnsiTheme="minorHAnsi"/>
           <w:b/>
           <w:bCs/>
         </w:rPr>
       </w:pPr>
       <w:r>
         <w:rPr>
+          <w:rFonts w:asciiTheme="minorHAnsi" w:hAnsiTheme="minorHAnsi"/>
           <w:b/>
           <w:bCs/>
         </w:rPr>
@@ -1213,7 +1375,15 @@
       </w:r>
     </w:p>
     <w:p>
-      <w:r>
+      <w:pPr>
+        <w:rPr>
+          <w:rFonts w:asciiTheme="minorHAnsi" w:hAnsiTheme="minorHAnsi"/>
+        </w:rPr>
+      </w:pPr>
+      <w:r>
+        <w:rPr>
+          <w:rFonts w:asciiTheme="minorHAnsi" w:hAnsiTheme="minorHAnsi"/>
+        </w:rPr>
         <w:t>This phase is all about research and planning. Here’s what we’ll do to build a strong foundation:</w:t>
       </w:r>
     </w:p>
@@ -1223,8 +1393,14 @@
           <w:ilvl w:val="0"/>
           <w:numId w:val="5"/>
         </w:numPr>
-      </w:pPr>
-      <w:r>
+        <w:rPr>
+          <w:rFonts w:asciiTheme="minorHAnsi" w:hAnsiTheme="minorHAnsi"/>
+        </w:rPr>
+      </w:pPr>
+      <w:r>
+        <w:rPr>
+          <w:rFonts w:asciiTheme="minorHAnsi" w:hAnsiTheme="minorHAnsi"/>
+        </w:rPr>
         <w:t>Talk to the right people: We’ll identify the key users (passengers, medical teams, airport management) and use interviews and surveys to understand exactly what they need from the flight info, navigation, and emergency features.</w:t>
       </w:r>
     </w:p>
@@ -1234,8 +1410,14 @@
           <w:ilvl w:val="0"/>
           <w:numId w:val="5"/>
         </w:numPr>
-      </w:pPr>
-      <w:r>
+        <w:rPr>
+          <w:rFonts w:asciiTheme="minorHAnsi" w:hAnsiTheme="minorHAnsi"/>
+        </w:rPr>
+      </w:pPr>
+      <w:r>
+        <w:rPr>
+          <w:rFonts w:asciiTheme="minorHAnsi" w:hAnsiTheme="minorHAnsi"/>
+        </w:rPr>
         <w:t>Map out the scenarios: We’ll use a technique called "event decomposition" to list every single thing the system needs to do. For example, what should happen when a "passenger asks for medical help" or when a "flight is delayed"? We’ll map out the system's response for each event.</w:t>
       </w:r>
     </w:p>
@@ -1245,8 +1427,14 @@
           <w:ilvl w:val="0"/>
           <w:numId w:val="5"/>
         </w:numPr>
-      </w:pPr>
-      <w:r>
+        <w:rPr>
+          <w:rFonts w:asciiTheme="minorHAnsi" w:hAnsiTheme="minorHAnsi"/>
+        </w:rPr>
+      </w:pPr>
+      <w:r>
+        <w:rPr>
+          <w:rFonts w:asciiTheme="minorHAnsi" w:hAnsiTheme="minorHAnsi"/>
+        </w:rPr>
         <w:lastRenderedPageBreak/>
         <w:t>Create a data map: We’ll build a simple diagram showing the key pieces of information the system needs to manage, like Passenger, Flight, and MedicalEmergency, and how they are all connected.</w:t>
       </w:r>
@@ -1257,21 +1445,35 @@
           <w:ilvl w:val="0"/>
           <w:numId w:val="5"/>
         </w:numPr>
-      </w:pPr>
-      <w:r>
+        <w:rPr>
+          <w:rFonts w:asciiTheme="minorHAnsi" w:hAnsiTheme="minorHAnsi"/>
+        </w:rPr>
+      </w:pPr>
+      <w:r>
+        <w:rPr>
+          <w:rFonts w:asciiTheme="minorHAnsi" w:hAnsiTheme="minorHAnsi"/>
+        </w:rPr>
         <w:t>Write clear instructions: For every action the system must perform, we’ll write a clear description. This covers the basic steps, what to do if something goes wrong, and what needs to happen before and after.</w:t>
       </w:r>
     </w:p>
-    <w:p/>
-    <w:p>
-      <w:pPr>
-        <w:rPr>
+    <w:p>
+      <w:pPr>
+        <w:rPr>
+          <w:rFonts w:asciiTheme="minorHAnsi" w:hAnsiTheme="minorHAnsi"/>
+        </w:rPr>
+      </w:pPr>
+    </w:p>
+    <w:p>
+      <w:pPr>
+        <w:rPr>
+          <w:rFonts w:asciiTheme="minorHAnsi" w:hAnsiTheme="minorHAnsi"/>
           <w:b/>
           <w:bCs/>
         </w:rPr>
       </w:pPr>
       <w:r>
         <w:rPr>
+          <w:rFonts w:asciiTheme="minorHAnsi" w:hAnsiTheme="minorHAnsi"/>
           <w:b/>
           <w:bCs/>
         </w:rPr>
@@ -1279,7 +1481,15 @@
       </w:r>
     </w:p>
     <w:p>
-      <w:r>
+      <w:pPr>
+        <w:rPr>
+          <w:rFonts w:asciiTheme="minorHAnsi" w:hAnsiTheme="minorHAnsi"/>
+        </w:rPr>
+      </w:pPr>
+      <w:r>
+        <w:rPr>
+          <w:rFonts w:asciiTheme="minorHAnsi" w:hAnsiTheme="minorHAnsi"/>
+        </w:rPr>
         <w:t>Now we take the research from the analysis phase and start building the blueprint for the actual software.</w:t>
       </w:r>
     </w:p>
@@ -1289,8 +1499,14 @@
           <w:ilvl w:val="0"/>
           <w:numId w:val="6"/>
         </w:numPr>
-      </w:pPr>
-      <w:r>
+        <w:rPr>
+          <w:rFonts w:asciiTheme="minorHAnsi" w:hAnsiTheme="minorHAnsi"/>
+        </w:rPr>
+      </w:pPr>
+      <w:r>
+        <w:rPr>
+          <w:rFonts w:asciiTheme="minorHAnsi" w:hAnsiTheme="minorHAnsi"/>
+        </w:rPr>
         <w:t>Break it down into parts: To keep things organized, we’ll split the system into smaller, logical modules. This will likely include a Navigation part, an Emergency Services connector, a Flight Info updater, and a User Management section.</w:t>
       </w:r>
     </w:p>
@@ -1300,8 +1516,14 @@
           <w:ilvl w:val="0"/>
           <w:numId w:val="6"/>
         </w:numPr>
-      </w:pPr>
-      <w:r>
+        <w:rPr>
+          <w:rFonts w:asciiTheme="minorHAnsi" w:hAnsiTheme="minorHAnsi"/>
+        </w:rPr>
+      </w:pPr>
+      <w:r>
+        <w:rPr>
+          <w:rFonts w:asciiTheme="minorHAnsi" w:hAnsiTheme="minorHAnsi"/>
+        </w:rPr>
         <w:t>Design the screens: We’ll create simple mock-ups of what the airport kiosks and the mobile app will look like. We’ll focus on making it easy to use, ensuring that critical features like the "call for medical help" button is big, obvious, and easy to find.</w:t>
       </w:r>
     </w:p>
@@ -1311,8 +1533,14 @@
           <w:ilvl w:val="0"/>
           <w:numId w:val="6"/>
         </w:numPr>
-      </w:pPr>
-      <w:r>
+        <w:rPr>
+          <w:rFonts w:asciiTheme="minorHAnsi" w:hAnsiTheme="minorHAnsi"/>
+        </w:rPr>
+      </w:pPr>
+      <w:r>
+        <w:rPr>
+          <w:rFonts w:asciiTheme="minorHAnsi" w:hAnsiTheme="minorHAnsi"/>
+        </w:rPr>
         <w:t>Design the database: We’ll design the behind-the-scenes structure for storing all the information. This means figuring out the best way to save and quickly find things like flight updates, locations of shops and gates, and details of an active emergency.</w:t>
       </w:r>
     </w:p>
@@ -1322,21 +1550,35 @@
           <w:ilvl w:val="0"/>
           <w:numId w:val="6"/>
         </w:numPr>
-      </w:pPr>
-      <w:r>
+        <w:rPr>
+          <w:rFonts w:asciiTheme="minorHAnsi" w:hAnsiTheme="minorHAnsi"/>
+        </w:rPr>
+      </w:pPr>
+      <w:r>
+        <w:rPr>
+          <w:rFonts w:asciiTheme="minorHAnsi" w:hAnsiTheme="minorHAnsi"/>
+        </w:rPr>
         <w:t>Plan how parts talk to each other: We’ll map out how the different parts of the system (like the app and the navigation engine) will communicate. We'll also plan how the whole system will connect to the airport’s existing flight data and emergency dispatch networks.</w:t>
       </w:r>
     </w:p>
-    <w:p/>
-    <w:p>
-      <w:pPr>
-        <w:rPr>
+    <w:p>
+      <w:pPr>
+        <w:rPr>
+          <w:rFonts w:asciiTheme="minorHAnsi" w:hAnsiTheme="minorHAnsi"/>
+        </w:rPr>
+      </w:pPr>
+    </w:p>
+    <w:p>
+      <w:pPr>
+        <w:rPr>
+          <w:rFonts w:asciiTheme="minorHAnsi" w:hAnsiTheme="minorHAnsi"/>
           <w:b/>
           <w:bCs/>
         </w:rPr>
       </w:pPr>
       <w:r>
         <w:rPr>
+          <w:rFonts w:asciiTheme="minorHAnsi" w:hAnsiTheme="minorHAnsi"/>
           <w:b/>
           <w:bCs/>
         </w:rPr>
@@ -1344,7 +1586,15 @@
       </w:r>
     </w:p>
     <w:p>
-      <w:r>
+      <w:pPr>
+        <w:rPr>
+          <w:rFonts w:asciiTheme="minorHAnsi" w:hAnsiTheme="minorHAnsi"/>
+        </w:rPr>
+      </w:pPr>
+      <w:r>
+        <w:rPr>
+          <w:rFonts w:asciiTheme="minorHAnsi" w:hAnsiTheme="minorHAnsi"/>
+        </w:rPr>
         <w:t>Instead of building everything in one long sequence, we suggest an iterative approach, which means building the system in repeated cycles. This is the best way to go for the ACRMS for a few reasons:</w:t>
       </w:r>
     </w:p>
@@ -1354,8 +1604,14 @@
           <w:ilvl w:val="0"/>
           <w:numId w:val="7"/>
         </w:numPr>
-      </w:pPr>
-      <w:r>
+        <w:rPr>
+          <w:rFonts w:asciiTheme="minorHAnsi" w:hAnsiTheme="minorHAnsi"/>
+        </w:rPr>
+      </w:pPr>
+      <w:r>
+        <w:rPr>
+          <w:rFonts w:asciiTheme="minorHAnsi" w:hAnsiTheme="minorHAnsi"/>
+        </w:rPr>
         <w:t>Test the tricky parts first: The most complex feature is linking to medical services. By building a simple working version of this early on, we can test it thoroughly to make sure it's reliable before we build the rest of the system.</w:t>
       </w:r>
     </w:p>
@@ -1365,8 +1621,14 @@
           <w:ilvl w:val="0"/>
           <w:numId w:val="7"/>
         </w:numPr>
-      </w:pPr>
-      <w:r>
+        <w:rPr>
+          <w:rFonts w:asciiTheme="minorHAnsi" w:hAnsiTheme="minorHAnsi"/>
+        </w:rPr>
+      </w:pPr>
+      <w:r>
+        <w:rPr>
+          <w:rFonts w:asciiTheme="minorHAnsi" w:hAnsiTheme="minorHAnsi"/>
+        </w:rPr>
         <w:t>Adapt to changes easily: Feedback might show that tourists find the GPS directions confusing. With an iterative approach, we can improve the design in the next cycle without throwing the whole project off track.</w:t>
       </w:r>
     </w:p>
@@ -1376,37 +1638,58 @@
           <w:ilvl w:val="0"/>
           <w:numId w:val="7"/>
         </w:numPr>
-      </w:pPr>
-      <w:r>
+        <w:rPr>
+          <w:rFonts w:asciiTheme="minorHAnsi" w:hAnsiTheme="minorHAnsi"/>
+        </w:rPr>
+      </w:pPr>
+      <w:r>
+        <w:rPr>
+          <w:rFonts w:asciiTheme="minorHAnsi" w:hAnsiTheme="minorHAnsi"/>
+        </w:rPr>
         <w:t>Get feedback as we go: This method lets users see and try parts of the system early. Their feedback helps us make sure the final product truly meets their needs, which leads to a better result and fewer expensive fixes after launch.</w:t>
       </w:r>
     </w:p>
-    <w:p/>
-    <w:p>
-      <w:pPr>
-        <w:rPr>
+    <w:p>
+      <w:pPr>
+        <w:rPr>
+          <w:rFonts w:asciiTheme="minorHAnsi" w:hAnsiTheme="minorHAnsi"/>
+        </w:rPr>
+      </w:pPr>
+    </w:p>
+    <w:p>
+      <w:pPr>
+        <w:rPr>
+          <w:rFonts w:asciiTheme="minorHAnsi" w:hAnsiTheme="minorHAnsi"/>
           <w:b/>
           <w:bCs/>
         </w:rPr>
       </w:pPr>
       <w:r>
         <w:rPr>
+          <w:rFonts w:asciiTheme="minorHAnsi" w:hAnsiTheme="minorHAnsi"/>
           <w:b/>
           <w:bCs/>
         </w:rPr>
-        <w:lastRenderedPageBreak/>
         <w:t>6. Conclusion</w:t>
       </w:r>
     </w:p>
     <w:p>
-      <w:r>
+      <w:pPr>
+        <w:rPr>
+          <w:rFonts w:asciiTheme="minorHAnsi" w:hAnsiTheme="minorHAnsi"/>
+        </w:rPr>
+      </w:pPr>
+      <w:r>
+        <w:rPr>
+          <w:rFonts w:asciiTheme="minorHAnsi" w:hAnsiTheme="minorHAnsi"/>
+        </w:rPr>
         <w:t>In short, building the ACRMS is about more than just writing code. It’s a journey from understanding your needs (Analysis) to planning the solution (Design). The steps we've outlined—defining requirements, designing the architecture, and prototyping the screens—aren't just paperwork. They are the essential steps that make sure the final system is reliable, can grow with your needs, and is simple for passengers to use. Our commitment to building in cycles means we can handle the challenge of combining flight data, GPS, and emergency alerts, all while staying flexible to your feedback. We have the skills to put this plan into action, and we are confident we can deliver a system that will improve the passenger experience and be a valuable asset for the airport.</w:t>
       </w:r>
     </w:p>
     <w:p>
       <w:pPr>
         <w:rPr>
-          <w:rFonts w:eastAsiaTheme="majorEastAsia" w:cstheme="majorBidi"/>
+          <w:rFonts w:asciiTheme="minorHAnsi" w:eastAsiaTheme="majorEastAsia" w:hAnsiTheme="minorHAnsi" w:cstheme="majorBidi"/>
           <w:color w:val="000000" w:themeColor="text1"/>
           <w:sz w:val="28"/>
           <w:szCs w:val="40"/>
@@ -1414,15 +1697,24 @@
         </w:rPr>
       </w:pPr>
       <w:r>
+        <w:rPr>
+          <w:rFonts w:asciiTheme="minorHAnsi" w:hAnsiTheme="minorHAnsi"/>
+        </w:rPr>
         <w:br w:type="page"/>
       </w:r>
     </w:p>
     <w:p>
       <w:pPr>
         <w:pStyle w:val="Heading1"/>
+        <w:rPr>
+          <w:rFonts w:asciiTheme="minorHAnsi" w:hAnsiTheme="minorHAnsi"/>
+        </w:rPr>
       </w:pPr>
       <w:bookmarkStart w:id="1" w:name="_Toc224114454"/>
       <w:r>
+        <w:rPr>
+          <w:rFonts w:asciiTheme="minorHAnsi" w:hAnsiTheme="minorHAnsi"/>
+        </w:rPr>
         <w:lastRenderedPageBreak/>
         <w:t>Question 2</w:t>
       </w:r>
@@ -1431,7 +1723,252 @@
     <w:p>
       <w:pPr>
         <w:rPr>
-          <w:rFonts w:eastAsiaTheme="majorEastAsia" w:cstheme="majorBidi"/>
+          <w:rFonts w:asciiTheme="minorHAnsi" w:hAnsiTheme="minorHAnsi"/>
+          <w:b/>
+          <w:bCs/>
+        </w:rPr>
+      </w:pPr>
+      <w:r>
+        <w:rPr>
+          <w:rFonts w:asciiTheme="minorHAnsi" w:hAnsiTheme="minorHAnsi"/>
+          <w:b/>
+          <w:bCs/>
+        </w:rPr>
+        <w:t>2.1)</w:t>
+      </w:r>
+    </w:p>
+    <w:p>
+      <w:pPr>
+        <w:rPr>
+          <w:rFonts w:asciiTheme="minorHAnsi" w:hAnsiTheme="minorHAnsi"/>
+        </w:rPr>
+      </w:pPr>
+      <w:r>
+        <w:rPr>
+          <w:rFonts w:asciiTheme="minorHAnsi" w:hAnsiTheme="minorHAnsi"/>
+          <w:b/>
+          <w:bCs/>
+        </w:rPr>
+        <w:t>1. Airport Management / Airport Authority</w:t>
+      </w:r>
+    </w:p>
+    <w:p>
+      <w:pPr>
+        <w:numPr>
+          <w:ilvl w:val="0"/>
+          <w:numId w:val="8"/>
+        </w:numPr>
+        <w:rPr>
+          <w:rFonts w:asciiTheme="minorHAnsi" w:hAnsiTheme="minorHAnsi"/>
+        </w:rPr>
+      </w:pPr>
+      <w:r>
+        <w:rPr>
+          <w:rFonts w:asciiTheme="minorHAnsi" w:hAnsiTheme="minorHAnsi"/>
+          <w:b/>
+          <w:bCs/>
+        </w:rPr>
+        <w:t>Contribution to Requirements Gathering:</w:t>
+      </w:r>
+      <w:r>
+        <w:rPr>
+          <w:rFonts w:asciiTheme="minorHAnsi" w:hAnsiTheme="minorHAnsi"/>
+        </w:rPr>
+        <w:t> They provide the strategic vision and high-level business objectives for the system. They will clarify the airport's goals for customer satisfaction, define budget constraints, and outline the expected return on investment. Their input ensures the system aligns with the airport's overall direction (Satzinger et al., 2015; StudyX, 2024a).</w:t>
+      </w:r>
+    </w:p>
+    <w:p>
+      <w:pPr>
+        <w:rPr>
+          <w:rFonts w:asciiTheme="minorHAnsi" w:hAnsiTheme="minorHAnsi"/>
+        </w:rPr>
+      </w:pPr>
+    </w:p>
+    <w:p>
+      <w:pPr>
+        <w:rPr>
+          <w:rFonts w:asciiTheme="minorHAnsi" w:hAnsiTheme="minorHAnsi"/>
+        </w:rPr>
+      </w:pPr>
+      <w:r>
+        <w:rPr>
+          <w:rFonts w:asciiTheme="minorHAnsi" w:hAnsiTheme="minorHAnsi"/>
+          <w:b/>
+          <w:bCs/>
+        </w:rPr>
+        <w:t>2. Airline Representatives</w:t>
+      </w:r>
+    </w:p>
+    <w:p>
+      <w:pPr>
+        <w:numPr>
+          <w:ilvl w:val="0"/>
+          <w:numId w:val="9"/>
+        </w:numPr>
+        <w:rPr>
+          <w:rFonts w:asciiTheme="minorHAnsi" w:hAnsiTheme="minorHAnsi"/>
+        </w:rPr>
+      </w:pPr>
+      <w:r>
+        <w:rPr>
+          <w:rFonts w:asciiTheme="minorHAnsi" w:hAnsiTheme="minorHAnsi"/>
+          <w:b/>
+          <w:bCs/>
+        </w:rPr>
+        <w:t>Contribution to Requirements Gathering:</w:t>
+      </w:r>
+      <w:r>
+        <w:rPr>
+          <w:rFonts w:asciiTheme="minorHAnsi" w:hAnsiTheme="minorHAnsi"/>
+        </w:rPr>
+        <w:t> Airlines are key partners who will share data regarding flight schedules, delays, and passenger connections. They can specify requirements for how flight information should be displayed and how the system should handle disruptions, ensuring smooth communication between the airport and its airline tenants (Questions LLC, 2024; StudyX, 2024b).</w:t>
+      </w:r>
+    </w:p>
+    <w:p>
+      <w:pPr>
+        <w:rPr>
+          <w:rFonts w:asciiTheme="minorHAnsi" w:hAnsiTheme="minorHAnsi"/>
+        </w:rPr>
+      </w:pPr>
+    </w:p>
+    <w:p>
+      <w:pPr>
+        <w:rPr>
+          <w:rFonts w:asciiTheme="minorHAnsi" w:hAnsiTheme="minorHAnsi"/>
+        </w:rPr>
+      </w:pPr>
+      <w:r>
+        <w:rPr>
+          <w:rFonts w:asciiTheme="minorHAnsi" w:hAnsiTheme="minorHAnsi"/>
+          <w:b/>
+          <w:bCs/>
+        </w:rPr>
+        <w:t>3. Passengers (End-Users)</w:t>
+      </w:r>
+    </w:p>
+    <w:p>
+      <w:pPr>
+        <w:numPr>
+          <w:ilvl w:val="0"/>
+          <w:numId w:val="10"/>
+        </w:numPr>
+        <w:rPr>
+          <w:rFonts w:asciiTheme="minorHAnsi" w:hAnsiTheme="minorHAnsi"/>
+        </w:rPr>
+      </w:pPr>
+      <w:r>
+        <w:rPr>
+          <w:rFonts w:asciiTheme="minorHAnsi" w:hAnsiTheme="minorHAnsi"/>
+          <w:b/>
+          <w:bCs/>
+        </w:rPr>
+        <w:t>Contribution to Requirements Gathering:</w:t>
+      </w:r>
+      <w:r>
+        <w:rPr>
+          <w:rFonts w:asciiTheme="minorHAnsi" w:hAnsiTheme="minorHAnsi"/>
+        </w:rPr>
+        <w:t> As the primary users of the system, passengers provide essential feedback on usability, desired features, and pain points. Through surveys, interviews, and usability testing, they help define requirements for intuitive navigation, clear flight information displays, and easy access to emergency services (Hoffer et al., 2016; StudyX, 2024b).</w:t>
+      </w:r>
+    </w:p>
+    <w:p>
+      <w:pPr>
+        <w:rPr>
+          <w:rFonts w:asciiTheme="minorHAnsi" w:hAnsiTheme="minorHAnsi"/>
+        </w:rPr>
+      </w:pPr>
+    </w:p>
+    <w:p>
+      <w:pPr>
+        <w:rPr>
+          <w:rFonts w:asciiTheme="minorHAnsi" w:hAnsiTheme="minorHAnsi"/>
+        </w:rPr>
+      </w:pPr>
+      <w:r>
+        <w:rPr>
+          <w:rFonts w:asciiTheme="minorHAnsi" w:hAnsiTheme="minorHAnsi"/>
+          <w:b/>
+          <w:bCs/>
+        </w:rPr>
+        <w:t>4. Ground Staff and Customer Service Agents</w:t>
+      </w:r>
+    </w:p>
+    <w:p>
+      <w:pPr>
+        <w:numPr>
+          <w:ilvl w:val="0"/>
+          <w:numId w:val="11"/>
+        </w:numPr>
+        <w:rPr>
+          <w:rFonts w:asciiTheme="minorHAnsi" w:hAnsiTheme="minorHAnsi"/>
+        </w:rPr>
+      </w:pPr>
+      <w:r>
+        <w:rPr>
+          <w:rFonts w:asciiTheme="minorHAnsi" w:hAnsiTheme="minorHAnsi"/>
+          <w:b/>
+          <w:bCs/>
+        </w:rPr>
+        <w:t>Contribution to Requirements Gathering:</w:t>
+      </w:r>
+      <w:r>
+        <w:rPr>
+          <w:rFonts w:asciiTheme="minorHAnsi" w:hAnsiTheme="minorHAnsi"/>
+        </w:rPr>
+        <w:t> These frontline employees interact with passengers daily and understand operational realities. They can identify practical needs such as how quickly emergency alerts must be received, what information is most helpful for assisting lost passengers, and how the system should integrate with their existing workflows (Sommerville, 2015; StudyX, 2024a).</w:t>
+      </w:r>
+    </w:p>
+    <w:p>
+      <w:pPr>
+        <w:rPr>
+          <w:rFonts w:asciiTheme="minorHAnsi" w:hAnsiTheme="minorHAnsi"/>
+        </w:rPr>
+      </w:pPr>
+    </w:p>
+    <w:p>
+      <w:pPr>
+        <w:rPr>
+          <w:rFonts w:asciiTheme="minorHAnsi" w:hAnsiTheme="minorHAnsi"/>
+        </w:rPr>
+      </w:pPr>
+      <w:r>
+        <w:rPr>
+          <w:rFonts w:asciiTheme="minorHAnsi" w:hAnsiTheme="minorHAnsi"/>
+          <w:b/>
+          <w:bCs/>
+        </w:rPr>
+        <w:t>5. Medical and Emergency Services Personnel</w:t>
+      </w:r>
+    </w:p>
+    <w:p>
+      <w:pPr>
+        <w:numPr>
+          <w:ilvl w:val="0"/>
+          <w:numId w:val="12"/>
+        </w:numPr>
+        <w:rPr>
+          <w:rFonts w:asciiTheme="minorHAnsi" w:hAnsiTheme="minorHAnsi"/>
+        </w:rPr>
+      </w:pPr>
+      <w:r>
+        <w:rPr>
+          <w:rFonts w:asciiTheme="minorHAnsi" w:hAnsiTheme="minorHAnsi"/>
+          <w:b/>
+          <w:bCs/>
+        </w:rPr>
+        <w:t>Contribution to Requirements Gathering:</w:t>
+      </w:r>
+      <w:r>
+        <w:rPr>
+          <w:rFonts w:asciiTheme="minorHAnsi" w:hAnsiTheme="minorHAnsi"/>
+        </w:rPr>
+        <w:t> As the system must provide "instant connection to medical and ambulatory services," these stakeholders are critical. They will specify requirements for alert accuracy, location precision, response time expectations, and what information they need immediately when responding to an emergency (e.g., passenger location, nature of the emergency) (StudyX, 2024c).</w:t>
+      </w:r>
+    </w:p>
+    <w:p>
+      <w:pPr>
+        <w:rPr>
+          <w:rFonts w:asciiTheme="minorHAnsi" w:eastAsiaTheme="majorEastAsia" w:hAnsiTheme="minorHAnsi" w:cstheme="majorBidi"/>
           <w:color w:val="000000" w:themeColor="text1"/>
           <w:sz w:val="28"/>
           <w:szCs w:val="40"/>
@@ -1439,15 +1976,25 @@
         </w:rPr>
       </w:pPr>
       <w:r>
+        <w:rPr>
+          <w:rFonts w:asciiTheme="minorHAnsi" w:hAnsiTheme="minorHAnsi"/>
+        </w:rPr>
+        <w:lastRenderedPageBreak/>
         <w:br w:type="page"/>
       </w:r>
     </w:p>
     <w:p>
       <w:pPr>
         <w:pStyle w:val="Heading1"/>
+        <w:rPr>
+          <w:rFonts w:asciiTheme="minorHAnsi" w:hAnsiTheme="minorHAnsi"/>
+        </w:rPr>
       </w:pPr>
       <w:bookmarkStart w:id="2" w:name="_Toc224114455"/>
       <w:r>
+        <w:rPr>
+          <w:rFonts w:asciiTheme="minorHAnsi" w:hAnsiTheme="minorHAnsi"/>
+        </w:rPr>
         <w:lastRenderedPageBreak/>
         <w:t>Question 3</w:t>
       </w:r>
@@ -1456,7 +2003,131 @@
     <w:p>
       <w:pPr>
         <w:rPr>
-          <w:rFonts w:eastAsiaTheme="majorEastAsia" w:cstheme="majorBidi"/>
+          <w:rFonts w:asciiTheme="minorHAnsi" w:hAnsiTheme="minorHAnsi"/>
+          <w:b/>
+          <w:bCs/>
+        </w:rPr>
+      </w:pPr>
+      <w:r>
+        <w:rPr>
+          <w:rFonts w:asciiTheme="minorHAnsi" w:hAnsiTheme="minorHAnsi"/>
+          <w:b/>
+          <w:bCs/>
+        </w:rPr>
+        <w:t xml:space="preserve">3.1) </w:t>
+      </w:r>
+    </w:p>
+    <w:p>
+      <w:pPr>
+        <w:rPr>
+          <w:rFonts w:asciiTheme="minorHAnsi" w:hAnsiTheme="minorHAnsi"/>
+        </w:rPr>
+      </w:pPr>
+      <w:r>
+        <w:rPr>
+          <w:rFonts w:asciiTheme="minorHAnsi" w:hAnsiTheme="minorHAnsi"/>
+        </w:rPr>
+        <w:t>Event 1: Passenger requests medical assistance</w:t>
+      </w:r>
+    </w:p>
+    <w:p>
+      <w:pPr>
+        <w:numPr>
+          <w:ilvl w:val="0"/>
+          <w:numId w:val="13"/>
+        </w:numPr>
+        <w:rPr>
+          <w:rFonts w:asciiTheme="minorHAnsi" w:hAnsiTheme="minorHAnsi"/>
+        </w:rPr>
+      </w:pPr>
+      <w:r>
+        <w:rPr>
+          <w:rFonts w:asciiTheme="minorHAnsi" w:hAnsiTheme="minorHAnsi"/>
+        </w:rPr>
+        <w:t>Resulting Use Case: Connect to Emergency Services</w:t>
+      </w:r>
+    </w:p>
+    <w:p>
+      <w:pPr>
+        <w:rPr>
+          <w:rFonts w:asciiTheme="minorHAnsi" w:hAnsiTheme="minorHAnsi"/>
+        </w:rPr>
+      </w:pPr>
+      <w:r>
+        <w:rPr>
+          <w:rFonts w:asciiTheme="minorHAnsi" w:hAnsiTheme="minorHAnsi"/>
+        </w:rPr>
+        <w:t>Event 2: Flight status changes (delay, cancellation, gate change)</w:t>
+      </w:r>
+    </w:p>
+    <w:p>
+      <w:pPr>
+        <w:numPr>
+          <w:ilvl w:val="0"/>
+          <w:numId w:val="14"/>
+        </w:numPr>
+        <w:rPr>
+          <w:rFonts w:asciiTheme="minorHAnsi" w:hAnsiTheme="minorHAnsi"/>
+        </w:rPr>
+      </w:pPr>
+      <w:r>
+        <w:rPr>
+          <w:rFonts w:asciiTheme="minorHAnsi" w:hAnsiTheme="minorHAnsi"/>
+        </w:rPr>
+        <w:t>Resulting Use Case: Update Flight Information</w:t>
+      </w:r>
+    </w:p>
+    <w:p>
+      <w:pPr>
+        <w:rPr>
+          <w:rFonts w:asciiTheme="minorHAnsi" w:hAnsiTheme="minorHAnsi"/>
+        </w:rPr>
+      </w:pPr>
+      <w:r>
+        <w:rPr>
+          <w:rFonts w:asciiTheme="minorHAnsi" w:hAnsiTheme="minorHAnsi"/>
+        </w:rPr>
+        <w:t>Event 3: Passenger requests navigation directions to a specific amenity or gate</w:t>
+      </w:r>
+    </w:p>
+    <w:p>
+      <w:pPr>
+        <w:numPr>
+          <w:ilvl w:val="0"/>
+          <w:numId w:val="15"/>
+        </w:numPr>
+        <w:rPr>
+          <w:rFonts w:asciiTheme="minorHAnsi" w:hAnsiTheme="minorHAnsi"/>
+        </w:rPr>
+      </w:pPr>
+      <w:r>
+        <w:rPr>
+          <w:rFonts w:asciiTheme="minorHAnsi" w:hAnsiTheme="minorHAnsi"/>
+        </w:rPr>
+        <w:t>Resulting Use Case: Provide GPS Navigation Guidance</w:t>
+      </w:r>
+    </w:p>
+    <w:p>
+      <w:pPr>
+        <w:rPr>
+          <w:rFonts w:asciiTheme="minorHAnsi" w:hAnsiTheme="minorHAnsi"/>
+        </w:rPr>
+      </w:pPr>
+      <w:r>
+        <w:rPr>
+          <w:rFonts w:asciiTheme="minorHAnsi" w:hAnsiTheme="minorHAnsi"/>
+        </w:rPr>
+        <w:t>Event 4: Passenger submits feedback or a complaint</w:t>
+      </w:r>
+    </w:p>
+    <w:p>
+      <w:pPr>
+        <w:numPr>
+          <w:ilvl w:val="0"/>
+          <w:numId w:val="16"/>
+        </w:numPr>
+        <w:rPr>
+          <w:rFonts w:asciiTheme="minorHAnsi" w:eastAsiaTheme="majorEastAsia" w:hAnsiTheme="minorHAnsi" w:cstheme="majorBidi"/>
           <w:color w:val="000000" w:themeColor="text1"/>
           <w:sz w:val="28"/>
           <w:szCs w:val="40"/>
@@ -1464,15 +2135,816 @@
         </w:rPr>
       </w:pPr>
       <w:r>
+        <w:rPr>
+          <w:rFonts w:asciiTheme="minorHAnsi" w:hAnsiTheme="minorHAnsi"/>
+        </w:rPr>
+        <w:t>Resulting Use Case: Log Customer Feedback</w:t>
+      </w:r>
+    </w:p>
+    <w:p>
+      <w:pPr>
+        <w:rPr>
+          <w:rFonts w:asciiTheme="minorHAnsi" w:hAnsiTheme="minorHAnsi"/>
+        </w:rPr>
+      </w:pPr>
+      <w:r>
+        <w:rPr>
+          <w:rFonts w:asciiTheme="minorHAnsi" w:hAnsiTheme="minorHAnsi"/>
+        </w:rPr>
         <w:br w:type="page"/>
       </w:r>
     </w:p>
     <w:p>
       <w:pPr>
+        <w:rPr>
+          <w:rFonts w:asciiTheme="minorHAnsi" w:hAnsiTheme="minorHAnsi"/>
+        </w:rPr>
+        <w:sectPr>
+          <w:pgSz w:w="11906" w:h="16838"/>
+          <w:pgMar w:top="1440" w:right="1440" w:bottom="1440" w:left="1440" w:header="708" w:footer="708" w:gutter="0"/>
+          <w:pgNumType w:start="0"/>
+          <w:cols w:space="708"/>
+          <w:titlePg/>
+          <w:docGrid w:linePitch="360"/>
+        </w:sectPr>
+      </w:pPr>
+    </w:p>
+    <w:tbl>
+      <w:tblPr>
+        <w:tblStyle w:val="TableGrid"/>
+        <w:tblW w:w="14454" w:type="dxa"/>
+        <w:tblLook w:val="04A0" w:firstRow="1" w:lastRow="0" w:firstColumn="1" w:lastColumn="0" w:noHBand="0" w:noVBand="1"/>
+      </w:tblPr>
+      <w:tblGrid>
+        <w:gridCol w:w="2364"/>
+        <w:gridCol w:w="12090"/>
+      </w:tblGrid>
+      <w:tr>
+        <w:tc>
+          <w:tcPr>
+            <w:tcW w:w="0" w:type="auto"/>
+            <w:hideMark/>
+          </w:tcPr>
+          <w:p>
+            <w:pPr>
+              <w:spacing w:after="160" w:line="278" w:lineRule="auto"/>
+              <w:rPr>
+                <w:rFonts w:asciiTheme="minorHAnsi" w:hAnsiTheme="minorHAnsi"/>
+              </w:rPr>
+            </w:pPr>
+            <w:r>
+              <w:rPr>
+                <w:rFonts w:asciiTheme="minorHAnsi" w:hAnsiTheme="minorHAnsi"/>
+                <w:b/>
+                <w:bCs/>
+              </w:rPr>
+              <w:lastRenderedPageBreak/>
+              <w:t>Element</w:t>
+            </w:r>
+          </w:p>
+        </w:tc>
+        <w:tc>
+          <w:tcPr>
+            <w:tcW w:w="12090" w:type="dxa"/>
+            <w:hideMark/>
+          </w:tcPr>
+          <w:p>
+            <w:pPr>
+              <w:spacing w:after="160" w:line="278" w:lineRule="auto"/>
+              <w:rPr>
+                <w:rFonts w:asciiTheme="minorHAnsi" w:hAnsiTheme="minorHAnsi"/>
+              </w:rPr>
+            </w:pPr>
+            <w:r>
+              <w:rPr>
+                <w:rFonts w:asciiTheme="minorHAnsi" w:hAnsiTheme="minorHAnsi"/>
+                <w:b/>
+                <w:bCs/>
+              </w:rPr>
+              <w:t>Description</w:t>
+            </w:r>
+          </w:p>
+        </w:tc>
+      </w:tr>
+      <w:tr>
+        <w:tc>
+          <w:tcPr>
+            <w:tcW w:w="0" w:type="auto"/>
+            <w:hideMark/>
+          </w:tcPr>
+          <w:p>
+            <w:pPr>
+              <w:spacing w:after="160" w:line="278" w:lineRule="auto"/>
+              <w:rPr>
+                <w:rFonts w:asciiTheme="minorHAnsi" w:hAnsiTheme="minorHAnsi"/>
+              </w:rPr>
+            </w:pPr>
+            <w:r>
+              <w:rPr>
+                <w:rFonts w:asciiTheme="minorHAnsi" w:hAnsiTheme="minorHAnsi"/>
+                <w:b/>
+                <w:bCs/>
+              </w:rPr>
+              <w:t>Use Case Name</w:t>
+            </w:r>
+          </w:p>
+        </w:tc>
+        <w:tc>
+          <w:tcPr>
+            <w:tcW w:w="12090" w:type="dxa"/>
+            <w:hideMark/>
+          </w:tcPr>
+          <w:p>
+            <w:pPr>
+              <w:spacing w:after="160" w:line="278" w:lineRule="auto"/>
+              <w:rPr>
+                <w:rFonts w:asciiTheme="minorHAnsi" w:hAnsiTheme="minorHAnsi"/>
+              </w:rPr>
+            </w:pPr>
+            <w:r>
+              <w:rPr>
+                <w:rFonts w:asciiTheme="minorHAnsi" w:hAnsiTheme="minorHAnsi"/>
+              </w:rPr>
+              <w:t>Connect to Emergency Services</w:t>
+            </w:r>
+          </w:p>
+        </w:tc>
+      </w:tr>
+      <w:tr>
+        <w:tc>
+          <w:tcPr>
+            <w:tcW w:w="0" w:type="auto"/>
+            <w:hideMark/>
+          </w:tcPr>
+          <w:p>
+            <w:pPr>
+              <w:spacing w:after="160" w:line="278" w:lineRule="auto"/>
+              <w:rPr>
+                <w:rFonts w:asciiTheme="minorHAnsi" w:hAnsiTheme="minorHAnsi"/>
+              </w:rPr>
+            </w:pPr>
+            <w:r>
+              <w:rPr>
+                <w:rFonts w:asciiTheme="minorHAnsi" w:hAnsiTheme="minorHAnsi"/>
+                <w:b/>
+                <w:bCs/>
+              </w:rPr>
+              <w:t>Use Case ID</w:t>
+            </w:r>
+          </w:p>
+        </w:tc>
+        <w:tc>
+          <w:tcPr>
+            <w:tcW w:w="12090" w:type="dxa"/>
+            <w:hideMark/>
+          </w:tcPr>
+          <w:p>
+            <w:pPr>
+              <w:spacing w:after="160" w:line="278" w:lineRule="auto"/>
+              <w:rPr>
+                <w:rFonts w:asciiTheme="minorHAnsi" w:hAnsiTheme="minorHAnsi"/>
+              </w:rPr>
+            </w:pPr>
+            <w:r>
+              <w:rPr>
+                <w:rFonts w:asciiTheme="minorHAnsi" w:hAnsiTheme="minorHAnsi"/>
+              </w:rPr>
+              <w:t>UC-01</w:t>
+            </w:r>
+          </w:p>
+        </w:tc>
+      </w:tr>
+      <w:tr>
+        <w:tc>
+          <w:tcPr>
+            <w:tcW w:w="0" w:type="auto"/>
+            <w:hideMark/>
+          </w:tcPr>
+          <w:p>
+            <w:pPr>
+              <w:spacing w:after="160" w:line="278" w:lineRule="auto"/>
+              <w:rPr>
+                <w:rFonts w:asciiTheme="minorHAnsi" w:hAnsiTheme="minorHAnsi"/>
+              </w:rPr>
+            </w:pPr>
+            <w:r>
+              <w:rPr>
+                <w:rFonts w:asciiTheme="minorHAnsi" w:hAnsiTheme="minorHAnsi"/>
+                <w:b/>
+                <w:bCs/>
+              </w:rPr>
+              <w:t>Priority</w:t>
+            </w:r>
+          </w:p>
+        </w:tc>
+        <w:tc>
+          <w:tcPr>
+            <w:tcW w:w="12090" w:type="dxa"/>
+            <w:hideMark/>
+          </w:tcPr>
+          <w:p>
+            <w:pPr>
+              <w:spacing w:after="160" w:line="278" w:lineRule="auto"/>
+              <w:rPr>
+                <w:rFonts w:asciiTheme="minorHAnsi" w:hAnsiTheme="minorHAnsi"/>
+              </w:rPr>
+            </w:pPr>
+            <w:r>
+              <w:rPr>
+                <w:rFonts w:asciiTheme="minorHAnsi" w:hAnsiTheme="minorHAnsi"/>
+              </w:rPr>
+              <w:t>High (Critical)</w:t>
+            </w:r>
+          </w:p>
+        </w:tc>
+      </w:tr>
+      <w:tr>
+        <w:tc>
+          <w:tcPr>
+            <w:tcW w:w="0" w:type="auto"/>
+            <w:hideMark/>
+          </w:tcPr>
+          <w:p>
+            <w:pPr>
+              <w:spacing w:after="160" w:line="278" w:lineRule="auto"/>
+              <w:rPr>
+                <w:rFonts w:asciiTheme="minorHAnsi" w:hAnsiTheme="minorHAnsi"/>
+              </w:rPr>
+            </w:pPr>
+            <w:r>
+              <w:rPr>
+                <w:rFonts w:asciiTheme="minorHAnsi" w:hAnsiTheme="minorHAnsi"/>
+                <w:b/>
+                <w:bCs/>
+              </w:rPr>
+              <w:t>Actors</w:t>
+            </w:r>
+          </w:p>
+        </w:tc>
+        <w:tc>
+          <w:tcPr>
+            <w:tcW w:w="12090" w:type="dxa"/>
+            <w:hideMark/>
+          </w:tcPr>
+          <w:p>
+            <w:pPr>
+              <w:spacing w:after="160" w:line="278" w:lineRule="auto"/>
+              <w:rPr>
+                <w:rFonts w:asciiTheme="minorHAnsi" w:hAnsiTheme="minorHAnsi"/>
+              </w:rPr>
+            </w:pPr>
+            <w:r>
+              <w:rPr>
+                <w:rFonts w:asciiTheme="minorHAnsi" w:hAnsiTheme="minorHAnsi"/>
+              </w:rPr>
+              <w:t>Passenger (Primary), Medical Dispatcher (Secondary), Ambulatory Services (Secondary)</w:t>
+            </w:r>
+          </w:p>
+        </w:tc>
+      </w:tr>
+      <w:tr>
+        <w:tc>
+          <w:tcPr>
+            <w:tcW w:w="0" w:type="auto"/>
+            <w:hideMark/>
+          </w:tcPr>
+          <w:p>
+            <w:pPr>
+              <w:spacing w:after="160" w:line="278" w:lineRule="auto"/>
+              <w:rPr>
+                <w:rFonts w:asciiTheme="minorHAnsi" w:hAnsiTheme="minorHAnsi"/>
+              </w:rPr>
+            </w:pPr>
+            <w:r>
+              <w:rPr>
+                <w:rFonts w:asciiTheme="minorHAnsi" w:hAnsiTheme="minorHAnsi"/>
+                <w:b/>
+                <w:bCs/>
+              </w:rPr>
+              <w:t>Stakeholders</w:t>
+            </w:r>
+          </w:p>
+        </w:tc>
+        <w:tc>
+          <w:tcPr>
+            <w:tcW w:w="12090" w:type="dxa"/>
+            <w:hideMark/>
+          </w:tcPr>
+          <w:p>
+            <w:pPr>
+              <w:spacing w:after="160" w:line="278" w:lineRule="auto"/>
+              <w:rPr>
+                <w:rFonts w:asciiTheme="minorHAnsi" w:hAnsiTheme="minorHAnsi"/>
+              </w:rPr>
+            </w:pPr>
+            <w:r>
+              <w:rPr>
+                <w:rFonts w:asciiTheme="minorHAnsi" w:hAnsiTheme="minorHAnsi"/>
+              </w:rPr>
+              <w:t>Passenger (needs immediate, accurate assistance); Airport Management (requires reliable emergency response logging); Medical Personnel (need precise location and situation details)</w:t>
+            </w:r>
+          </w:p>
+        </w:tc>
+      </w:tr>
+      <w:tr>
+        <w:tc>
+          <w:tcPr>
+            <w:tcW w:w="0" w:type="auto"/>
+            <w:hideMark/>
+          </w:tcPr>
+          <w:p>
+            <w:pPr>
+              <w:spacing w:after="160" w:line="278" w:lineRule="auto"/>
+              <w:rPr>
+                <w:rFonts w:asciiTheme="minorHAnsi" w:hAnsiTheme="minorHAnsi"/>
+              </w:rPr>
+            </w:pPr>
+            <w:r>
+              <w:rPr>
+                <w:rFonts w:asciiTheme="minorHAnsi" w:hAnsiTheme="minorHAnsi"/>
+                <w:b/>
+                <w:bCs/>
+              </w:rPr>
+              <w:t>Brief Description</w:t>
+            </w:r>
+          </w:p>
+        </w:tc>
+        <w:tc>
+          <w:tcPr>
+            <w:tcW w:w="12090" w:type="dxa"/>
+            <w:hideMark/>
+          </w:tcPr>
+          <w:p>
+            <w:pPr>
+              <w:spacing w:after="160" w:line="278" w:lineRule="auto"/>
+              <w:rPr>
+                <w:rFonts w:asciiTheme="minorHAnsi" w:hAnsiTheme="minorHAnsi"/>
+              </w:rPr>
+            </w:pPr>
+            <w:r>
+              <w:rPr>
+                <w:rFonts w:asciiTheme="minorHAnsi" w:hAnsiTheme="minorHAnsi"/>
+              </w:rPr>
+              <w:t>This use case describes how a passenger can instantly request medical or ambulatory assistance through the ACRMS kiosk or mobile application, connecting them to appropriate emergency services.</w:t>
+            </w:r>
+          </w:p>
+        </w:tc>
+      </w:tr>
+      <w:tr>
+        <w:tc>
+          <w:tcPr>
+            <w:tcW w:w="0" w:type="auto"/>
+            <w:hideMark/>
+          </w:tcPr>
+          <w:p>
+            <w:pPr>
+              <w:spacing w:after="160" w:line="278" w:lineRule="auto"/>
+              <w:rPr>
+                <w:rFonts w:asciiTheme="minorHAnsi" w:hAnsiTheme="minorHAnsi"/>
+              </w:rPr>
+            </w:pPr>
+            <w:r>
+              <w:rPr>
+                <w:rFonts w:asciiTheme="minorHAnsi" w:hAnsiTheme="minorHAnsi"/>
+                <w:b/>
+                <w:bCs/>
+              </w:rPr>
+              <w:t>Preconditions</w:t>
+            </w:r>
+          </w:p>
+        </w:tc>
+        <w:tc>
+          <w:tcPr>
+            <w:tcW w:w="12090" w:type="dxa"/>
+            <w:hideMark/>
+          </w:tcPr>
+          <w:p>
+            <w:pPr>
+              <w:spacing w:after="160" w:line="278" w:lineRule="auto"/>
+              <w:rPr>
+                <w:rFonts w:asciiTheme="minorHAnsi" w:hAnsiTheme="minorHAnsi"/>
+              </w:rPr>
+            </w:pPr>
+            <w:r>
+              <w:rPr>
+                <w:rFonts w:asciiTheme="minorHAnsi" w:hAnsiTheme="minorHAnsi"/>
+              </w:rPr>
+              <w:t>1. The ACRMS is operational.</w:t>
+            </w:r>
+            <w:r>
+              <w:rPr>
+                <w:rFonts w:asciiTheme="minorHAnsi" w:hAnsiTheme="minorHAnsi"/>
+              </w:rPr>
+              <w:br/>
+              <w:t>2. The kiosk or mobile device has connectivity to the airport's network.</w:t>
+            </w:r>
+            <w:r>
+              <w:rPr>
+                <w:rFonts w:asciiTheme="minorHAnsi" w:hAnsiTheme="minorHAnsi"/>
+              </w:rPr>
+              <w:br/>
+              <w:t>3. Emergency services dispatch is available and integrated with the system.</w:t>
+            </w:r>
+          </w:p>
+        </w:tc>
+      </w:tr>
+      <w:tr>
+        <w:tc>
+          <w:tcPr>
+            <w:tcW w:w="0" w:type="auto"/>
+            <w:hideMark/>
+          </w:tcPr>
+          <w:p>
+            <w:pPr>
+              <w:spacing w:after="160" w:line="278" w:lineRule="auto"/>
+              <w:rPr>
+                <w:rFonts w:asciiTheme="minorHAnsi" w:hAnsiTheme="minorHAnsi"/>
+              </w:rPr>
+            </w:pPr>
+            <w:r>
+              <w:rPr>
+                <w:rFonts w:asciiTheme="minorHAnsi" w:hAnsiTheme="minorHAnsi"/>
+                <w:b/>
+                <w:bCs/>
+              </w:rPr>
+              <w:t>Trigger</w:t>
+            </w:r>
+          </w:p>
+        </w:tc>
+        <w:tc>
+          <w:tcPr>
+            <w:tcW w:w="12090" w:type="dxa"/>
+            <w:hideMark/>
+          </w:tcPr>
+          <w:p>
+            <w:pPr>
+              <w:spacing w:after="160" w:line="278" w:lineRule="auto"/>
+              <w:rPr>
+                <w:rFonts w:asciiTheme="minorHAnsi" w:hAnsiTheme="minorHAnsi"/>
+              </w:rPr>
+            </w:pPr>
+            <w:r>
+              <w:rPr>
+                <w:rFonts w:asciiTheme="minorHAnsi" w:hAnsiTheme="minorHAnsi"/>
+              </w:rPr>
+              <w:t>Passenger selects "Medical Emergency" or "Ambulatory Services" option on the kiosk or mobile app interface.</w:t>
+            </w:r>
+          </w:p>
+        </w:tc>
+      </w:tr>
+      <w:tr>
+        <w:tc>
+          <w:tcPr>
+            <w:tcW w:w="0" w:type="auto"/>
+            <w:hideMark/>
+          </w:tcPr>
+          <w:p>
+            <w:pPr>
+              <w:spacing w:after="160" w:line="278" w:lineRule="auto"/>
+              <w:rPr>
+                <w:rFonts w:asciiTheme="minorHAnsi" w:hAnsiTheme="minorHAnsi"/>
+              </w:rPr>
+            </w:pPr>
+            <w:r>
+              <w:rPr>
+                <w:rFonts w:asciiTheme="minorHAnsi" w:hAnsiTheme="minorHAnsi"/>
+                <w:b/>
+                <w:bCs/>
+              </w:rPr>
+              <w:t>Main Success Scenario</w:t>
+            </w:r>
+          </w:p>
+        </w:tc>
+        <w:tc>
+          <w:tcPr>
+            <w:tcW w:w="12090" w:type="dxa"/>
+            <w:hideMark/>
+          </w:tcPr>
+          <w:p>
+            <w:pPr>
+              <w:spacing w:after="160" w:line="278" w:lineRule="auto"/>
+              <w:rPr>
+                <w:rFonts w:asciiTheme="minorHAnsi" w:hAnsiTheme="minorHAnsi"/>
+              </w:rPr>
+            </w:pPr>
+            <w:r>
+              <w:rPr>
+                <w:rFonts w:asciiTheme="minorHAnsi" w:hAnsiTheme="minorHAnsi"/>
+              </w:rPr>
+              <w:t>1. Passenger selects the emergency assistance option.</w:t>
+            </w:r>
+            <w:r>
+              <w:rPr>
+                <w:rFonts w:asciiTheme="minorHAnsi" w:hAnsiTheme="minorHAnsi"/>
+              </w:rPr>
+              <w:br/>
+              <w:t>2. System prompts passenger to confirm the nature of the emergency (e.g., cardiac, injury, general distress).</w:t>
+            </w:r>
+            <w:r>
+              <w:rPr>
+                <w:rFonts w:asciiTheme="minorHAnsi" w:hAnsiTheme="minorHAnsi"/>
+              </w:rPr>
+              <w:br/>
+              <w:t>3. System automatically captures the passenger's precise location using GPS (mobile) or kiosk ID.</w:t>
+            </w:r>
+            <w:r>
+              <w:rPr>
+                <w:rFonts w:asciiTheme="minorHAnsi" w:hAnsiTheme="minorHAnsi"/>
+              </w:rPr>
+              <w:br/>
+              <w:t>4. System establishes connection to the nearest available medical dispatcher.</w:t>
+            </w:r>
+            <w:r>
+              <w:rPr>
+                <w:rFonts w:asciiTheme="minorHAnsi" w:hAnsiTheme="minorHAnsi"/>
+              </w:rPr>
+              <w:br/>
+              <w:t>5. System transmits location data and emergency details to the dispatcher.</w:t>
+            </w:r>
+            <w:r>
+              <w:rPr>
+                <w:rFonts w:asciiTheme="minorHAnsi" w:hAnsiTheme="minorHAnsi"/>
+              </w:rPr>
+              <w:br/>
+              <w:t>6. System confirms to passenger that help is on the way and displays estimated arrival time.</w:t>
+            </w:r>
+            <w:r>
+              <w:rPr>
+                <w:rFonts w:asciiTheme="minorHAnsi" w:hAnsiTheme="minorHAnsi"/>
+              </w:rPr>
+              <w:br/>
+              <w:t>7. System logs the emergency request with timestamp and response details.</w:t>
+            </w:r>
+          </w:p>
+        </w:tc>
+      </w:tr>
+      <w:tr>
+        <w:tc>
+          <w:tcPr>
+            <w:tcW w:w="0" w:type="auto"/>
+            <w:hideMark/>
+          </w:tcPr>
+          <w:p>
+            <w:pPr>
+              <w:spacing w:after="160" w:line="278" w:lineRule="auto"/>
+              <w:rPr>
+                <w:rFonts w:asciiTheme="minorHAnsi" w:hAnsiTheme="minorHAnsi"/>
+              </w:rPr>
+            </w:pPr>
+            <w:r>
+              <w:rPr>
+                <w:rFonts w:asciiTheme="minorHAnsi" w:hAnsiTheme="minorHAnsi"/>
+                <w:b/>
+                <w:bCs/>
+              </w:rPr>
+              <w:t>Alternative Flows</w:t>
+            </w:r>
+          </w:p>
+        </w:tc>
+        <w:tc>
+          <w:tcPr>
+            <w:tcW w:w="12090" w:type="dxa"/>
+            <w:hideMark/>
+          </w:tcPr>
+          <w:p>
+            <w:pPr>
+              <w:spacing w:after="160" w:line="278" w:lineRule="auto"/>
+              <w:rPr>
+                <w:rFonts w:asciiTheme="minorHAnsi" w:hAnsiTheme="minorHAnsi"/>
+              </w:rPr>
+            </w:pPr>
+            <w:r>
+              <w:rPr>
+                <w:rFonts w:asciiTheme="minorHAnsi" w:hAnsiTheme="minorHAnsi"/>
+                <w:b/>
+                <w:bCs/>
+              </w:rPr>
+              <w:t>A1: Connection failure</w:t>
+            </w:r>
+            <w:r>
+              <w:rPr>
+                <w:rFonts w:asciiTheme="minorHAnsi" w:hAnsiTheme="minorHAnsi"/>
+              </w:rPr>
+              <w:br/>
+              <w:t>1. If system cannot connect to dispatcher immediately, it displays emergency contact numbers and alerts airport staff to respond manually.</w:t>
+            </w:r>
+            <w:r>
+              <w:rPr>
+                <w:rFonts w:asciiTheme="minorHAnsi" w:hAnsiTheme="minorHAnsi"/>
+              </w:rPr>
+              <w:br/>
+            </w:r>
+            <w:r>
+              <w:rPr>
+                <w:rFonts w:asciiTheme="minorHAnsi" w:hAnsiTheme="minorHAnsi"/>
+              </w:rPr>
+              <w:lastRenderedPageBreak/>
+              <w:br/>
+            </w:r>
+            <w:r>
+              <w:rPr>
+                <w:rFonts w:asciiTheme="minorHAnsi" w:hAnsiTheme="minorHAnsi"/>
+                <w:b/>
+                <w:bCs/>
+              </w:rPr>
+              <w:t>A2: Passenger cancels request</w:t>
+            </w:r>
+            <w:r>
+              <w:rPr>
+                <w:rFonts w:asciiTheme="minorHAnsi" w:hAnsiTheme="minorHAnsi"/>
+              </w:rPr>
+              <w:br/>
+              <w:t>1. Passenger may cancel within 10 seconds of initiating request.</w:t>
+            </w:r>
+            <w:r>
+              <w:rPr>
+                <w:rFonts w:asciiTheme="minorHAnsi" w:hAnsiTheme="minorHAnsi"/>
+              </w:rPr>
+              <w:br/>
+              <w:t>2. System confirms cancellation with dispatcher if already notified.</w:t>
+            </w:r>
+            <w:r>
+              <w:rPr>
+                <w:rFonts w:asciiTheme="minorHAnsi" w:hAnsiTheme="minorHAnsi"/>
+              </w:rPr>
+              <w:br/>
+            </w:r>
+            <w:r>
+              <w:rPr>
+                <w:rFonts w:asciiTheme="minorHAnsi" w:hAnsiTheme="minorHAnsi"/>
+              </w:rPr>
+              <w:br/>
+            </w:r>
+            <w:r>
+              <w:rPr>
+                <w:rFonts w:asciiTheme="minorHAnsi" w:hAnsiTheme="minorHAnsi"/>
+                <w:b/>
+                <w:bCs/>
+              </w:rPr>
+              <w:t>A3: False alarm</w:t>
+            </w:r>
+            <w:r>
+              <w:rPr>
+                <w:rFonts w:asciiTheme="minorHAnsi" w:hAnsiTheme="minorHAnsi"/>
+              </w:rPr>
+              <w:br/>
+              <w:t>1. Dispatcher can mark request as resolved if no assistance needed.</w:t>
+            </w:r>
+          </w:p>
+        </w:tc>
+      </w:tr>
+      <w:tr>
+        <w:tc>
+          <w:tcPr>
+            <w:tcW w:w="0" w:type="auto"/>
+            <w:hideMark/>
+          </w:tcPr>
+          <w:p>
+            <w:pPr>
+              <w:spacing w:after="160" w:line="278" w:lineRule="auto"/>
+              <w:rPr>
+                <w:rFonts w:asciiTheme="minorHAnsi" w:hAnsiTheme="minorHAnsi"/>
+              </w:rPr>
+            </w:pPr>
+            <w:r>
+              <w:rPr>
+                <w:rFonts w:asciiTheme="minorHAnsi" w:hAnsiTheme="minorHAnsi"/>
+                <w:b/>
+                <w:bCs/>
+              </w:rPr>
+              <w:lastRenderedPageBreak/>
+              <w:t>Postconditions</w:t>
+            </w:r>
+          </w:p>
+        </w:tc>
+        <w:tc>
+          <w:tcPr>
+            <w:tcW w:w="12090" w:type="dxa"/>
+            <w:hideMark/>
+          </w:tcPr>
+          <w:p>
+            <w:pPr>
+              <w:spacing w:after="160" w:line="278" w:lineRule="auto"/>
+              <w:rPr>
+                <w:rFonts w:asciiTheme="minorHAnsi" w:hAnsiTheme="minorHAnsi"/>
+              </w:rPr>
+            </w:pPr>
+            <w:r>
+              <w:rPr>
+                <w:rFonts w:asciiTheme="minorHAnsi" w:hAnsiTheme="minorHAnsi"/>
+              </w:rPr>
+              <w:t>1. Emergency services have been notified and dispatched to the correct location.</w:t>
+            </w:r>
+            <w:r>
+              <w:rPr>
+                <w:rFonts w:asciiTheme="minorHAnsi" w:hAnsiTheme="minorHAnsi"/>
+              </w:rPr>
+              <w:br/>
+              <w:t>2. The incident is recorded in the system for reporting and analysis.</w:t>
+            </w:r>
+            <w:r>
+              <w:rPr>
+                <w:rFonts w:asciiTheme="minorHAnsi" w:hAnsiTheme="minorHAnsi"/>
+              </w:rPr>
+              <w:br/>
+              <w:t>3. Passenger has received confirmation that assistance is en route.</w:t>
+            </w:r>
+          </w:p>
+        </w:tc>
+      </w:tr>
+      <w:tr>
+        <w:tc>
+          <w:tcPr>
+            <w:tcW w:w="0" w:type="auto"/>
+            <w:hideMark/>
+          </w:tcPr>
+          <w:p>
+            <w:pPr>
+              <w:spacing w:after="160" w:line="278" w:lineRule="auto"/>
+              <w:rPr>
+                <w:rFonts w:asciiTheme="minorHAnsi" w:hAnsiTheme="minorHAnsi"/>
+              </w:rPr>
+            </w:pPr>
+            <w:r>
+              <w:rPr>
+                <w:rFonts w:asciiTheme="minorHAnsi" w:hAnsiTheme="minorHAnsi"/>
+                <w:b/>
+                <w:bCs/>
+              </w:rPr>
+              <w:t>Non-Functional Requirements</w:t>
+            </w:r>
+          </w:p>
+        </w:tc>
+        <w:tc>
+          <w:tcPr>
+            <w:tcW w:w="12090" w:type="dxa"/>
+            <w:hideMark/>
+          </w:tcPr>
+          <w:p>
+            <w:pPr>
+              <w:spacing w:after="160" w:line="278" w:lineRule="auto"/>
+              <w:rPr>
+                <w:rFonts w:asciiTheme="minorHAnsi" w:hAnsiTheme="minorHAnsi"/>
+              </w:rPr>
+            </w:pPr>
+            <w:r>
+              <w:rPr>
+                <w:rFonts w:asciiTheme="minorHAnsi" w:hAnsiTheme="minorHAnsi"/>
+              </w:rPr>
+              <w:t>1. The connection to emergency services must be established within 3 seconds.</w:t>
+            </w:r>
+            <w:r>
+              <w:rPr>
+                <w:rFonts w:asciiTheme="minorHAnsi" w:hAnsiTheme="minorHAnsi"/>
+              </w:rPr>
+              <w:br/>
+              <w:t>2. System must remain operational 24/7 with 99.9% uptime.</w:t>
+            </w:r>
+            <w:r>
+              <w:rPr>
+                <w:rFonts w:asciiTheme="minorHAnsi" w:hAnsiTheme="minorHAnsi"/>
+              </w:rPr>
+              <w:br/>
+              <w:t>3. Location accuracy must be within 5 meters.</w:t>
+            </w:r>
+            <w:r>
+              <w:rPr>
+                <w:rFonts w:asciiTheme="minorHAnsi" w:hAnsiTheme="minorHAnsi"/>
+              </w:rPr>
+              <w:br/>
+              <w:t>4. The emergency interface must be accessible with minimal navigation (maximum 2 taps/clicks).</w:t>
+            </w:r>
+          </w:p>
+        </w:tc>
+      </w:tr>
+    </w:tbl>
+    <w:p>
+      <w:pPr>
+        <w:rPr>
+          <w:rFonts w:asciiTheme="minorHAnsi" w:hAnsiTheme="minorHAnsi"/>
+        </w:rPr>
+        <w:sectPr>
+          <w:pgSz w:w="16838" w:h="11906" w:orient="landscape"/>
+          <w:pgMar w:top="1440" w:right="1440" w:bottom="1440" w:left="1440" w:header="709" w:footer="709" w:gutter="0"/>
+          <w:pgNumType w:start="0"/>
+          <w:cols w:space="708"/>
+          <w:titlePg/>
+          <w:docGrid w:linePitch="360"/>
+        </w:sectPr>
+      </w:pPr>
+    </w:p>
+    <w:p>
+      <w:pPr>
         <w:pStyle w:val="Heading1"/>
+        <w:rPr>
+          <w:rFonts w:asciiTheme="minorHAnsi" w:hAnsiTheme="minorHAnsi"/>
+        </w:rPr>
       </w:pPr>
       <w:bookmarkStart w:id="3" w:name="_Toc224114456"/>
       <w:r>
+        <w:rPr>
+          <w:rFonts w:asciiTheme="minorHAnsi" w:hAnsiTheme="minorHAnsi"/>
+        </w:rPr>
         <w:lastRenderedPageBreak/>
         <w:t>Question 4</w:t>
       </w:r>
@@ -1481,7 +2953,7 @@
     <w:p>
       <w:pPr>
         <w:rPr>
-          <w:rFonts w:eastAsiaTheme="majorEastAsia" w:cstheme="majorBidi"/>
+          <w:rFonts w:asciiTheme="minorHAnsi" w:eastAsiaTheme="majorEastAsia" w:hAnsiTheme="minorHAnsi" w:cstheme="majorBidi"/>
           <w:color w:val="000000" w:themeColor="text1"/>
           <w:sz w:val="28"/>
           <w:szCs w:val="40"/>
@@ -1489,15 +2961,24 @@
         </w:rPr>
       </w:pPr>
       <w:r>
+        <w:rPr>
+          <w:rFonts w:asciiTheme="minorHAnsi" w:hAnsiTheme="minorHAnsi"/>
+        </w:rPr>
         <w:br w:type="page"/>
       </w:r>
     </w:p>
     <w:p>
       <w:pPr>
         <w:pStyle w:val="Heading1"/>
+        <w:rPr>
+          <w:rFonts w:asciiTheme="minorHAnsi" w:hAnsiTheme="minorHAnsi"/>
+        </w:rPr>
       </w:pPr>
       <w:bookmarkStart w:id="4" w:name="_Toc224114457"/>
       <w:r>
+        <w:rPr>
+          <w:rFonts w:asciiTheme="minorHAnsi" w:hAnsiTheme="minorHAnsi"/>
+        </w:rPr>
         <w:lastRenderedPageBreak/>
         <w:t>References</w:t>
       </w:r>
@@ -1506,93 +2987,446 @@
     <w:p>
       <w:pPr>
         <w:ind w:left="360"/>
-      </w:pPr>
-      <w:r>
-        <w:t>Hoffer, J. A., George, J. F., &amp; Valacich, J. S. (2016). </w:t>
-      </w:r>
-      <w:r>
-        <w:rPr>
+        <w:rPr>
+          <w:rFonts w:asciiTheme="minorHAnsi" w:hAnsiTheme="minorHAnsi"/>
+        </w:rPr>
+      </w:pPr>
+      <w:r>
+        <w:rPr>
+          <w:rFonts w:asciiTheme="minorHAnsi" w:hAnsiTheme="minorHAnsi"/>
+        </w:rPr>
+        <w:t>Chegg (2024) </w:t>
+      </w:r>
+      <w:r>
+        <w:rPr>
+          <w:rFonts w:asciiTheme="minorHAnsi" w:hAnsiTheme="minorHAnsi"/>
           <w:i/>
           <w:iCs/>
         </w:rPr>
-        <w:t>Modern Systems Analysis and Design</w:t>
-      </w:r>
-      <w:r>
-        <w:t> (8th ed.). Pearson. [Assumed classic text for foundational concepts]</w:t>
-      </w:r>
-    </w:p>
-    <w:p>
-      <w:pPr>
-        <w:ind w:left="360"/>
-      </w:pPr>
-      <w:r>
-        <w:t>Satzinger, J. W., Jackson, R. B., &amp; Burd, S. D. (2015). </w:t>
-      </w:r>
-      <w:r>
-        <w:rPr>
-          <w:i/>
-          <w:iCs/>
-        </w:rPr>
-        <w:t>Systems Analysis and Design in a Changing World</w:t>
-      </w:r>
-      <w:r>
-        <w:t> (7th ed.). Cengage Learning. [Assumed text for detailed methodologies]</w:t>
-      </w:r>
-    </w:p>
-    <w:p>
-      <w:pPr>
-        <w:ind w:left="360"/>
-      </w:pPr>
-      <w:r>
-        <w:t>Sommerville, I. (2015). </w:t>
-      </w:r>
-      <w:r>
-        <w:rPr>
-          <w:i/>
-          <w:iCs/>
-        </w:rPr>
-        <w:t>Software Engineering</w:t>
-      </w:r>
-      <w:r>
-        <w:t> (10th ed.). Pearson. [For requirements engineering and iterative models]</w:t>
-      </w:r>
-    </w:p>
-    <w:p>
-      <w:pPr>
-        <w:ind w:left="360"/>
-      </w:pPr>
-      <w:r>
-        <w:t>University of Cape Town. (2011). </w:t>
-      </w:r>
-      <w:r>
-        <w:rPr>
-          <w:i/>
-          <w:iCs/>
-        </w:rPr>
-        <w:t>Introduction to System Analysis and Design</w:t>
-      </w:r>
-      <w:r>
-        <w:t>. Department of Computer Science. Available</w:t>
-      </w:r>
-      <w:r>
-        <w:t xml:space="preserve"> </w:t>
-      </w:r>
-      <w:r>
-        <w:t>at: </w:t>
+        <w:t>Question: Question 3 (Marks: 20) Q.3.1 Using the event decomposition technique...</w:t>
+      </w:r>
+      <w:r>
+        <w:rPr>
+          <w:rFonts w:asciiTheme="minorHAnsi" w:hAnsiTheme="minorHAnsi"/>
+        </w:rPr>
+        <w:t> Available at: </w:t>
       </w:r>
       <w:hyperlink r:id="rId8" w:tgtFrame="_blank" w:history="1">
         <w:r>
           <w:rPr>
             <w:rStyle w:val="Hyperlink"/>
+            <w:rFonts w:asciiTheme="minorHAnsi" w:hAnsiTheme="minorHAnsi"/>
+          </w:rPr>
+          <w:t>https://www.chegg.com/homework-help/questions-and-answers/question-3-marks-20-q31-using-event-decomposition-technique-identify-four-events-8-resulti-q162091149</w:t>
+        </w:r>
+      </w:hyperlink>
+      <w:r>
+        <w:rPr>
+          <w:rFonts w:asciiTheme="minorHAnsi" w:hAnsiTheme="minorHAnsi"/>
+        </w:rPr>
+        <w:t> (Accessed: 12 March 2026).</w:t>
+      </w:r>
+    </w:p>
+    <w:p>
+      <w:pPr>
+        <w:ind w:left="360"/>
+        <w:rPr>
+          <w:rFonts w:asciiTheme="minorHAnsi" w:hAnsiTheme="minorHAnsi"/>
+        </w:rPr>
+      </w:pPr>
+      <w:r>
+        <w:rPr>
+          <w:rFonts w:asciiTheme="minorHAnsi" w:hAnsiTheme="minorHAnsi"/>
+        </w:rPr>
+        <w:t>Hoffer, J. A., George, J. F., &amp; Valacich, J. S. (2016). </w:t>
+      </w:r>
+      <w:r>
+        <w:rPr>
+          <w:rFonts w:asciiTheme="minorHAnsi" w:hAnsiTheme="minorHAnsi"/>
+          <w:i/>
+          <w:iCs/>
+        </w:rPr>
+        <w:t>Modern Systems Analysis and Design</w:t>
+      </w:r>
+      <w:r>
+        <w:rPr>
+          <w:rFonts w:asciiTheme="minorHAnsi" w:hAnsiTheme="minorHAnsi"/>
+        </w:rPr>
+        <w:t> (8th ed.). Pearson. [Assumed classic text for foundational concepts]</w:t>
+      </w:r>
+    </w:p>
+    <w:p>
+      <w:pPr>
+        <w:ind w:left="360"/>
+        <w:rPr>
+          <w:rFonts w:asciiTheme="minorHAnsi" w:hAnsiTheme="minorHAnsi"/>
+        </w:rPr>
+      </w:pPr>
+      <w:r>
+        <w:rPr>
+          <w:rFonts w:asciiTheme="minorHAnsi" w:hAnsiTheme="minorHAnsi"/>
+        </w:rPr>
+        <w:t>Hoffer, J.A., George, J.F. and Valacich, J.S. (2016) </w:t>
+      </w:r>
+      <w:r>
+        <w:rPr>
+          <w:rFonts w:asciiTheme="minorHAnsi" w:hAnsiTheme="minorHAnsi"/>
+          <w:i/>
+          <w:iCs/>
+        </w:rPr>
+        <w:t>Modern Systems Analysis and Design</w:t>
+      </w:r>
+      <w:r>
+        <w:rPr>
+          <w:rFonts w:asciiTheme="minorHAnsi" w:hAnsiTheme="minorHAnsi"/>
+        </w:rPr>
+        <w:t>. 8th edn. Harlow: Pearson Education.</w:t>
+      </w:r>
+    </w:p>
+    <w:p>
+      <w:pPr>
+        <w:ind w:left="360"/>
+        <w:rPr>
+          <w:rFonts w:asciiTheme="minorHAnsi" w:hAnsiTheme="minorHAnsi"/>
+        </w:rPr>
+      </w:pPr>
+      <w:r>
+        <w:rPr>
+          <w:rFonts w:asciiTheme="minorHAnsi" w:hAnsiTheme="minorHAnsi"/>
+        </w:rPr>
+        <w:t>Questions LLC (2024) </w:t>
+      </w:r>
+      <w:r>
+        <w:rPr>
+          <w:rFonts w:asciiTheme="minorHAnsi" w:hAnsiTheme="minorHAnsi"/>
+          <w:i/>
+          <w:iCs/>
+        </w:rPr>
+        <w:t>Question 2 (Marks: 10) Stakeholders represent a person or group of...</w:t>
+      </w:r>
+      <w:r>
+        <w:rPr>
+          <w:rFonts w:asciiTheme="minorHAnsi" w:hAnsiTheme="minorHAnsi"/>
+        </w:rPr>
+        <w:t> Available at: </w:t>
+      </w:r>
+      <w:hyperlink r:id="rId9" w:tgtFrame="_blank" w:history="1">
+        <w:r>
+          <w:rPr>
+            <w:rStyle w:val="Hyperlink"/>
+            <w:rFonts w:asciiTheme="minorHAnsi" w:hAnsiTheme="minorHAnsi"/>
+          </w:rPr>
+          <w:t>https://questions.llc/questions/2803855</w:t>
+        </w:r>
+      </w:hyperlink>
+      <w:r>
+        <w:rPr>
+          <w:rFonts w:asciiTheme="minorHAnsi" w:hAnsiTheme="minorHAnsi"/>
+        </w:rPr>
+        <w:t> (Accessed: 12 March 2026).</w:t>
+      </w:r>
+    </w:p>
+    <w:p>
+      <w:pPr>
+        <w:ind w:left="360"/>
+        <w:rPr>
+          <w:rFonts w:asciiTheme="minorHAnsi" w:hAnsiTheme="minorHAnsi"/>
+        </w:rPr>
+      </w:pPr>
+      <w:r>
+        <w:rPr>
+          <w:rFonts w:asciiTheme="minorHAnsi" w:hAnsiTheme="minorHAnsi"/>
+        </w:rPr>
+        <w:t>Satzinger, J. W., Jackson, R. B., &amp; Burd, S. D. (2015). </w:t>
+      </w:r>
+      <w:r>
+        <w:rPr>
+          <w:rFonts w:asciiTheme="minorHAnsi" w:hAnsiTheme="minorHAnsi"/>
+          <w:i/>
+          <w:iCs/>
+        </w:rPr>
+        <w:t>Systems Analysis and Design in a Changing World</w:t>
+      </w:r>
+      <w:r>
+        <w:rPr>
+          <w:rFonts w:asciiTheme="minorHAnsi" w:hAnsiTheme="minorHAnsi"/>
+        </w:rPr>
+        <w:t> (7th ed.). Cengage Learning. [Assumed text for detailed methodologies]</w:t>
+      </w:r>
+    </w:p>
+    <w:p>
+      <w:pPr>
+        <w:ind w:left="360"/>
+        <w:rPr>
+          <w:rFonts w:asciiTheme="minorHAnsi" w:hAnsiTheme="minorHAnsi"/>
+        </w:rPr>
+      </w:pPr>
+      <w:r>
+        <w:rPr>
+          <w:rFonts w:asciiTheme="minorHAnsi" w:hAnsiTheme="minorHAnsi"/>
+        </w:rPr>
+        <w:t>Satzinger, J.W., Jackson, R.B. and Burd, S.D. (2015) </w:t>
+      </w:r>
+      <w:r>
+        <w:rPr>
+          <w:rFonts w:asciiTheme="minorHAnsi" w:hAnsiTheme="minorHAnsi"/>
+          <w:i/>
+          <w:iCs/>
+        </w:rPr>
+        <w:t>Systems Analysis and Design in a Changing World</w:t>
+      </w:r>
+      <w:r>
+        <w:rPr>
+          <w:rFonts w:asciiTheme="minorHAnsi" w:hAnsiTheme="minorHAnsi"/>
+        </w:rPr>
+        <w:t>. 7th edn. Boston: Cengage Learning.</w:t>
+      </w:r>
+    </w:p>
+    <w:p>
+      <w:pPr>
+        <w:ind w:left="360"/>
+        <w:rPr>
+          <w:rFonts w:asciiTheme="minorHAnsi" w:hAnsiTheme="minorHAnsi"/>
+        </w:rPr>
+      </w:pPr>
+      <w:r>
+        <w:rPr>
+          <w:rFonts w:asciiTheme="minorHAnsi" w:hAnsiTheme="minorHAnsi"/>
+        </w:rPr>
+        <w:t>Sommerville, I. (2015) </w:t>
+      </w:r>
+      <w:r>
+        <w:rPr>
+          <w:rFonts w:asciiTheme="minorHAnsi" w:hAnsiTheme="minorHAnsi"/>
+          <w:i/>
+          <w:iCs/>
+        </w:rPr>
+        <w:t>Software Engineering</w:t>
+      </w:r>
+      <w:r>
+        <w:rPr>
+          <w:rFonts w:asciiTheme="minorHAnsi" w:hAnsiTheme="minorHAnsi"/>
+        </w:rPr>
+        <w:t>. 10th edn. Harlow: Pearson Education.</w:t>
+      </w:r>
+    </w:p>
+    <w:p>
+      <w:pPr>
+        <w:ind w:left="360"/>
+        <w:rPr>
+          <w:rFonts w:asciiTheme="minorHAnsi" w:hAnsiTheme="minorHAnsi"/>
+        </w:rPr>
+      </w:pPr>
+      <w:r>
+        <w:rPr>
+          <w:rFonts w:asciiTheme="minorHAnsi" w:hAnsiTheme="minorHAnsi"/>
+        </w:rPr>
+        <w:t>Sommerville, I. (2015). </w:t>
+      </w:r>
+      <w:r>
+        <w:rPr>
+          <w:rFonts w:asciiTheme="minorHAnsi" w:hAnsiTheme="minorHAnsi"/>
+          <w:i/>
+          <w:iCs/>
+        </w:rPr>
+        <w:t>Software Engineering</w:t>
+      </w:r>
+      <w:r>
+        <w:rPr>
+          <w:rFonts w:asciiTheme="minorHAnsi" w:hAnsiTheme="minorHAnsi"/>
+        </w:rPr>
+        <w:t> (10th ed.). Pearson. [For requirements engineering and iterative models]</w:t>
+      </w:r>
+    </w:p>
+    <w:p>
+      <w:pPr>
+        <w:ind w:left="360"/>
+        <w:rPr>
+          <w:rFonts w:asciiTheme="minorHAnsi" w:hAnsiTheme="minorHAnsi"/>
+        </w:rPr>
+      </w:pPr>
+      <w:r>
+        <w:rPr>
+          <w:rFonts w:asciiTheme="minorHAnsi" w:hAnsiTheme="minorHAnsi"/>
+        </w:rPr>
+        <w:t>StudyX (2024a) </w:t>
+      </w:r>
+      <w:r>
+        <w:rPr>
+          <w:rFonts w:asciiTheme="minorHAnsi" w:hAnsiTheme="minorHAnsi"/>
+          <w:i/>
+          <w:iCs/>
+        </w:rPr>
+        <w:t>Computer Science Stakeholders represent a person or group of people...</w:t>
+      </w:r>
+      <w:r>
+        <w:rPr>
+          <w:rFonts w:asciiTheme="minorHAnsi" w:hAnsiTheme="minorHAnsi"/>
+        </w:rPr>
+        <w:t> Available at: </w:t>
+      </w:r>
+      <w:hyperlink r:id="rId10" w:tgtFrame="_blank" w:history="1">
+        <w:r>
+          <w:rPr>
+            <w:rStyle w:val="Hyperlink"/>
+            <w:rFonts w:asciiTheme="minorHAnsi" w:hAnsiTheme="minorHAnsi"/>
+          </w:rPr>
+          <w:t>https://studyx.ai/homework/104573827</w:t>
+        </w:r>
+      </w:hyperlink>
+      <w:r>
+        <w:rPr>
+          <w:rFonts w:asciiTheme="minorHAnsi" w:hAnsiTheme="minorHAnsi"/>
+        </w:rPr>
+        <w:t> (Accessed: 12 March 2026).</w:t>
+      </w:r>
+    </w:p>
+    <w:p>
+      <w:pPr>
+        <w:ind w:left="360"/>
+        <w:rPr>
+          <w:rFonts w:asciiTheme="minorHAnsi" w:hAnsiTheme="minorHAnsi"/>
+        </w:rPr>
+      </w:pPr>
+      <w:r>
+        <w:rPr>
+          <w:rFonts w:asciiTheme="minorHAnsi" w:hAnsiTheme="minorHAnsi"/>
+        </w:rPr>
+        <w:t>StudyX (2024b) </w:t>
+      </w:r>
+      <w:r>
+        <w:rPr>
+          <w:rFonts w:asciiTheme="minorHAnsi" w:hAnsiTheme="minorHAnsi"/>
+          <w:i/>
+          <w:iCs/>
+        </w:rPr>
+        <w:t>Q21 Identify five (5) potential stakeholders...</w:t>
+      </w:r>
+      <w:r>
+        <w:rPr>
+          <w:rFonts w:asciiTheme="minorHAnsi" w:hAnsiTheme="minorHAnsi"/>
+        </w:rPr>
+        <w:t> Available at: </w:t>
+      </w:r>
+      <w:hyperlink r:id="rId11" w:tgtFrame="_blank" w:history="1">
+        <w:r>
+          <w:rPr>
+            <w:rStyle w:val="Hyperlink"/>
+            <w:rFonts w:asciiTheme="minorHAnsi" w:hAnsiTheme="minorHAnsi"/>
+          </w:rPr>
+          <w:t>https://studyx.ai/homework/102994269</w:t>
+        </w:r>
+      </w:hyperlink>
+      <w:r>
+        <w:rPr>
+          <w:rFonts w:asciiTheme="minorHAnsi" w:hAnsiTheme="minorHAnsi"/>
+        </w:rPr>
+        <w:t> (Accessed: 12 March 2026).</w:t>
+      </w:r>
+    </w:p>
+    <w:p>
+      <w:pPr>
+        <w:ind w:left="360"/>
+        <w:rPr>
+          <w:rFonts w:asciiTheme="minorHAnsi" w:hAnsiTheme="minorHAnsi"/>
+        </w:rPr>
+      </w:pPr>
+      <w:r>
+        <w:rPr>
+          <w:rFonts w:asciiTheme="minorHAnsi" w:hAnsiTheme="minorHAnsi"/>
+        </w:rPr>
+        <w:t>StudyX (2024c) </w:t>
+      </w:r>
+      <w:r>
+        <w:rPr>
+          <w:rFonts w:asciiTheme="minorHAnsi" w:hAnsiTheme="minorHAnsi"/>
+          <w:i/>
+          <w:iCs/>
+        </w:rPr>
+        <w:t>Question 3 (Marks Q.3.1 Using the event decomposition technique...</w:t>
+      </w:r>
+      <w:r>
+        <w:rPr>
+          <w:rFonts w:asciiTheme="minorHAnsi" w:hAnsiTheme="minorHAnsi"/>
+        </w:rPr>
+        <w:t> Available at: </w:t>
+      </w:r>
+      <w:hyperlink r:id="rId12" w:tgtFrame="_blank" w:history="1">
+        <w:r>
+          <w:rPr>
+            <w:rStyle w:val="Hyperlink"/>
+            <w:rFonts w:asciiTheme="minorHAnsi" w:hAnsiTheme="minorHAnsi"/>
+          </w:rPr>
+          <w:t>https://studyx.ai/homework/105202401</w:t>
+        </w:r>
+      </w:hyperlink>
+      <w:r>
+        <w:rPr>
+          <w:rFonts w:asciiTheme="minorHAnsi" w:hAnsiTheme="minorHAnsi"/>
+        </w:rPr>
+        <w:t> (Accessed: 12 March 2026).</w:t>
+      </w:r>
+    </w:p>
+    <w:p>
+      <w:pPr>
+        <w:ind w:left="360"/>
+        <w:rPr>
+          <w:rFonts w:asciiTheme="minorHAnsi" w:hAnsiTheme="minorHAnsi"/>
+        </w:rPr>
+      </w:pPr>
+      <w:r>
+        <w:rPr>
+          <w:rFonts w:asciiTheme="minorHAnsi" w:hAnsiTheme="minorHAnsi"/>
+        </w:rPr>
+        <w:t>University of Cape Town. (2011). </w:t>
+      </w:r>
+      <w:r>
+        <w:rPr>
+          <w:rFonts w:asciiTheme="minorHAnsi" w:hAnsiTheme="minorHAnsi"/>
+          <w:i/>
+          <w:iCs/>
+        </w:rPr>
+        <w:t>Introduction to System Analysis and Design</w:t>
+      </w:r>
+      <w:r>
+        <w:rPr>
+          <w:rFonts w:asciiTheme="minorHAnsi" w:hAnsiTheme="minorHAnsi"/>
+        </w:rPr>
+        <w:t>. Department of Computer Science. Available at: </w:t>
+      </w:r>
+      <w:hyperlink r:id="rId13" w:tgtFrame="_blank" w:history="1">
+        <w:r>
+          <w:rPr>
+            <w:rStyle w:val="Hyperlink"/>
+            <w:rFonts w:asciiTheme="minorHAnsi" w:hAnsiTheme="minorHAnsi"/>
           </w:rPr>
           <w:t>https://www.cs.uct.ac.za/mit_notes/software/htmls/ch04s02.html</w:t>
         </w:r>
       </w:hyperlink>
       <w:r>
+        <w:rPr>
+          <w:rFonts w:asciiTheme="minorHAnsi" w:hAnsiTheme="minorHAnsi"/>
+        </w:rPr>
         <w:t> </w:t>
       </w:r>
     </w:p>
-    <w:p/>
+    <w:p>
+      <w:pPr>
+        <w:ind w:left="360"/>
+        <w:rPr>
+          <w:rFonts w:asciiTheme="minorHAnsi" w:hAnsiTheme="minorHAnsi"/>
+          <w:b/>
+          <w:bCs/>
+        </w:rPr>
+      </w:pPr>
+    </w:p>
+    <w:p>
+      <w:pPr>
+        <w:rPr>
+          <w:rFonts w:asciiTheme="minorHAnsi" w:hAnsiTheme="minorHAnsi"/>
+        </w:rPr>
+      </w:pPr>
+    </w:p>
     <w:sectPr>
       <w:pgSz w:w="11906" w:h="16838"/>
       <w:pgMar w:top="1440" w:right="1440" w:bottom="1440" w:left="1440" w:header="708" w:footer="708" w:gutter="0"/>
@@ -1757,6 +3591,155 @@
     </w:lvl>
   </w:abstractNum>
   <w:abstractNum w:abstractNumId="1" w15:restartNumberingAfterBreak="0">
+    <w:nsid w:val="0E917D73"/>
+    <w:multiLevelType w:val="multilevel"/>
+    <w:tmpl w:val="CC661B52"/>
+    <w:lvl w:ilvl="0">
+      <w:start w:val="1"/>
+      <w:numFmt w:val="bullet"/>
+      <w:lvlText w:val=""/>
+      <w:lvlJc w:val="left"/>
+      <w:pPr>
+        <w:tabs>
+          <w:tab w:val="num" w:pos="720"/>
+        </w:tabs>
+        <w:ind w:left="720" w:hanging="360"/>
+      </w:pPr>
+      <w:rPr>
+        <w:rFonts w:ascii="Symbol" w:hAnsi="Symbol" w:hint="default"/>
+        <w:sz w:val="20"/>
+      </w:rPr>
+    </w:lvl>
+    <w:lvl w:ilvl="1" w:tentative="1">
+      <w:start w:val="1"/>
+      <w:numFmt w:val="bullet"/>
+      <w:lvlText w:val="o"/>
+      <w:lvlJc w:val="left"/>
+      <w:pPr>
+        <w:tabs>
+          <w:tab w:val="num" w:pos="1440"/>
+        </w:tabs>
+        <w:ind w:left="1440" w:hanging="360"/>
+      </w:pPr>
+      <w:rPr>
+        <w:rFonts w:ascii="Courier New" w:hAnsi="Courier New" w:hint="default"/>
+        <w:sz w:val="20"/>
+      </w:rPr>
+    </w:lvl>
+    <w:lvl w:ilvl="2" w:tentative="1">
+      <w:start w:val="1"/>
+      <w:numFmt w:val="bullet"/>
+      <w:lvlText w:val=""/>
+      <w:lvlJc w:val="left"/>
+      <w:pPr>
+        <w:tabs>
+          <w:tab w:val="num" w:pos="2160"/>
+        </w:tabs>
+        <w:ind w:left="2160" w:hanging="360"/>
+      </w:pPr>
+      <w:rPr>
+        <w:rFonts w:ascii="Wingdings" w:hAnsi="Wingdings" w:hint="default"/>
+        <w:sz w:val="20"/>
+      </w:rPr>
+    </w:lvl>
+    <w:lvl w:ilvl="3" w:tentative="1">
+      <w:start w:val="1"/>
+      <w:numFmt w:val="bullet"/>
+      <w:lvlText w:val=""/>
+      <w:lvlJc w:val="left"/>
+      <w:pPr>
+        <w:tabs>
+          <w:tab w:val="num" w:pos="2880"/>
+        </w:tabs>
+        <w:ind w:left="2880" w:hanging="360"/>
+      </w:pPr>
+      <w:rPr>
+        <w:rFonts w:ascii="Wingdings" w:hAnsi="Wingdings" w:hint="default"/>
+        <w:sz w:val="20"/>
+      </w:rPr>
+    </w:lvl>
+    <w:lvl w:ilvl="4" w:tentative="1">
+      <w:start w:val="1"/>
+      <w:numFmt w:val="bullet"/>
+      <w:lvlText w:val=""/>
+      <w:lvlJc w:val="left"/>
+      <w:pPr>
+        <w:tabs>
+          <w:tab w:val="num" w:pos="3600"/>
+        </w:tabs>
+        <w:ind w:left="3600" w:hanging="360"/>
+      </w:pPr>
+      <w:rPr>
+        <w:rFonts w:ascii="Wingdings" w:hAnsi="Wingdings" w:hint="default"/>
+        <w:sz w:val="20"/>
+      </w:rPr>
+    </w:lvl>
+    <w:lvl w:ilvl="5" w:tentative="1">
+      <w:start w:val="1"/>
+      <w:numFmt w:val="bullet"/>
+      <w:lvlText w:val=""/>
+      <w:lvlJc w:val="left"/>
+      <w:pPr>
+        <w:tabs>
+          <w:tab w:val="num" w:pos="4320"/>
+        </w:tabs>
+        <w:ind w:left="4320" w:hanging="360"/>
+      </w:pPr>
+      <w:rPr>
+        <w:rFonts w:ascii="Wingdings" w:hAnsi="Wingdings" w:hint="default"/>
+        <w:sz w:val="20"/>
+      </w:rPr>
+    </w:lvl>
+    <w:lvl w:ilvl="6" w:tentative="1">
+      <w:start w:val="1"/>
+      <w:numFmt w:val="bullet"/>
+      <w:lvlText w:val=""/>
+      <w:lvlJc w:val="left"/>
+      <w:pPr>
+        <w:tabs>
+          <w:tab w:val="num" w:pos="5040"/>
+        </w:tabs>
+        <w:ind w:left="5040" w:hanging="360"/>
+      </w:pPr>
+      <w:rPr>
+        <w:rFonts w:ascii="Wingdings" w:hAnsi="Wingdings" w:hint="default"/>
+        <w:sz w:val="20"/>
+      </w:rPr>
+    </w:lvl>
+    <w:lvl w:ilvl="7" w:tentative="1">
+      <w:start w:val="1"/>
+      <w:numFmt w:val="bullet"/>
+      <w:lvlText w:val=""/>
+      <w:lvlJc w:val="left"/>
+      <w:pPr>
+        <w:tabs>
+          <w:tab w:val="num" w:pos="5760"/>
+        </w:tabs>
+        <w:ind w:left="5760" w:hanging="360"/>
+      </w:pPr>
+      <w:rPr>
+        <w:rFonts w:ascii="Wingdings" w:hAnsi="Wingdings" w:hint="default"/>
+        <w:sz w:val="20"/>
+      </w:rPr>
+    </w:lvl>
+    <w:lvl w:ilvl="8" w:tentative="1">
+      <w:start w:val="1"/>
+      <w:numFmt w:val="bullet"/>
+      <w:lvlText w:val=""/>
+      <w:lvlJc w:val="left"/>
+      <w:pPr>
+        <w:tabs>
+          <w:tab w:val="num" w:pos="6480"/>
+        </w:tabs>
+        <w:ind w:left="6480" w:hanging="360"/>
+      </w:pPr>
+      <w:rPr>
+        <w:rFonts w:ascii="Wingdings" w:hAnsi="Wingdings" w:hint="default"/>
+        <w:sz w:val="20"/>
+      </w:rPr>
+    </w:lvl>
+  </w:abstractNum>
+  <w:abstractNum w:abstractNumId="2" w15:restartNumberingAfterBreak="0">
     <w:nsid w:val="11290976"/>
     <w:multiLevelType w:val="multilevel"/>
     <w:tmpl w:val="4590F498"/>
@@ -1905,7 +3888,454 @@
       </w:rPr>
     </w:lvl>
   </w:abstractNum>
-  <w:abstractNum w:abstractNumId="2" w15:restartNumberingAfterBreak="0">
+  <w:abstractNum w:abstractNumId="3" w15:restartNumberingAfterBreak="0">
+    <w:nsid w:val="15254F78"/>
+    <w:multiLevelType w:val="multilevel"/>
+    <w:tmpl w:val="F000B640"/>
+    <w:lvl w:ilvl="0">
+      <w:start w:val="1"/>
+      <w:numFmt w:val="bullet"/>
+      <w:lvlText w:val=""/>
+      <w:lvlJc w:val="left"/>
+      <w:pPr>
+        <w:tabs>
+          <w:tab w:val="num" w:pos="720"/>
+        </w:tabs>
+        <w:ind w:left="720" w:hanging="360"/>
+      </w:pPr>
+      <w:rPr>
+        <w:rFonts w:ascii="Symbol" w:hAnsi="Symbol" w:hint="default"/>
+        <w:sz w:val="20"/>
+      </w:rPr>
+    </w:lvl>
+    <w:lvl w:ilvl="1" w:tentative="1">
+      <w:start w:val="1"/>
+      <w:numFmt w:val="bullet"/>
+      <w:lvlText w:val="o"/>
+      <w:lvlJc w:val="left"/>
+      <w:pPr>
+        <w:tabs>
+          <w:tab w:val="num" w:pos="1440"/>
+        </w:tabs>
+        <w:ind w:left="1440" w:hanging="360"/>
+      </w:pPr>
+      <w:rPr>
+        <w:rFonts w:ascii="Courier New" w:hAnsi="Courier New" w:hint="default"/>
+        <w:sz w:val="20"/>
+      </w:rPr>
+    </w:lvl>
+    <w:lvl w:ilvl="2" w:tentative="1">
+      <w:start w:val="1"/>
+      <w:numFmt w:val="bullet"/>
+      <w:lvlText w:val=""/>
+      <w:lvlJc w:val="left"/>
+      <w:pPr>
+        <w:tabs>
+          <w:tab w:val="num" w:pos="2160"/>
+        </w:tabs>
+        <w:ind w:left="2160" w:hanging="360"/>
+      </w:pPr>
+      <w:rPr>
+        <w:rFonts w:ascii="Wingdings" w:hAnsi="Wingdings" w:hint="default"/>
+        <w:sz w:val="20"/>
+      </w:rPr>
+    </w:lvl>
+    <w:lvl w:ilvl="3" w:tentative="1">
+      <w:start w:val="1"/>
+      <w:numFmt w:val="bullet"/>
+      <w:lvlText w:val=""/>
+      <w:lvlJc w:val="left"/>
+      <w:pPr>
+        <w:tabs>
+          <w:tab w:val="num" w:pos="2880"/>
+        </w:tabs>
+        <w:ind w:left="2880" w:hanging="360"/>
+      </w:pPr>
+      <w:rPr>
+        <w:rFonts w:ascii="Wingdings" w:hAnsi="Wingdings" w:hint="default"/>
+        <w:sz w:val="20"/>
+      </w:rPr>
+    </w:lvl>
+    <w:lvl w:ilvl="4" w:tentative="1">
+      <w:start w:val="1"/>
+      <w:numFmt w:val="bullet"/>
+      <w:lvlText w:val=""/>
+      <w:lvlJc w:val="left"/>
+      <w:pPr>
+        <w:tabs>
+          <w:tab w:val="num" w:pos="3600"/>
+        </w:tabs>
+        <w:ind w:left="3600" w:hanging="360"/>
+      </w:pPr>
+      <w:rPr>
+        <w:rFonts w:ascii="Wingdings" w:hAnsi="Wingdings" w:hint="default"/>
+        <w:sz w:val="20"/>
+      </w:rPr>
+    </w:lvl>
+    <w:lvl w:ilvl="5" w:tentative="1">
+      <w:start w:val="1"/>
+      <w:numFmt w:val="bullet"/>
+      <w:lvlText w:val=""/>
+      <w:lvlJc w:val="left"/>
+      <w:pPr>
+        <w:tabs>
+          <w:tab w:val="num" w:pos="4320"/>
+        </w:tabs>
+        <w:ind w:left="4320" w:hanging="360"/>
+      </w:pPr>
+      <w:rPr>
+        <w:rFonts w:ascii="Wingdings" w:hAnsi="Wingdings" w:hint="default"/>
+        <w:sz w:val="20"/>
+      </w:rPr>
+    </w:lvl>
+    <w:lvl w:ilvl="6" w:tentative="1">
+      <w:start w:val="1"/>
+      <w:numFmt w:val="bullet"/>
+      <w:lvlText w:val=""/>
+      <w:lvlJc w:val="left"/>
+      <w:pPr>
+        <w:tabs>
+          <w:tab w:val="num" w:pos="5040"/>
+        </w:tabs>
+        <w:ind w:left="5040" w:hanging="360"/>
+      </w:pPr>
+      <w:rPr>
+        <w:rFonts w:ascii="Wingdings" w:hAnsi="Wingdings" w:hint="default"/>
+        <w:sz w:val="20"/>
+      </w:rPr>
+    </w:lvl>
+    <w:lvl w:ilvl="7" w:tentative="1">
+      <w:start w:val="1"/>
+      <w:numFmt w:val="bullet"/>
+      <w:lvlText w:val=""/>
+      <w:lvlJc w:val="left"/>
+      <w:pPr>
+        <w:tabs>
+          <w:tab w:val="num" w:pos="5760"/>
+        </w:tabs>
+        <w:ind w:left="5760" w:hanging="360"/>
+      </w:pPr>
+      <w:rPr>
+        <w:rFonts w:ascii="Wingdings" w:hAnsi="Wingdings" w:hint="default"/>
+        <w:sz w:val="20"/>
+      </w:rPr>
+    </w:lvl>
+    <w:lvl w:ilvl="8" w:tentative="1">
+      <w:start w:val="1"/>
+      <w:numFmt w:val="bullet"/>
+      <w:lvlText w:val=""/>
+      <w:lvlJc w:val="left"/>
+      <w:pPr>
+        <w:tabs>
+          <w:tab w:val="num" w:pos="6480"/>
+        </w:tabs>
+        <w:ind w:left="6480" w:hanging="360"/>
+      </w:pPr>
+      <w:rPr>
+        <w:rFonts w:ascii="Wingdings" w:hAnsi="Wingdings" w:hint="default"/>
+        <w:sz w:val="20"/>
+      </w:rPr>
+    </w:lvl>
+  </w:abstractNum>
+  <w:abstractNum w:abstractNumId="4" w15:restartNumberingAfterBreak="0">
+    <w:nsid w:val="18E53C97"/>
+    <w:multiLevelType w:val="multilevel"/>
+    <w:tmpl w:val="6E7ABF90"/>
+    <w:lvl w:ilvl="0">
+      <w:start w:val="1"/>
+      <w:numFmt w:val="bullet"/>
+      <w:lvlText w:val=""/>
+      <w:lvlJc w:val="left"/>
+      <w:pPr>
+        <w:tabs>
+          <w:tab w:val="num" w:pos="720"/>
+        </w:tabs>
+        <w:ind w:left="720" w:hanging="360"/>
+      </w:pPr>
+      <w:rPr>
+        <w:rFonts w:ascii="Symbol" w:hAnsi="Symbol" w:hint="default"/>
+        <w:sz w:val="20"/>
+      </w:rPr>
+    </w:lvl>
+    <w:lvl w:ilvl="1" w:tentative="1">
+      <w:start w:val="1"/>
+      <w:numFmt w:val="bullet"/>
+      <w:lvlText w:val="o"/>
+      <w:lvlJc w:val="left"/>
+      <w:pPr>
+        <w:tabs>
+          <w:tab w:val="num" w:pos="1440"/>
+        </w:tabs>
+        <w:ind w:left="1440" w:hanging="360"/>
+      </w:pPr>
+      <w:rPr>
+        <w:rFonts w:ascii="Courier New" w:hAnsi="Courier New" w:hint="default"/>
+        <w:sz w:val="20"/>
+      </w:rPr>
+    </w:lvl>
+    <w:lvl w:ilvl="2" w:tentative="1">
+      <w:start w:val="1"/>
+      <w:numFmt w:val="bullet"/>
+      <w:lvlText w:val=""/>
+      <w:lvlJc w:val="left"/>
+      <w:pPr>
+        <w:tabs>
+          <w:tab w:val="num" w:pos="2160"/>
+        </w:tabs>
+        <w:ind w:left="2160" w:hanging="360"/>
+      </w:pPr>
+      <w:rPr>
+        <w:rFonts w:ascii="Wingdings" w:hAnsi="Wingdings" w:hint="default"/>
+        <w:sz w:val="20"/>
+      </w:rPr>
+    </w:lvl>
+    <w:lvl w:ilvl="3" w:tentative="1">
+      <w:start w:val="1"/>
+      <w:numFmt w:val="bullet"/>
+      <w:lvlText w:val=""/>
+      <w:lvlJc w:val="left"/>
+      <w:pPr>
+        <w:tabs>
+          <w:tab w:val="num" w:pos="2880"/>
+        </w:tabs>
+        <w:ind w:left="2880" w:hanging="360"/>
+      </w:pPr>
+      <w:rPr>
+        <w:rFonts w:ascii="Wingdings" w:hAnsi="Wingdings" w:hint="default"/>
+        <w:sz w:val="20"/>
+      </w:rPr>
+    </w:lvl>
+    <w:lvl w:ilvl="4" w:tentative="1">
+      <w:start w:val="1"/>
+      <w:numFmt w:val="bullet"/>
+      <w:lvlText w:val=""/>
+      <w:lvlJc w:val="left"/>
+      <w:pPr>
+        <w:tabs>
+          <w:tab w:val="num" w:pos="3600"/>
+        </w:tabs>
+        <w:ind w:left="3600" w:hanging="360"/>
+      </w:pPr>
+      <w:rPr>
+        <w:rFonts w:ascii="Wingdings" w:hAnsi="Wingdings" w:hint="default"/>
+        <w:sz w:val="20"/>
+      </w:rPr>
+    </w:lvl>
+    <w:lvl w:ilvl="5" w:tentative="1">
+      <w:start w:val="1"/>
+      <w:numFmt w:val="bullet"/>
+      <w:lvlText w:val=""/>
+      <w:lvlJc w:val="left"/>
+      <w:pPr>
+        <w:tabs>
+          <w:tab w:val="num" w:pos="4320"/>
+        </w:tabs>
+        <w:ind w:left="4320" w:hanging="360"/>
+      </w:pPr>
+      <w:rPr>
+        <w:rFonts w:ascii="Wingdings" w:hAnsi="Wingdings" w:hint="default"/>
+        <w:sz w:val="20"/>
+      </w:rPr>
+    </w:lvl>
+    <w:lvl w:ilvl="6" w:tentative="1">
+      <w:start w:val="1"/>
+      <w:numFmt w:val="bullet"/>
+      <w:lvlText w:val=""/>
+      <w:lvlJc w:val="left"/>
+      <w:pPr>
+        <w:tabs>
+          <w:tab w:val="num" w:pos="5040"/>
+        </w:tabs>
+        <w:ind w:left="5040" w:hanging="360"/>
+      </w:pPr>
+      <w:rPr>
+        <w:rFonts w:ascii="Wingdings" w:hAnsi="Wingdings" w:hint="default"/>
+        <w:sz w:val="20"/>
+      </w:rPr>
+    </w:lvl>
+    <w:lvl w:ilvl="7" w:tentative="1">
+      <w:start w:val="1"/>
+      <w:numFmt w:val="bullet"/>
+      <w:lvlText w:val=""/>
+      <w:lvlJc w:val="left"/>
+      <w:pPr>
+        <w:tabs>
+          <w:tab w:val="num" w:pos="5760"/>
+        </w:tabs>
+        <w:ind w:left="5760" w:hanging="360"/>
+      </w:pPr>
+      <w:rPr>
+        <w:rFonts w:ascii="Wingdings" w:hAnsi="Wingdings" w:hint="default"/>
+        <w:sz w:val="20"/>
+      </w:rPr>
+    </w:lvl>
+    <w:lvl w:ilvl="8" w:tentative="1">
+      <w:start w:val="1"/>
+      <w:numFmt w:val="bullet"/>
+      <w:lvlText w:val=""/>
+      <w:lvlJc w:val="left"/>
+      <w:pPr>
+        <w:tabs>
+          <w:tab w:val="num" w:pos="6480"/>
+        </w:tabs>
+        <w:ind w:left="6480" w:hanging="360"/>
+      </w:pPr>
+      <w:rPr>
+        <w:rFonts w:ascii="Wingdings" w:hAnsi="Wingdings" w:hint="default"/>
+        <w:sz w:val="20"/>
+      </w:rPr>
+    </w:lvl>
+  </w:abstractNum>
+  <w:abstractNum w:abstractNumId="5" w15:restartNumberingAfterBreak="0">
+    <w:nsid w:val="330E691C"/>
+    <w:multiLevelType w:val="multilevel"/>
+    <w:tmpl w:val="4C48F57A"/>
+    <w:lvl w:ilvl="0">
+      <w:start w:val="1"/>
+      <w:numFmt w:val="bullet"/>
+      <w:lvlText w:val=""/>
+      <w:lvlJc w:val="left"/>
+      <w:pPr>
+        <w:tabs>
+          <w:tab w:val="num" w:pos="720"/>
+        </w:tabs>
+        <w:ind w:left="720" w:hanging="360"/>
+      </w:pPr>
+      <w:rPr>
+        <w:rFonts w:ascii="Symbol" w:hAnsi="Symbol" w:hint="default"/>
+        <w:sz w:val="20"/>
+      </w:rPr>
+    </w:lvl>
+    <w:lvl w:ilvl="1" w:tentative="1">
+      <w:start w:val="1"/>
+      <w:numFmt w:val="bullet"/>
+      <w:lvlText w:val="o"/>
+      <w:lvlJc w:val="left"/>
+      <w:pPr>
+        <w:tabs>
+          <w:tab w:val="num" w:pos="1440"/>
+        </w:tabs>
+        <w:ind w:left="1440" w:hanging="360"/>
+      </w:pPr>
+      <w:rPr>
+        <w:rFonts w:ascii="Courier New" w:hAnsi="Courier New" w:hint="default"/>
+        <w:sz w:val="20"/>
+      </w:rPr>
+    </w:lvl>
+    <w:lvl w:ilvl="2" w:tentative="1">
+      <w:start w:val="1"/>
+      <w:numFmt w:val="bullet"/>
+      <w:lvlText w:val=""/>
+      <w:lvlJc w:val="left"/>
+      <w:pPr>
+        <w:tabs>
+          <w:tab w:val="num" w:pos="2160"/>
+        </w:tabs>
+        <w:ind w:left="2160" w:hanging="360"/>
+      </w:pPr>
+      <w:rPr>
+        <w:rFonts w:ascii="Wingdings" w:hAnsi="Wingdings" w:hint="default"/>
+        <w:sz w:val="20"/>
+      </w:rPr>
+    </w:lvl>
+    <w:lvl w:ilvl="3" w:tentative="1">
+      <w:start w:val="1"/>
+      <w:numFmt w:val="bullet"/>
+      <w:lvlText w:val=""/>
+      <w:lvlJc w:val="left"/>
+      <w:pPr>
+        <w:tabs>
+          <w:tab w:val="num" w:pos="2880"/>
+        </w:tabs>
+        <w:ind w:left="2880" w:hanging="360"/>
+      </w:pPr>
+      <w:rPr>
+        <w:rFonts w:ascii="Wingdings" w:hAnsi="Wingdings" w:hint="default"/>
+        <w:sz w:val="20"/>
+      </w:rPr>
+    </w:lvl>
+    <w:lvl w:ilvl="4" w:tentative="1">
+      <w:start w:val="1"/>
+      <w:numFmt w:val="bullet"/>
+      <w:lvlText w:val=""/>
+      <w:lvlJc w:val="left"/>
+      <w:pPr>
+        <w:tabs>
+          <w:tab w:val="num" w:pos="3600"/>
+        </w:tabs>
+        <w:ind w:left="3600" w:hanging="360"/>
+      </w:pPr>
+      <w:rPr>
+        <w:rFonts w:ascii="Wingdings" w:hAnsi="Wingdings" w:hint="default"/>
+        <w:sz w:val="20"/>
+      </w:rPr>
+    </w:lvl>
+    <w:lvl w:ilvl="5" w:tentative="1">
+      <w:start w:val="1"/>
+      <w:numFmt w:val="bullet"/>
+      <w:lvlText w:val=""/>
+      <w:lvlJc w:val="left"/>
+      <w:pPr>
+        <w:tabs>
+          <w:tab w:val="num" w:pos="4320"/>
+        </w:tabs>
+        <w:ind w:left="4320" w:hanging="360"/>
+      </w:pPr>
+      <w:rPr>
+        <w:rFonts w:ascii="Wingdings" w:hAnsi="Wingdings" w:hint="default"/>
+        <w:sz w:val="20"/>
+      </w:rPr>
+    </w:lvl>
+    <w:lvl w:ilvl="6" w:tentative="1">
+      <w:start w:val="1"/>
+      <w:numFmt w:val="bullet"/>
+      <w:lvlText w:val=""/>
+      <w:lvlJc w:val="left"/>
+      <w:pPr>
+        <w:tabs>
+          <w:tab w:val="num" w:pos="5040"/>
+        </w:tabs>
+        <w:ind w:left="5040" w:hanging="360"/>
+      </w:pPr>
+      <w:rPr>
+        <w:rFonts w:ascii="Wingdings" w:hAnsi="Wingdings" w:hint="default"/>
+        <w:sz w:val="20"/>
+      </w:rPr>
+    </w:lvl>
+    <w:lvl w:ilvl="7" w:tentative="1">
+      <w:start w:val="1"/>
+      <w:numFmt w:val="bullet"/>
+      <w:lvlText w:val=""/>
+      <w:lvlJc w:val="left"/>
+      <w:pPr>
+        <w:tabs>
+          <w:tab w:val="num" w:pos="5760"/>
+        </w:tabs>
+        <w:ind w:left="5760" w:hanging="360"/>
+      </w:pPr>
+      <w:rPr>
+        <w:rFonts w:ascii="Wingdings" w:hAnsi="Wingdings" w:hint="default"/>
+        <w:sz w:val="20"/>
+      </w:rPr>
+    </w:lvl>
+    <w:lvl w:ilvl="8" w:tentative="1">
+      <w:start w:val="1"/>
+      <w:numFmt w:val="bullet"/>
+      <w:lvlText w:val=""/>
+      <w:lvlJc w:val="left"/>
+      <w:pPr>
+        <w:tabs>
+          <w:tab w:val="num" w:pos="6480"/>
+        </w:tabs>
+        <w:ind w:left="6480" w:hanging="360"/>
+      </w:pPr>
+      <w:rPr>
+        <w:rFonts w:ascii="Wingdings" w:hAnsi="Wingdings" w:hint="default"/>
+        <w:sz w:val="20"/>
+      </w:rPr>
+    </w:lvl>
+  </w:abstractNum>
+  <w:abstractNum w:abstractNumId="6" w15:restartNumberingAfterBreak="0">
     <w:nsid w:val="4DF61E40"/>
     <w:multiLevelType w:val="multilevel"/>
     <w:tmpl w:val="82821CF8"/>
@@ -2054,7 +4484,7 @@
       </w:rPr>
     </w:lvl>
   </w:abstractNum>
-  <w:abstractNum w:abstractNumId="3" w15:restartNumberingAfterBreak="0">
+  <w:abstractNum w:abstractNumId="7" w15:restartNumberingAfterBreak="0">
     <w:nsid w:val="5FB273C1"/>
     <w:multiLevelType w:val="multilevel"/>
     <w:tmpl w:val="0D446DB4"/>
@@ -2203,7 +4633,752 @@
       </w:rPr>
     </w:lvl>
   </w:abstractNum>
-  <w:abstractNum w:abstractNumId="4" w15:restartNumberingAfterBreak="0">
+  <w:abstractNum w:abstractNumId="8" w15:restartNumberingAfterBreak="0">
+    <w:nsid w:val="63AB739D"/>
+    <w:multiLevelType w:val="multilevel"/>
+    <w:tmpl w:val="5BD446D8"/>
+    <w:lvl w:ilvl="0">
+      <w:start w:val="1"/>
+      <w:numFmt w:val="bullet"/>
+      <w:lvlText w:val=""/>
+      <w:lvlJc w:val="left"/>
+      <w:pPr>
+        <w:tabs>
+          <w:tab w:val="num" w:pos="720"/>
+        </w:tabs>
+        <w:ind w:left="720" w:hanging="360"/>
+      </w:pPr>
+      <w:rPr>
+        <w:rFonts w:ascii="Symbol" w:hAnsi="Symbol" w:hint="default"/>
+        <w:sz w:val="20"/>
+      </w:rPr>
+    </w:lvl>
+    <w:lvl w:ilvl="1" w:tentative="1">
+      <w:start w:val="1"/>
+      <w:numFmt w:val="bullet"/>
+      <w:lvlText w:val="o"/>
+      <w:lvlJc w:val="left"/>
+      <w:pPr>
+        <w:tabs>
+          <w:tab w:val="num" w:pos="1440"/>
+        </w:tabs>
+        <w:ind w:left="1440" w:hanging="360"/>
+      </w:pPr>
+      <w:rPr>
+        <w:rFonts w:ascii="Courier New" w:hAnsi="Courier New" w:hint="default"/>
+        <w:sz w:val="20"/>
+      </w:rPr>
+    </w:lvl>
+    <w:lvl w:ilvl="2" w:tentative="1">
+      <w:start w:val="1"/>
+      <w:numFmt w:val="bullet"/>
+      <w:lvlText w:val=""/>
+      <w:lvlJc w:val="left"/>
+      <w:pPr>
+        <w:tabs>
+          <w:tab w:val="num" w:pos="2160"/>
+        </w:tabs>
+        <w:ind w:left="2160" w:hanging="360"/>
+      </w:pPr>
+      <w:rPr>
+        <w:rFonts w:ascii="Wingdings" w:hAnsi="Wingdings" w:hint="default"/>
+        <w:sz w:val="20"/>
+      </w:rPr>
+    </w:lvl>
+    <w:lvl w:ilvl="3" w:tentative="1">
+      <w:start w:val="1"/>
+      <w:numFmt w:val="bullet"/>
+      <w:lvlText w:val=""/>
+      <w:lvlJc w:val="left"/>
+      <w:pPr>
+        <w:tabs>
+          <w:tab w:val="num" w:pos="2880"/>
+        </w:tabs>
+        <w:ind w:left="2880" w:hanging="360"/>
+      </w:pPr>
+      <w:rPr>
+        <w:rFonts w:ascii="Wingdings" w:hAnsi="Wingdings" w:hint="default"/>
+        <w:sz w:val="20"/>
+      </w:rPr>
+    </w:lvl>
+    <w:lvl w:ilvl="4" w:tentative="1">
+      <w:start w:val="1"/>
+      <w:numFmt w:val="bullet"/>
+      <w:lvlText w:val=""/>
+      <w:lvlJc w:val="left"/>
+      <w:pPr>
+        <w:tabs>
+          <w:tab w:val="num" w:pos="3600"/>
+        </w:tabs>
+        <w:ind w:left="3600" w:hanging="360"/>
+      </w:pPr>
+      <w:rPr>
+        <w:rFonts w:ascii="Wingdings" w:hAnsi="Wingdings" w:hint="default"/>
+        <w:sz w:val="20"/>
+      </w:rPr>
+    </w:lvl>
+    <w:lvl w:ilvl="5" w:tentative="1">
+      <w:start w:val="1"/>
+      <w:numFmt w:val="bullet"/>
+      <w:lvlText w:val=""/>
+      <w:lvlJc w:val="left"/>
+      <w:pPr>
+        <w:tabs>
+          <w:tab w:val="num" w:pos="4320"/>
+        </w:tabs>
+        <w:ind w:left="4320" w:hanging="360"/>
+      </w:pPr>
+      <w:rPr>
+        <w:rFonts w:ascii="Wingdings" w:hAnsi="Wingdings" w:hint="default"/>
+        <w:sz w:val="20"/>
+      </w:rPr>
+    </w:lvl>
+    <w:lvl w:ilvl="6" w:tentative="1">
+      <w:start w:val="1"/>
+      <w:numFmt w:val="bullet"/>
+      <w:lvlText w:val=""/>
+      <w:lvlJc w:val="left"/>
+      <w:pPr>
+        <w:tabs>
+          <w:tab w:val="num" w:pos="5040"/>
+        </w:tabs>
+        <w:ind w:left="5040" w:hanging="360"/>
+      </w:pPr>
+      <w:rPr>
+        <w:rFonts w:ascii="Wingdings" w:hAnsi="Wingdings" w:hint="default"/>
+        <w:sz w:val="20"/>
+      </w:rPr>
+    </w:lvl>
+    <w:lvl w:ilvl="7" w:tentative="1">
+      <w:start w:val="1"/>
+      <w:numFmt w:val="bullet"/>
+      <w:lvlText w:val=""/>
+      <w:lvlJc w:val="left"/>
+      <w:pPr>
+        <w:tabs>
+          <w:tab w:val="num" w:pos="5760"/>
+        </w:tabs>
+        <w:ind w:left="5760" w:hanging="360"/>
+      </w:pPr>
+      <w:rPr>
+        <w:rFonts w:ascii="Wingdings" w:hAnsi="Wingdings" w:hint="default"/>
+        <w:sz w:val="20"/>
+      </w:rPr>
+    </w:lvl>
+    <w:lvl w:ilvl="8" w:tentative="1">
+      <w:start w:val="1"/>
+      <w:numFmt w:val="bullet"/>
+      <w:lvlText w:val=""/>
+      <w:lvlJc w:val="left"/>
+      <w:pPr>
+        <w:tabs>
+          <w:tab w:val="num" w:pos="6480"/>
+        </w:tabs>
+        <w:ind w:left="6480" w:hanging="360"/>
+      </w:pPr>
+      <w:rPr>
+        <w:rFonts w:ascii="Wingdings" w:hAnsi="Wingdings" w:hint="default"/>
+        <w:sz w:val="20"/>
+      </w:rPr>
+    </w:lvl>
+  </w:abstractNum>
+  <w:abstractNum w:abstractNumId="9" w15:restartNumberingAfterBreak="0">
+    <w:nsid w:val="6E255BE1"/>
+    <w:multiLevelType w:val="multilevel"/>
+    <w:tmpl w:val="427E6AAA"/>
+    <w:lvl w:ilvl="0">
+      <w:start w:val="1"/>
+      <w:numFmt w:val="bullet"/>
+      <w:lvlText w:val=""/>
+      <w:lvlJc w:val="left"/>
+      <w:pPr>
+        <w:tabs>
+          <w:tab w:val="num" w:pos="720"/>
+        </w:tabs>
+        <w:ind w:left="720" w:hanging="360"/>
+      </w:pPr>
+      <w:rPr>
+        <w:rFonts w:ascii="Symbol" w:hAnsi="Symbol" w:hint="default"/>
+        <w:sz w:val="20"/>
+      </w:rPr>
+    </w:lvl>
+    <w:lvl w:ilvl="1" w:tentative="1">
+      <w:start w:val="1"/>
+      <w:numFmt w:val="bullet"/>
+      <w:lvlText w:val="o"/>
+      <w:lvlJc w:val="left"/>
+      <w:pPr>
+        <w:tabs>
+          <w:tab w:val="num" w:pos="1440"/>
+        </w:tabs>
+        <w:ind w:left="1440" w:hanging="360"/>
+      </w:pPr>
+      <w:rPr>
+        <w:rFonts w:ascii="Courier New" w:hAnsi="Courier New" w:hint="default"/>
+        <w:sz w:val="20"/>
+      </w:rPr>
+    </w:lvl>
+    <w:lvl w:ilvl="2" w:tentative="1">
+      <w:start w:val="1"/>
+      <w:numFmt w:val="bullet"/>
+      <w:lvlText w:val=""/>
+      <w:lvlJc w:val="left"/>
+      <w:pPr>
+        <w:tabs>
+          <w:tab w:val="num" w:pos="2160"/>
+        </w:tabs>
+        <w:ind w:left="2160" w:hanging="360"/>
+      </w:pPr>
+      <w:rPr>
+        <w:rFonts w:ascii="Wingdings" w:hAnsi="Wingdings" w:hint="default"/>
+        <w:sz w:val="20"/>
+      </w:rPr>
+    </w:lvl>
+    <w:lvl w:ilvl="3" w:tentative="1">
+      <w:start w:val="1"/>
+      <w:numFmt w:val="bullet"/>
+      <w:lvlText w:val=""/>
+      <w:lvlJc w:val="left"/>
+      <w:pPr>
+        <w:tabs>
+          <w:tab w:val="num" w:pos="2880"/>
+        </w:tabs>
+        <w:ind w:left="2880" w:hanging="360"/>
+      </w:pPr>
+      <w:rPr>
+        <w:rFonts w:ascii="Wingdings" w:hAnsi="Wingdings" w:hint="default"/>
+        <w:sz w:val="20"/>
+      </w:rPr>
+    </w:lvl>
+    <w:lvl w:ilvl="4" w:tentative="1">
+      <w:start w:val="1"/>
+      <w:numFmt w:val="bullet"/>
+      <w:lvlText w:val=""/>
+      <w:lvlJc w:val="left"/>
+      <w:pPr>
+        <w:tabs>
+          <w:tab w:val="num" w:pos="3600"/>
+        </w:tabs>
+        <w:ind w:left="3600" w:hanging="360"/>
+      </w:pPr>
+      <w:rPr>
+        <w:rFonts w:ascii="Wingdings" w:hAnsi="Wingdings" w:hint="default"/>
+        <w:sz w:val="20"/>
+      </w:rPr>
+    </w:lvl>
+    <w:lvl w:ilvl="5" w:tentative="1">
+      <w:start w:val="1"/>
+      <w:numFmt w:val="bullet"/>
+      <w:lvlText w:val=""/>
+      <w:lvlJc w:val="left"/>
+      <w:pPr>
+        <w:tabs>
+          <w:tab w:val="num" w:pos="4320"/>
+        </w:tabs>
+        <w:ind w:left="4320" w:hanging="360"/>
+      </w:pPr>
+      <w:rPr>
+        <w:rFonts w:ascii="Wingdings" w:hAnsi="Wingdings" w:hint="default"/>
+        <w:sz w:val="20"/>
+      </w:rPr>
+    </w:lvl>
+    <w:lvl w:ilvl="6" w:tentative="1">
+      <w:start w:val="1"/>
+      <w:numFmt w:val="bullet"/>
+      <w:lvlText w:val=""/>
+      <w:lvlJc w:val="left"/>
+      <w:pPr>
+        <w:tabs>
+          <w:tab w:val="num" w:pos="5040"/>
+        </w:tabs>
+        <w:ind w:left="5040" w:hanging="360"/>
+      </w:pPr>
+      <w:rPr>
+        <w:rFonts w:ascii="Wingdings" w:hAnsi="Wingdings" w:hint="default"/>
+        <w:sz w:val="20"/>
+      </w:rPr>
+    </w:lvl>
+    <w:lvl w:ilvl="7" w:tentative="1">
+      <w:start w:val="1"/>
+      <w:numFmt w:val="bullet"/>
+      <w:lvlText w:val=""/>
+      <w:lvlJc w:val="left"/>
+      <w:pPr>
+        <w:tabs>
+          <w:tab w:val="num" w:pos="5760"/>
+        </w:tabs>
+        <w:ind w:left="5760" w:hanging="360"/>
+      </w:pPr>
+      <w:rPr>
+        <w:rFonts w:ascii="Wingdings" w:hAnsi="Wingdings" w:hint="default"/>
+        <w:sz w:val="20"/>
+      </w:rPr>
+    </w:lvl>
+    <w:lvl w:ilvl="8" w:tentative="1">
+      <w:start w:val="1"/>
+      <w:numFmt w:val="bullet"/>
+      <w:lvlText w:val=""/>
+      <w:lvlJc w:val="left"/>
+      <w:pPr>
+        <w:tabs>
+          <w:tab w:val="num" w:pos="6480"/>
+        </w:tabs>
+        <w:ind w:left="6480" w:hanging="360"/>
+      </w:pPr>
+      <w:rPr>
+        <w:rFonts w:ascii="Wingdings" w:hAnsi="Wingdings" w:hint="default"/>
+        <w:sz w:val="20"/>
+      </w:rPr>
+    </w:lvl>
+  </w:abstractNum>
+  <w:abstractNum w:abstractNumId="10" w15:restartNumberingAfterBreak="0">
+    <w:nsid w:val="700E2521"/>
+    <w:multiLevelType w:val="multilevel"/>
+    <w:tmpl w:val="546C10E6"/>
+    <w:lvl w:ilvl="0">
+      <w:start w:val="1"/>
+      <w:numFmt w:val="bullet"/>
+      <w:lvlText w:val=""/>
+      <w:lvlJc w:val="left"/>
+      <w:pPr>
+        <w:tabs>
+          <w:tab w:val="num" w:pos="720"/>
+        </w:tabs>
+        <w:ind w:left="720" w:hanging="360"/>
+      </w:pPr>
+      <w:rPr>
+        <w:rFonts w:ascii="Symbol" w:hAnsi="Symbol" w:hint="default"/>
+        <w:sz w:val="20"/>
+      </w:rPr>
+    </w:lvl>
+    <w:lvl w:ilvl="1" w:tentative="1">
+      <w:start w:val="1"/>
+      <w:numFmt w:val="bullet"/>
+      <w:lvlText w:val="o"/>
+      <w:lvlJc w:val="left"/>
+      <w:pPr>
+        <w:tabs>
+          <w:tab w:val="num" w:pos="1440"/>
+        </w:tabs>
+        <w:ind w:left="1440" w:hanging="360"/>
+      </w:pPr>
+      <w:rPr>
+        <w:rFonts w:ascii="Courier New" w:hAnsi="Courier New" w:hint="default"/>
+        <w:sz w:val="20"/>
+      </w:rPr>
+    </w:lvl>
+    <w:lvl w:ilvl="2" w:tentative="1">
+      <w:start w:val="1"/>
+      <w:numFmt w:val="bullet"/>
+      <w:lvlText w:val=""/>
+      <w:lvlJc w:val="left"/>
+      <w:pPr>
+        <w:tabs>
+          <w:tab w:val="num" w:pos="2160"/>
+        </w:tabs>
+        <w:ind w:left="2160" w:hanging="360"/>
+      </w:pPr>
+      <w:rPr>
+        <w:rFonts w:ascii="Wingdings" w:hAnsi="Wingdings" w:hint="default"/>
+        <w:sz w:val="20"/>
+      </w:rPr>
+    </w:lvl>
+    <w:lvl w:ilvl="3" w:tentative="1">
+      <w:start w:val="1"/>
+      <w:numFmt w:val="bullet"/>
+      <w:lvlText w:val=""/>
+      <w:lvlJc w:val="left"/>
+      <w:pPr>
+        <w:tabs>
+          <w:tab w:val="num" w:pos="2880"/>
+        </w:tabs>
+        <w:ind w:left="2880" w:hanging="360"/>
+      </w:pPr>
+      <w:rPr>
+        <w:rFonts w:ascii="Wingdings" w:hAnsi="Wingdings" w:hint="default"/>
+        <w:sz w:val="20"/>
+      </w:rPr>
+    </w:lvl>
+    <w:lvl w:ilvl="4" w:tentative="1">
+      <w:start w:val="1"/>
+      <w:numFmt w:val="bullet"/>
+      <w:lvlText w:val=""/>
+      <w:lvlJc w:val="left"/>
+      <w:pPr>
+        <w:tabs>
+          <w:tab w:val="num" w:pos="3600"/>
+        </w:tabs>
+        <w:ind w:left="3600" w:hanging="360"/>
+      </w:pPr>
+      <w:rPr>
+        <w:rFonts w:ascii="Wingdings" w:hAnsi="Wingdings" w:hint="default"/>
+        <w:sz w:val="20"/>
+      </w:rPr>
+    </w:lvl>
+    <w:lvl w:ilvl="5" w:tentative="1">
+      <w:start w:val="1"/>
+      <w:numFmt w:val="bullet"/>
+      <w:lvlText w:val=""/>
+      <w:lvlJc w:val="left"/>
+      <w:pPr>
+        <w:tabs>
+          <w:tab w:val="num" w:pos="4320"/>
+        </w:tabs>
+        <w:ind w:left="4320" w:hanging="360"/>
+      </w:pPr>
+      <w:rPr>
+        <w:rFonts w:ascii="Wingdings" w:hAnsi="Wingdings" w:hint="default"/>
+        <w:sz w:val="20"/>
+      </w:rPr>
+    </w:lvl>
+    <w:lvl w:ilvl="6" w:tentative="1">
+      <w:start w:val="1"/>
+      <w:numFmt w:val="bullet"/>
+      <w:lvlText w:val=""/>
+      <w:lvlJc w:val="left"/>
+      <w:pPr>
+        <w:tabs>
+          <w:tab w:val="num" w:pos="5040"/>
+        </w:tabs>
+        <w:ind w:left="5040" w:hanging="360"/>
+      </w:pPr>
+      <w:rPr>
+        <w:rFonts w:ascii="Wingdings" w:hAnsi="Wingdings" w:hint="default"/>
+        <w:sz w:val="20"/>
+      </w:rPr>
+    </w:lvl>
+    <w:lvl w:ilvl="7" w:tentative="1">
+      <w:start w:val="1"/>
+      <w:numFmt w:val="bullet"/>
+      <w:lvlText w:val=""/>
+      <w:lvlJc w:val="left"/>
+      <w:pPr>
+        <w:tabs>
+          <w:tab w:val="num" w:pos="5760"/>
+        </w:tabs>
+        <w:ind w:left="5760" w:hanging="360"/>
+      </w:pPr>
+      <w:rPr>
+        <w:rFonts w:ascii="Wingdings" w:hAnsi="Wingdings" w:hint="default"/>
+        <w:sz w:val="20"/>
+      </w:rPr>
+    </w:lvl>
+    <w:lvl w:ilvl="8" w:tentative="1">
+      <w:start w:val="1"/>
+      <w:numFmt w:val="bullet"/>
+      <w:lvlText w:val=""/>
+      <w:lvlJc w:val="left"/>
+      <w:pPr>
+        <w:tabs>
+          <w:tab w:val="num" w:pos="6480"/>
+        </w:tabs>
+        <w:ind w:left="6480" w:hanging="360"/>
+      </w:pPr>
+      <w:rPr>
+        <w:rFonts w:ascii="Wingdings" w:hAnsi="Wingdings" w:hint="default"/>
+        <w:sz w:val="20"/>
+      </w:rPr>
+    </w:lvl>
+  </w:abstractNum>
+  <w:abstractNum w:abstractNumId="11" w15:restartNumberingAfterBreak="0">
+    <w:nsid w:val="721F6D51"/>
+    <w:multiLevelType w:val="multilevel"/>
+    <w:tmpl w:val="217AAE64"/>
+    <w:lvl w:ilvl="0">
+      <w:start w:val="1"/>
+      <w:numFmt w:val="bullet"/>
+      <w:lvlText w:val=""/>
+      <w:lvlJc w:val="left"/>
+      <w:pPr>
+        <w:tabs>
+          <w:tab w:val="num" w:pos="720"/>
+        </w:tabs>
+        <w:ind w:left="720" w:hanging="360"/>
+      </w:pPr>
+      <w:rPr>
+        <w:rFonts w:ascii="Symbol" w:hAnsi="Symbol" w:hint="default"/>
+        <w:sz w:val="20"/>
+      </w:rPr>
+    </w:lvl>
+    <w:lvl w:ilvl="1" w:tentative="1">
+      <w:start w:val="1"/>
+      <w:numFmt w:val="bullet"/>
+      <w:lvlText w:val="o"/>
+      <w:lvlJc w:val="left"/>
+      <w:pPr>
+        <w:tabs>
+          <w:tab w:val="num" w:pos="1440"/>
+        </w:tabs>
+        <w:ind w:left="1440" w:hanging="360"/>
+      </w:pPr>
+      <w:rPr>
+        <w:rFonts w:ascii="Courier New" w:hAnsi="Courier New" w:hint="default"/>
+        <w:sz w:val="20"/>
+      </w:rPr>
+    </w:lvl>
+    <w:lvl w:ilvl="2" w:tentative="1">
+      <w:start w:val="1"/>
+      <w:numFmt w:val="bullet"/>
+      <w:lvlText w:val=""/>
+      <w:lvlJc w:val="left"/>
+      <w:pPr>
+        <w:tabs>
+          <w:tab w:val="num" w:pos="2160"/>
+        </w:tabs>
+        <w:ind w:left="2160" w:hanging="360"/>
+      </w:pPr>
+      <w:rPr>
+        <w:rFonts w:ascii="Wingdings" w:hAnsi="Wingdings" w:hint="default"/>
+        <w:sz w:val="20"/>
+      </w:rPr>
+    </w:lvl>
+    <w:lvl w:ilvl="3" w:tentative="1">
+      <w:start w:val="1"/>
+      <w:numFmt w:val="bullet"/>
+      <w:lvlText w:val=""/>
+      <w:lvlJc w:val="left"/>
+      <w:pPr>
+        <w:tabs>
+          <w:tab w:val="num" w:pos="2880"/>
+        </w:tabs>
+        <w:ind w:left="2880" w:hanging="360"/>
+      </w:pPr>
+      <w:rPr>
+        <w:rFonts w:ascii="Wingdings" w:hAnsi="Wingdings" w:hint="default"/>
+        <w:sz w:val="20"/>
+      </w:rPr>
+    </w:lvl>
+    <w:lvl w:ilvl="4" w:tentative="1">
+      <w:start w:val="1"/>
+      <w:numFmt w:val="bullet"/>
+      <w:lvlText w:val=""/>
+      <w:lvlJc w:val="left"/>
+      <w:pPr>
+        <w:tabs>
+          <w:tab w:val="num" w:pos="3600"/>
+        </w:tabs>
+        <w:ind w:left="3600" w:hanging="360"/>
+      </w:pPr>
+      <w:rPr>
+        <w:rFonts w:ascii="Wingdings" w:hAnsi="Wingdings" w:hint="default"/>
+        <w:sz w:val="20"/>
+      </w:rPr>
+    </w:lvl>
+    <w:lvl w:ilvl="5" w:tentative="1">
+      <w:start w:val="1"/>
+      <w:numFmt w:val="bullet"/>
+      <w:lvlText w:val=""/>
+      <w:lvlJc w:val="left"/>
+      <w:pPr>
+        <w:tabs>
+          <w:tab w:val="num" w:pos="4320"/>
+        </w:tabs>
+        <w:ind w:left="4320" w:hanging="360"/>
+      </w:pPr>
+      <w:rPr>
+        <w:rFonts w:ascii="Wingdings" w:hAnsi="Wingdings" w:hint="default"/>
+        <w:sz w:val="20"/>
+      </w:rPr>
+    </w:lvl>
+    <w:lvl w:ilvl="6" w:tentative="1">
+      <w:start w:val="1"/>
+      <w:numFmt w:val="bullet"/>
+      <w:lvlText w:val=""/>
+      <w:lvlJc w:val="left"/>
+      <w:pPr>
+        <w:tabs>
+          <w:tab w:val="num" w:pos="5040"/>
+        </w:tabs>
+        <w:ind w:left="5040" w:hanging="360"/>
+      </w:pPr>
+      <w:rPr>
+        <w:rFonts w:ascii="Wingdings" w:hAnsi="Wingdings" w:hint="default"/>
+        <w:sz w:val="20"/>
+      </w:rPr>
+    </w:lvl>
+    <w:lvl w:ilvl="7" w:tentative="1">
+      <w:start w:val="1"/>
+      <w:numFmt w:val="bullet"/>
+      <w:lvlText w:val=""/>
+      <w:lvlJc w:val="left"/>
+      <w:pPr>
+        <w:tabs>
+          <w:tab w:val="num" w:pos="5760"/>
+        </w:tabs>
+        <w:ind w:left="5760" w:hanging="360"/>
+      </w:pPr>
+      <w:rPr>
+        <w:rFonts w:ascii="Wingdings" w:hAnsi="Wingdings" w:hint="default"/>
+        <w:sz w:val="20"/>
+      </w:rPr>
+    </w:lvl>
+    <w:lvl w:ilvl="8" w:tentative="1">
+      <w:start w:val="1"/>
+      <w:numFmt w:val="bullet"/>
+      <w:lvlText w:val=""/>
+      <w:lvlJc w:val="left"/>
+      <w:pPr>
+        <w:tabs>
+          <w:tab w:val="num" w:pos="6480"/>
+        </w:tabs>
+        <w:ind w:left="6480" w:hanging="360"/>
+      </w:pPr>
+      <w:rPr>
+        <w:rFonts w:ascii="Wingdings" w:hAnsi="Wingdings" w:hint="default"/>
+        <w:sz w:val="20"/>
+      </w:rPr>
+    </w:lvl>
+  </w:abstractNum>
+  <w:abstractNum w:abstractNumId="12" w15:restartNumberingAfterBreak="0">
+    <w:nsid w:val="76B55DC9"/>
+    <w:multiLevelType w:val="multilevel"/>
+    <w:tmpl w:val="824867DE"/>
+    <w:lvl w:ilvl="0">
+      <w:start w:val="1"/>
+      <w:numFmt w:val="bullet"/>
+      <w:lvlText w:val=""/>
+      <w:lvlJc w:val="left"/>
+      <w:pPr>
+        <w:tabs>
+          <w:tab w:val="num" w:pos="720"/>
+        </w:tabs>
+        <w:ind w:left="720" w:hanging="360"/>
+      </w:pPr>
+      <w:rPr>
+        <w:rFonts w:ascii="Symbol" w:hAnsi="Symbol" w:hint="default"/>
+        <w:sz w:val="20"/>
+      </w:rPr>
+    </w:lvl>
+    <w:lvl w:ilvl="1" w:tentative="1">
+      <w:start w:val="1"/>
+      <w:numFmt w:val="bullet"/>
+      <w:lvlText w:val="o"/>
+      <w:lvlJc w:val="left"/>
+      <w:pPr>
+        <w:tabs>
+          <w:tab w:val="num" w:pos="1440"/>
+        </w:tabs>
+        <w:ind w:left="1440" w:hanging="360"/>
+      </w:pPr>
+      <w:rPr>
+        <w:rFonts w:ascii="Courier New" w:hAnsi="Courier New" w:hint="default"/>
+        <w:sz w:val="20"/>
+      </w:rPr>
+    </w:lvl>
+    <w:lvl w:ilvl="2" w:tentative="1">
+      <w:start w:val="1"/>
+      <w:numFmt w:val="bullet"/>
+      <w:lvlText w:val=""/>
+      <w:lvlJc w:val="left"/>
+      <w:pPr>
+        <w:tabs>
+          <w:tab w:val="num" w:pos="2160"/>
+        </w:tabs>
+        <w:ind w:left="2160" w:hanging="360"/>
+      </w:pPr>
+      <w:rPr>
+        <w:rFonts w:ascii="Wingdings" w:hAnsi="Wingdings" w:hint="default"/>
+        <w:sz w:val="20"/>
+      </w:rPr>
+    </w:lvl>
+    <w:lvl w:ilvl="3" w:tentative="1">
+      <w:start w:val="1"/>
+      <w:numFmt w:val="bullet"/>
+      <w:lvlText w:val=""/>
+      <w:lvlJc w:val="left"/>
+      <w:pPr>
+        <w:tabs>
+          <w:tab w:val="num" w:pos="2880"/>
+        </w:tabs>
+        <w:ind w:left="2880" w:hanging="360"/>
+      </w:pPr>
+      <w:rPr>
+        <w:rFonts w:ascii="Wingdings" w:hAnsi="Wingdings" w:hint="default"/>
+        <w:sz w:val="20"/>
+      </w:rPr>
+    </w:lvl>
+    <w:lvl w:ilvl="4" w:tentative="1">
+      <w:start w:val="1"/>
+      <w:numFmt w:val="bullet"/>
+      <w:lvlText w:val=""/>
+      <w:lvlJc w:val="left"/>
+      <w:pPr>
+        <w:tabs>
+          <w:tab w:val="num" w:pos="3600"/>
+        </w:tabs>
+        <w:ind w:left="3600" w:hanging="360"/>
+      </w:pPr>
+      <w:rPr>
+        <w:rFonts w:ascii="Wingdings" w:hAnsi="Wingdings" w:hint="default"/>
+        <w:sz w:val="20"/>
+      </w:rPr>
+    </w:lvl>
+    <w:lvl w:ilvl="5" w:tentative="1">
+      <w:start w:val="1"/>
+      <w:numFmt w:val="bullet"/>
+      <w:lvlText w:val=""/>
+      <w:lvlJc w:val="left"/>
+      <w:pPr>
+        <w:tabs>
+          <w:tab w:val="num" w:pos="4320"/>
+        </w:tabs>
+        <w:ind w:left="4320" w:hanging="360"/>
+      </w:pPr>
+      <w:rPr>
+        <w:rFonts w:ascii="Wingdings" w:hAnsi="Wingdings" w:hint="default"/>
+        <w:sz w:val="20"/>
+      </w:rPr>
+    </w:lvl>
+    <w:lvl w:ilvl="6" w:tentative="1">
+      <w:start w:val="1"/>
+      <w:numFmt w:val="bullet"/>
+      <w:lvlText w:val=""/>
+      <w:lvlJc w:val="left"/>
+      <w:pPr>
+        <w:tabs>
+          <w:tab w:val="num" w:pos="5040"/>
+        </w:tabs>
+        <w:ind w:left="5040" w:hanging="360"/>
+      </w:pPr>
+      <w:rPr>
+        <w:rFonts w:ascii="Wingdings" w:hAnsi="Wingdings" w:hint="default"/>
+        <w:sz w:val="20"/>
+      </w:rPr>
+    </w:lvl>
+    <w:lvl w:ilvl="7" w:tentative="1">
+      <w:start w:val="1"/>
+      <w:numFmt w:val="bullet"/>
+      <w:lvlText w:val=""/>
+      <w:lvlJc w:val="left"/>
+      <w:pPr>
+        <w:tabs>
+          <w:tab w:val="num" w:pos="5760"/>
+        </w:tabs>
+        <w:ind w:left="5760" w:hanging="360"/>
+      </w:pPr>
+      <w:rPr>
+        <w:rFonts w:ascii="Wingdings" w:hAnsi="Wingdings" w:hint="default"/>
+        <w:sz w:val="20"/>
+      </w:rPr>
+    </w:lvl>
+    <w:lvl w:ilvl="8" w:tentative="1">
+      <w:start w:val="1"/>
+      <w:numFmt w:val="bullet"/>
+      <w:lvlText w:val=""/>
+      <w:lvlJc w:val="left"/>
+      <w:pPr>
+        <w:tabs>
+          <w:tab w:val="num" w:pos="6480"/>
+        </w:tabs>
+        <w:ind w:left="6480" w:hanging="360"/>
+      </w:pPr>
+      <w:rPr>
+        <w:rFonts w:ascii="Wingdings" w:hAnsi="Wingdings" w:hint="default"/>
+        <w:sz w:val="20"/>
+      </w:rPr>
+    </w:lvl>
+  </w:abstractNum>
+  <w:abstractNum w:abstractNumId="13" w15:restartNumberingAfterBreak="0">
     <w:nsid w:val="76CB227B"/>
     <w:multiLevelType w:val="multilevel"/>
     <w:tmpl w:val="F76A5758"/>
@@ -2352,7 +5527,7 @@
       </w:rPr>
     </w:lvl>
   </w:abstractNum>
-  <w:abstractNum w:abstractNumId="5" w15:restartNumberingAfterBreak="0">
+  <w:abstractNum w:abstractNumId="14" w15:restartNumberingAfterBreak="0">
     <w:nsid w:val="7CC849D3"/>
     <w:multiLevelType w:val="multilevel"/>
     <w:tmpl w:val="EAF4560C"/>
@@ -2501,7 +5676,7 @@
       </w:rPr>
     </w:lvl>
   </w:abstractNum>
-  <w:abstractNum w:abstractNumId="6" w15:restartNumberingAfterBreak="0">
+  <w:abstractNum w:abstractNumId="15" w15:restartNumberingAfterBreak="0">
     <w:nsid w:val="7D5212FC"/>
     <w:multiLevelType w:val="multilevel"/>
     <w:tmpl w:val="19309B44"/>
@@ -2650,25 +5825,204 @@
       </w:rPr>
     </w:lvl>
   </w:abstractNum>
+  <w:abstractNum w:abstractNumId="16" w15:restartNumberingAfterBreak="0">
+    <w:nsid w:val="7E9440B2"/>
+    <w:multiLevelType w:val="multilevel"/>
+    <w:tmpl w:val="4D38E8EA"/>
+    <w:lvl w:ilvl="0">
+      <w:start w:val="1"/>
+      <w:numFmt w:val="bullet"/>
+      <w:lvlText w:val=""/>
+      <w:lvlJc w:val="left"/>
+      <w:pPr>
+        <w:tabs>
+          <w:tab w:val="num" w:pos="720"/>
+        </w:tabs>
+        <w:ind w:left="720" w:hanging="360"/>
+      </w:pPr>
+      <w:rPr>
+        <w:rFonts w:ascii="Symbol" w:hAnsi="Symbol" w:hint="default"/>
+        <w:sz w:val="20"/>
+      </w:rPr>
+    </w:lvl>
+    <w:lvl w:ilvl="1" w:tentative="1">
+      <w:start w:val="1"/>
+      <w:numFmt w:val="bullet"/>
+      <w:lvlText w:val="o"/>
+      <w:lvlJc w:val="left"/>
+      <w:pPr>
+        <w:tabs>
+          <w:tab w:val="num" w:pos="1440"/>
+        </w:tabs>
+        <w:ind w:left="1440" w:hanging="360"/>
+      </w:pPr>
+      <w:rPr>
+        <w:rFonts w:ascii="Courier New" w:hAnsi="Courier New" w:hint="default"/>
+        <w:sz w:val="20"/>
+      </w:rPr>
+    </w:lvl>
+    <w:lvl w:ilvl="2" w:tentative="1">
+      <w:start w:val="1"/>
+      <w:numFmt w:val="bullet"/>
+      <w:lvlText w:val=""/>
+      <w:lvlJc w:val="left"/>
+      <w:pPr>
+        <w:tabs>
+          <w:tab w:val="num" w:pos="2160"/>
+        </w:tabs>
+        <w:ind w:left="2160" w:hanging="360"/>
+      </w:pPr>
+      <w:rPr>
+        <w:rFonts w:ascii="Wingdings" w:hAnsi="Wingdings" w:hint="default"/>
+        <w:sz w:val="20"/>
+      </w:rPr>
+    </w:lvl>
+    <w:lvl w:ilvl="3" w:tentative="1">
+      <w:start w:val="1"/>
+      <w:numFmt w:val="bullet"/>
+      <w:lvlText w:val=""/>
+      <w:lvlJc w:val="left"/>
+      <w:pPr>
+        <w:tabs>
+          <w:tab w:val="num" w:pos="2880"/>
+        </w:tabs>
+        <w:ind w:left="2880" w:hanging="360"/>
+      </w:pPr>
+      <w:rPr>
+        <w:rFonts w:ascii="Wingdings" w:hAnsi="Wingdings" w:hint="default"/>
+        <w:sz w:val="20"/>
+      </w:rPr>
+    </w:lvl>
+    <w:lvl w:ilvl="4" w:tentative="1">
+      <w:start w:val="1"/>
+      <w:numFmt w:val="bullet"/>
+      <w:lvlText w:val=""/>
+      <w:lvlJc w:val="left"/>
+      <w:pPr>
+        <w:tabs>
+          <w:tab w:val="num" w:pos="3600"/>
+        </w:tabs>
+        <w:ind w:left="3600" w:hanging="360"/>
+      </w:pPr>
+      <w:rPr>
+        <w:rFonts w:ascii="Wingdings" w:hAnsi="Wingdings" w:hint="default"/>
+        <w:sz w:val="20"/>
+      </w:rPr>
+    </w:lvl>
+    <w:lvl w:ilvl="5" w:tentative="1">
+      <w:start w:val="1"/>
+      <w:numFmt w:val="bullet"/>
+      <w:lvlText w:val=""/>
+      <w:lvlJc w:val="left"/>
+      <w:pPr>
+        <w:tabs>
+          <w:tab w:val="num" w:pos="4320"/>
+        </w:tabs>
+        <w:ind w:left="4320" w:hanging="360"/>
+      </w:pPr>
+      <w:rPr>
+        <w:rFonts w:ascii="Wingdings" w:hAnsi="Wingdings" w:hint="default"/>
+        <w:sz w:val="20"/>
+      </w:rPr>
+    </w:lvl>
+    <w:lvl w:ilvl="6" w:tentative="1">
+      <w:start w:val="1"/>
+      <w:numFmt w:val="bullet"/>
+      <w:lvlText w:val=""/>
+      <w:lvlJc w:val="left"/>
+      <w:pPr>
+        <w:tabs>
+          <w:tab w:val="num" w:pos="5040"/>
+        </w:tabs>
+        <w:ind w:left="5040" w:hanging="360"/>
+      </w:pPr>
+      <w:rPr>
+        <w:rFonts w:ascii="Wingdings" w:hAnsi="Wingdings" w:hint="default"/>
+        <w:sz w:val="20"/>
+      </w:rPr>
+    </w:lvl>
+    <w:lvl w:ilvl="7" w:tentative="1">
+      <w:start w:val="1"/>
+      <w:numFmt w:val="bullet"/>
+      <w:lvlText w:val=""/>
+      <w:lvlJc w:val="left"/>
+      <w:pPr>
+        <w:tabs>
+          <w:tab w:val="num" w:pos="5760"/>
+        </w:tabs>
+        <w:ind w:left="5760" w:hanging="360"/>
+      </w:pPr>
+      <w:rPr>
+        <w:rFonts w:ascii="Wingdings" w:hAnsi="Wingdings" w:hint="default"/>
+        <w:sz w:val="20"/>
+      </w:rPr>
+    </w:lvl>
+    <w:lvl w:ilvl="8" w:tentative="1">
+      <w:start w:val="1"/>
+      <w:numFmt w:val="bullet"/>
+      <w:lvlText w:val=""/>
+      <w:lvlJc w:val="left"/>
+      <w:pPr>
+        <w:tabs>
+          <w:tab w:val="num" w:pos="6480"/>
+        </w:tabs>
+        <w:ind w:left="6480" w:hanging="360"/>
+      </w:pPr>
+      <w:rPr>
+        <w:rFonts w:ascii="Wingdings" w:hAnsi="Wingdings" w:hint="default"/>
+        <w:sz w:val="20"/>
+      </w:rPr>
+    </w:lvl>
+  </w:abstractNum>
   <w:num w:numId="1" w16cid:durableId="15232921">
-    <w:abstractNumId w:val="3"/>
+    <w:abstractNumId w:val="7"/>
   </w:num>
   <w:num w:numId="2" w16cid:durableId="1927110544">
-    <w:abstractNumId w:val="6"/>
+    <w:abstractNumId w:val="15"/>
   </w:num>
   <w:num w:numId="3" w16cid:durableId="694766108">
     <w:abstractNumId w:val="0"/>
   </w:num>
   <w:num w:numId="4" w16cid:durableId="1440679398">
+    <w:abstractNumId w:val="6"/>
+  </w:num>
+  <w:num w:numId="5" w16cid:durableId="1202130627">
+    <w:abstractNumId w:val="14"/>
+  </w:num>
+  <w:num w:numId="6" w16cid:durableId="469830383">
+    <w:abstractNumId w:val="13"/>
+  </w:num>
+  <w:num w:numId="7" w16cid:durableId="402874078">
     <w:abstractNumId w:val="2"/>
   </w:num>
-  <w:num w:numId="5" w16cid:durableId="1202130627">
+  <w:num w:numId="8" w16cid:durableId="115225395">
+    <w:abstractNumId w:val="12"/>
+  </w:num>
+  <w:num w:numId="9" w16cid:durableId="946930684">
+    <w:abstractNumId w:val="9"/>
+  </w:num>
+  <w:num w:numId="10" w16cid:durableId="206993211">
+    <w:abstractNumId w:val="16"/>
+  </w:num>
+  <w:num w:numId="11" w16cid:durableId="1483812359">
+    <w:abstractNumId w:val="10"/>
+  </w:num>
+  <w:num w:numId="12" w16cid:durableId="1906376806">
+    <w:abstractNumId w:val="11"/>
+  </w:num>
+  <w:num w:numId="13" w16cid:durableId="2131974877">
     <w:abstractNumId w:val="5"/>
   </w:num>
-  <w:num w:numId="6" w16cid:durableId="469830383">
+  <w:num w:numId="14" w16cid:durableId="887571345">
     <w:abstractNumId w:val="4"/>
   </w:num>
-  <w:num w:numId="7" w16cid:durableId="402874078">
+  <w:num w:numId="15" w16cid:durableId="799957605">
+    <w:abstractNumId w:val="8"/>
+  </w:num>
+  <w:num w:numId="16" w16cid:durableId="501507240">
+    <w:abstractNumId w:val="3"/>
+  </w:num>
+  <w:num w:numId="17" w16cid:durableId="1323314684">
     <w:abstractNumId w:val="1"/>
   </w:num>
 </w:numbering>
@@ -3678,6 +7032,25 @@
       <w:shd w:val="clear" w:color="auto" w:fill="E1DFDD"/>
     </w:rPr>
   </w:style>
+  <w:style w:type="table" w:styleId="TableGrid">
+    <w:name w:val="Table Grid"/>
+    <w:basedOn w:val="TableNormal"/>
+    <w:uiPriority w:val="39"/>
+    <w:rsid w:val="00E9094E"/>
+    <w:pPr>
+      <w:spacing w:after="0" w:line="240" w:lineRule="auto"/>
+    </w:pPr>
+    <w:tblPr>
+      <w:tblBorders>
+        <w:top w:val="single" w:sz="4" w:space="0" w:color="auto"/>
+        <w:left w:val="single" w:sz="4" w:space="0" w:color="auto"/>
+        <w:bottom w:val="single" w:sz="4" w:space="0" w:color="auto"/>
+        <w:right w:val="single" w:sz="4" w:space="0" w:color="auto"/>
+        <w:insideH w:val="single" w:sz="4" w:space="0" w:color="auto"/>
+        <w:insideV w:val="single" w:sz="4" w:space="0" w:color="auto"/>
+      </w:tblBorders>
+    </w:tblPr>
+  </w:style>
 </w:styles>
 </file>
 

</xml_diff>

<commit_message>
GitHub Link Added to Word Document
</commit_message>
<xml_diff>
--- a/ST10493664 INSY6211 A1.docx
+++ b/ST10493664 INSY6211 A1.docx
@@ -744,7 +744,18 @@
               <w:tab w:val="right" w:leader="dot" w:pos="9016"/>
             </w:tabs>
             <w:rPr>
-              <w:rFonts w:ascii="Arial" w:eastAsiaTheme="minorEastAsia" w:hAnsi="Arial" w:cs="Arial"/>
+              <w:rFonts w:ascii="Arial" w:hAnsi="Arial" w:cs="Arial"/>
+            </w:rPr>
+          </w:pPr>
+        </w:p>
+        <w:p>
+          <w:pPr>
+            <w:pStyle w:val="TOC1"/>
+            <w:tabs>
+              <w:tab w:val="right" w:leader="dot" w:pos="9016"/>
+            </w:tabs>
+            <w:rPr>
+              <w:rFonts w:asciiTheme="minorHAnsi" w:eastAsiaTheme="minorEastAsia" w:hAnsiTheme="minorHAnsi"/>
               <w:noProof/>
               <w:sz w:val="24"/>
               <w:lang w:eastAsia="en-ZA"/>
@@ -768,18 +779,17 @@
             </w:rPr>
             <w:fldChar w:fldCharType="separate"/>
           </w:r>
-          <w:hyperlink w:anchor="_Toc225082624" w:history="1">
+          <w:hyperlink w:anchor="_Toc225083440" w:history="1">
             <w:r>
               <w:rPr>
                 <w:rStyle w:val="Hyperlink"/>
                 <w:rFonts w:ascii="Arial" w:hAnsi="Arial" w:cs="Arial"/>
                 <w:noProof/>
               </w:rPr>
-              <w:t>Question 1 – ACRMS Report</w:t>
-            </w:r>
-            <w:r>
-              <w:rPr>
-                <w:rFonts w:ascii="Arial" w:hAnsi="Arial" w:cs="Arial"/>
+              <w:t>Project Access</w:t>
+            </w:r>
+            <w:r>
+              <w:rPr>
                 <w:noProof/>
                 <w:webHidden/>
               </w:rPr>
@@ -787,7 +797,6 @@
             </w:r>
             <w:r>
               <w:rPr>
-                <w:rFonts w:ascii="Arial" w:hAnsi="Arial" w:cs="Arial"/>
                 <w:noProof/>
                 <w:webHidden/>
               </w:rPr>
@@ -795,22 +804,19 @@
             </w:r>
             <w:r>
               <w:rPr>
-                <w:rFonts w:ascii="Arial" w:hAnsi="Arial" w:cs="Arial"/>
                 <w:noProof/>
                 <w:webHidden/>
               </w:rPr>
-              <w:instrText xml:space="preserve"> PAGEREF _Toc225082624 \h </w:instrText>
-            </w:r>
-            <w:r>
-              <w:rPr>
-                <w:rFonts w:ascii="Arial" w:hAnsi="Arial" w:cs="Arial"/>
+              <w:instrText xml:space="preserve"> PAGEREF _Toc225083440 \h </w:instrText>
+            </w:r>
+            <w:r>
+              <w:rPr>
                 <w:noProof/>
                 <w:webHidden/>
               </w:rPr>
             </w:r>
             <w:r>
               <w:rPr>
-                <w:rFonts w:ascii="Arial" w:hAnsi="Arial" w:cs="Arial"/>
                 <w:noProof/>
                 <w:webHidden/>
               </w:rPr>
@@ -818,7 +824,6 @@
             </w:r>
             <w:r>
               <w:rPr>
-                <w:rFonts w:ascii="Arial" w:hAnsi="Arial" w:cs="Arial"/>
                 <w:noProof/>
                 <w:webHidden/>
               </w:rPr>
@@ -826,7 +831,6 @@
             </w:r>
             <w:r>
               <w:rPr>
-                <w:rFonts w:ascii="Arial" w:hAnsi="Arial" w:cs="Arial"/>
                 <w:noProof/>
                 <w:webHidden/>
               </w:rPr>
@@ -841,24 +845,23 @@
               <w:tab w:val="right" w:leader="dot" w:pos="9016"/>
             </w:tabs>
             <w:rPr>
-              <w:rFonts w:ascii="Arial" w:eastAsiaTheme="minorEastAsia" w:hAnsi="Arial" w:cs="Arial"/>
+              <w:rFonts w:asciiTheme="minorHAnsi" w:eastAsiaTheme="minorEastAsia" w:hAnsiTheme="minorHAnsi"/>
               <w:noProof/>
               <w:sz w:val="24"/>
               <w:lang w:eastAsia="en-ZA"/>
             </w:rPr>
           </w:pPr>
-          <w:hyperlink w:anchor="_Toc225082625" w:history="1">
+          <w:hyperlink w:anchor="_Toc225083441" w:history="1">
             <w:r>
               <w:rPr>
                 <w:rStyle w:val="Hyperlink"/>
                 <w:rFonts w:ascii="Arial" w:hAnsi="Arial" w:cs="Arial"/>
                 <w:noProof/>
               </w:rPr>
-              <w:t>Question 2 – Potential Stakeholders</w:t>
-            </w:r>
-            <w:r>
-              <w:rPr>
-                <w:rFonts w:ascii="Arial" w:hAnsi="Arial" w:cs="Arial"/>
+              <w:t>Question 1 – ACRMS Report</w:t>
+            </w:r>
+            <w:r>
+              <w:rPr>
                 <w:noProof/>
                 <w:webHidden/>
               </w:rPr>
@@ -866,7 +869,6 @@
             </w:r>
             <w:r>
               <w:rPr>
-                <w:rFonts w:ascii="Arial" w:hAnsi="Arial" w:cs="Arial"/>
                 <w:noProof/>
                 <w:webHidden/>
               </w:rPr>
@@ -874,22 +876,19 @@
             </w:r>
             <w:r>
               <w:rPr>
-                <w:rFonts w:ascii="Arial" w:hAnsi="Arial" w:cs="Arial"/>
                 <w:noProof/>
                 <w:webHidden/>
               </w:rPr>
-              <w:instrText xml:space="preserve"> PAGEREF _Toc225082625 \h </w:instrText>
-            </w:r>
-            <w:r>
-              <w:rPr>
-                <w:rFonts w:ascii="Arial" w:hAnsi="Arial" w:cs="Arial"/>
+              <w:instrText xml:space="preserve"> PAGEREF _Toc225083441 \h </w:instrText>
+            </w:r>
+            <w:r>
+              <w:rPr>
                 <w:noProof/>
                 <w:webHidden/>
               </w:rPr>
             </w:r>
             <w:r>
               <w:rPr>
-                <w:rFonts w:ascii="Arial" w:hAnsi="Arial" w:cs="Arial"/>
                 <w:noProof/>
                 <w:webHidden/>
               </w:rPr>
@@ -897,15 +896,13 @@
             </w:r>
             <w:r>
               <w:rPr>
-                <w:rFonts w:ascii="Arial" w:hAnsi="Arial" w:cs="Arial"/>
                 <w:noProof/>
                 <w:webHidden/>
               </w:rPr>
-              <w:t>5</w:t>
-            </w:r>
-            <w:r>
-              <w:rPr>
-                <w:rFonts w:ascii="Arial" w:hAnsi="Arial" w:cs="Arial"/>
+              <w:t>3</w:t>
+            </w:r>
+            <w:r>
+              <w:rPr>
                 <w:noProof/>
                 <w:webHidden/>
               </w:rPr>
@@ -920,24 +917,23 @@
               <w:tab w:val="right" w:leader="dot" w:pos="9016"/>
             </w:tabs>
             <w:rPr>
-              <w:rFonts w:ascii="Arial" w:eastAsiaTheme="minorEastAsia" w:hAnsi="Arial" w:cs="Arial"/>
+              <w:rFonts w:asciiTheme="minorHAnsi" w:eastAsiaTheme="minorEastAsia" w:hAnsiTheme="minorHAnsi"/>
               <w:noProof/>
               <w:sz w:val="24"/>
               <w:lang w:eastAsia="en-ZA"/>
             </w:rPr>
           </w:pPr>
-          <w:hyperlink w:anchor="_Toc225082626" w:history="1">
+          <w:hyperlink w:anchor="_Toc225083442" w:history="1">
             <w:r>
               <w:rPr>
                 <w:rStyle w:val="Hyperlink"/>
                 <w:rFonts w:ascii="Arial" w:hAnsi="Arial" w:cs="Arial"/>
                 <w:noProof/>
               </w:rPr>
-              <w:t>Question 3 – Decomposition Technique and Use Case Description</w:t>
-            </w:r>
-            <w:r>
-              <w:rPr>
-                <w:rFonts w:ascii="Arial" w:hAnsi="Arial" w:cs="Arial"/>
+              <w:t>Question 2 – Potential Stakeholders</w:t>
+            </w:r>
+            <w:r>
+              <w:rPr>
                 <w:noProof/>
                 <w:webHidden/>
               </w:rPr>
@@ -945,7 +941,6 @@
             </w:r>
             <w:r>
               <w:rPr>
-                <w:rFonts w:ascii="Arial" w:hAnsi="Arial" w:cs="Arial"/>
                 <w:noProof/>
                 <w:webHidden/>
               </w:rPr>
@@ -953,22 +948,19 @@
             </w:r>
             <w:r>
               <w:rPr>
-                <w:rFonts w:ascii="Arial" w:hAnsi="Arial" w:cs="Arial"/>
                 <w:noProof/>
                 <w:webHidden/>
               </w:rPr>
-              <w:instrText xml:space="preserve"> PAGEREF _Toc225082626 \h </w:instrText>
-            </w:r>
-            <w:r>
-              <w:rPr>
-                <w:rFonts w:ascii="Arial" w:hAnsi="Arial" w:cs="Arial"/>
+              <w:instrText xml:space="preserve"> PAGEREF _Toc225083442 \h </w:instrText>
+            </w:r>
+            <w:r>
+              <w:rPr>
                 <w:noProof/>
                 <w:webHidden/>
               </w:rPr>
             </w:r>
             <w:r>
               <w:rPr>
-                <w:rFonts w:ascii="Arial" w:hAnsi="Arial" w:cs="Arial"/>
                 <w:noProof/>
                 <w:webHidden/>
               </w:rPr>
@@ -976,7 +968,6 @@
             </w:r>
             <w:r>
               <w:rPr>
-                <w:rFonts w:ascii="Arial" w:hAnsi="Arial" w:cs="Arial"/>
                 <w:noProof/>
                 <w:webHidden/>
               </w:rPr>
@@ -984,7 +975,6 @@
             </w:r>
             <w:r>
               <w:rPr>
-                <w:rFonts w:ascii="Arial" w:hAnsi="Arial" w:cs="Arial"/>
                 <w:noProof/>
                 <w:webHidden/>
               </w:rPr>
@@ -999,24 +989,23 @@
               <w:tab w:val="right" w:leader="dot" w:pos="9016"/>
             </w:tabs>
             <w:rPr>
-              <w:rFonts w:ascii="Arial" w:eastAsiaTheme="minorEastAsia" w:hAnsi="Arial" w:cs="Arial"/>
+              <w:rFonts w:asciiTheme="minorHAnsi" w:eastAsiaTheme="minorEastAsia" w:hAnsiTheme="minorHAnsi"/>
               <w:noProof/>
               <w:sz w:val="24"/>
               <w:lang w:eastAsia="en-ZA"/>
             </w:rPr>
           </w:pPr>
-          <w:hyperlink w:anchor="_Toc225082627" w:history="1">
+          <w:hyperlink w:anchor="_Toc225083443" w:history="1">
             <w:r>
               <w:rPr>
                 <w:rStyle w:val="Hyperlink"/>
                 <w:rFonts w:ascii="Arial" w:hAnsi="Arial" w:cs="Arial"/>
                 <w:noProof/>
               </w:rPr>
-              <w:t>Question 4 – Domain Model Class Diagram</w:t>
-            </w:r>
-            <w:r>
-              <w:rPr>
-                <w:rFonts w:ascii="Arial" w:hAnsi="Arial" w:cs="Arial"/>
+              <w:t>Question 3 – Decomposition Technique and Use Case Description</w:t>
+            </w:r>
+            <w:r>
+              <w:rPr>
                 <w:noProof/>
                 <w:webHidden/>
               </w:rPr>
@@ -1024,7 +1013,6 @@
             </w:r>
             <w:r>
               <w:rPr>
-                <w:rFonts w:ascii="Arial" w:hAnsi="Arial" w:cs="Arial"/>
                 <w:noProof/>
                 <w:webHidden/>
               </w:rPr>
@@ -1032,22 +1020,19 @@
             </w:r>
             <w:r>
               <w:rPr>
-                <w:rFonts w:ascii="Arial" w:hAnsi="Arial" w:cs="Arial"/>
                 <w:noProof/>
                 <w:webHidden/>
               </w:rPr>
-              <w:instrText xml:space="preserve"> PAGEREF _Toc225082627 \h </w:instrText>
-            </w:r>
-            <w:r>
-              <w:rPr>
-                <w:rFonts w:ascii="Arial" w:hAnsi="Arial" w:cs="Arial"/>
+              <w:instrText xml:space="preserve"> PAGEREF _Toc225083443 \h </w:instrText>
+            </w:r>
+            <w:r>
+              <w:rPr>
                 <w:noProof/>
                 <w:webHidden/>
               </w:rPr>
             </w:r>
             <w:r>
               <w:rPr>
-                <w:rFonts w:ascii="Arial" w:hAnsi="Arial" w:cs="Arial"/>
                 <w:noProof/>
                 <w:webHidden/>
               </w:rPr>
@@ -1055,15 +1040,13 @@
             </w:r>
             <w:r>
               <w:rPr>
-                <w:rFonts w:ascii="Arial" w:hAnsi="Arial" w:cs="Arial"/>
                 <w:noProof/>
                 <w:webHidden/>
               </w:rPr>
-              <w:t>9</w:t>
-            </w:r>
-            <w:r>
-              <w:rPr>
-                <w:rFonts w:ascii="Arial" w:hAnsi="Arial" w:cs="Arial"/>
+              <w:t>7</w:t>
+            </w:r>
+            <w:r>
+              <w:rPr>
                 <w:noProof/>
                 <w:webHidden/>
               </w:rPr>
@@ -1078,71 +1061,136 @@
               <w:tab w:val="right" w:leader="dot" w:pos="9016"/>
             </w:tabs>
             <w:rPr>
-              <w:rFonts w:ascii="Arial" w:eastAsiaTheme="minorEastAsia" w:hAnsi="Arial" w:cs="Arial"/>
+              <w:rFonts w:asciiTheme="minorHAnsi" w:eastAsiaTheme="minorEastAsia" w:hAnsiTheme="minorHAnsi"/>
               <w:noProof/>
               <w:sz w:val="24"/>
               <w:lang w:eastAsia="en-ZA"/>
             </w:rPr>
           </w:pPr>
-          <w:hyperlink w:anchor="_Toc225082628" w:history="1">
+          <w:hyperlink w:anchor="_Toc225083444" w:history="1">
             <w:r>
               <w:rPr>
                 <w:rStyle w:val="Hyperlink"/>
                 <w:rFonts w:ascii="Arial" w:hAnsi="Arial" w:cs="Arial"/>
                 <w:noProof/>
               </w:rPr>
-              <w:t>References</w:t>
-            </w:r>
-            <w:r>
-              <w:rPr>
+              <w:t>Question 4 – Domain Model Class Diagram</w:t>
+            </w:r>
+            <w:r>
+              <w:rPr>
+                <w:noProof/>
+                <w:webHidden/>
+              </w:rPr>
+              <w:tab/>
+            </w:r>
+            <w:r>
+              <w:rPr>
+                <w:noProof/>
+                <w:webHidden/>
+              </w:rPr>
+              <w:fldChar w:fldCharType="begin"/>
+            </w:r>
+            <w:r>
+              <w:rPr>
+                <w:noProof/>
+                <w:webHidden/>
+              </w:rPr>
+              <w:instrText xml:space="preserve"> PAGEREF _Toc225083444 \h </w:instrText>
+            </w:r>
+            <w:r>
+              <w:rPr>
+                <w:noProof/>
+                <w:webHidden/>
+              </w:rPr>
+            </w:r>
+            <w:r>
+              <w:rPr>
+                <w:noProof/>
+                <w:webHidden/>
+              </w:rPr>
+              <w:fldChar w:fldCharType="separate"/>
+            </w:r>
+            <w:r>
+              <w:rPr>
+                <w:noProof/>
+                <w:webHidden/>
+              </w:rPr>
+              <w:t>10</w:t>
+            </w:r>
+            <w:r>
+              <w:rPr>
+                <w:noProof/>
+                <w:webHidden/>
+              </w:rPr>
+              <w:fldChar w:fldCharType="end"/>
+            </w:r>
+          </w:hyperlink>
+        </w:p>
+        <w:p>
+          <w:pPr>
+            <w:pStyle w:val="TOC1"/>
+            <w:tabs>
+              <w:tab w:val="right" w:leader="dot" w:pos="9016"/>
+            </w:tabs>
+            <w:rPr>
+              <w:rFonts w:asciiTheme="minorHAnsi" w:eastAsiaTheme="minorEastAsia" w:hAnsiTheme="minorHAnsi"/>
+              <w:noProof/>
+              <w:sz w:val="24"/>
+              <w:lang w:eastAsia="en-ZA"/>
+            </w:rPr>
+          </w:pPr>
+          <w:hyperlink w:anchor="_Toc225083445" w:history="1">
+            <w:r>
+              <w:rPr>
+                <w:rStyle w:val="Hyperlink"/>
                 <w:rFonts w:ascii="Arial" w:hAnsi="Arial" w:cs="Arial"/>
                 <w:noProof/>
-                <w:webHidden/>
-              </w:rPr>
-              <w:tab/>
-            </w:r>
-            <w:r>
-              <w:rPr>
-                <w:rFonts w:ascii="Arial" w:hAnsi="Arial" w:cs="Arial"/>
+              </w:rPr>
+              <w:t>References</w:t>
+            </w:r>
+            <w:r>
+              <w:rPr>
                 <w:noProof/>
                 <w:webHidden/>
               </w:rPr>
-              <w:fldChar w:fldCharType="begin"/>
-            </w:r>
-            <w:r>
-              <w:rPr>
-                <w:rFonts w:ascii="Arial" w:hAnsi="Arial" w:cs="Arial"/>
+              <w:tab/>
+            </w:r>
+            <w:r>
+              <w:rPr>
                 <w:noProof/>
                 <w:webHidden/>
               </w:rPr>
-              <w:instrText xml:space="preserve"> PAGEREF _Toc225082628 \h </w:instrText>
-            </w:r>
-            <w:r>
-              <w:rPr>
-                <w:rFonts w:ascii="Arial" w:hAnsi="Arial" w:cs="Arial"/>
+              <w:fldChar w:fldCharType="begin"/>
+            </w:r>
+            <w:r>
+              <w:rPr>
                 <w:noProof/>
                 <w:webHidden/>
               </w:rPr>
-            </w:r>
-            <w:r>
-              <w:rPr>
-                <w:rFonts w:ascii="Arial" w:hAnsi="Arial" w:cs="Arial"/>
+              <w:instrText xml:space="preserve"> PAGEREF _Toc225083445 \h </w:instrText>
+            </w:r>
+            <w:r>
+              <w:rPr>
                 <w:noProof/>
                 <w:webHidden/>
               </w:rPr>
-              <w:fldChar w:fldCharType="separate"/>
-            </w:r>
-            <w:r>
-              <w:rPr>
-                <w:rFonts w:ascii="Arial" w:hAnsi="Arial" w:cs="Arial"/>
+            </w:r>
+            <w:r>
+              <w:rPr>
                 <w:noProof/>
                 <w:webHidden/>
               </w:rPr>
-              <w:t>10</w:t>
-            </w:r>
-            <w:r>
-              <w:rPr>
-                <w:rFonts w:ascii="Arial" w:hAnsi="Arial" w:cs="Arial"/>
+              <w:fldChar w:fldCharType="separate"/>
+            </w:r>
+            <w:r>
+              <w:rPr>
+                <w:noProof/>
+                <w:webHidden/>
+              </w:rPr>
+              <w:t>11</w:t>
+            </w:r>
+            <w:r>
+              <w:rPr>
                 <w:noProof/>
                 <w:webHidden/>
               </w:rPr>
@@ -1195,792 +1243,15 @@
           <w:rFonts w:ascii="Arial" w:hAnsi="Arial" w:cs="Arial"/>
         </w:rPr>
       </w:pPr>
-      <w:bookmarkStart w:id="0" w:name="_Toc225082624"/>
+      <w:bookmarkStart w:id="0" w:name="_Toc225083440"/>
       <w:r>
         <w:rPr>
           <w:rFonts w:ascii="Arial" w:hAnsi="Arial" w:cs="Arial"/>
         </w:rPr>
         <w:lastRenderedPageBreak/>
-        <w:t>Question 1</w:t>
-      </w:r>
-      <w:r>
-        <w:rPr>
-          <w:rFonts w:ascii="Arial" w:hAnsi="Arial" w:cs="Arial"/>
-        </w:rPr>
-        <w:t xml:space="preserve"> </w:t>
-      </w:r>
-      <w:r>
-        <w:rPr>
-          <w:rFonts w:ascii="Arial" w:hAnsi="Arial" w:cs="Arial"/>
-        </w:rPr>
-        <w:t>–</w:t>
-      </w:r>
-      <w:r>
-        <w:rPr>
-          <w:rFonts w:ascii="Arial" w:hAnsi="Arial" w:cs="Arial"/>
-        </w:rPr>
-        <w:t xml:space="preserve"> </w:t>
-      </w:r>
-      <w:r>
-        <w:rPr>
-          <w:rFonts w:ascii="Arial" w:hAnsi="Arial" w:cs="Arial"/>
-        </w:rPr>
-        <w:t xml:space="preserve">ACRMS </w:t>
-      </w:r>
-      <w:r>
-        <w:rPr>
-          <w:rFonts w:ascii="Arial" w:hAnsi="Arial" w:cs="Arial"/>
-        </w:rPr>
-        <w:t>Report</w:t>
+        <w:t>Project Access</w:t>
       </w:r>
       <w:bookmarkEnd w:id="0"/>
-    </w:p>
-    <w:p>
-      <w:pPr>
-        <w:jc w:val="center"/>
-        <w:rPr>
-          <w:rFonts w:ascii="Arial" w:hAnsi="Arial" w:cs="Arial"/>
-          <w:b/>
-          <w:bCs/>
-          <w:szCs w:val="22"/>
-        </w:rPr>
-      </w:pPr>
-      <w:r>
-        <w:rPr>
-          <w:rFonts w:ascii="Arial" w:hAnsi="Arial" w:cs="Arial"/>
-          <w:b/>
-          <w:bCs/>
-          <w:szCs w:val="22"/>
-        </w:rPr>
-        <w:t>A Case for Structured Development: The Role of Systems Analysis and Design in the Airport Customer Relations Management System</w:t>
-      </w:r>
-    </w:p>
-    <w:p>
-      <w:pPr>
-        <w:rPr>
-          <w:rFonts w:ascii="Arial" w:hAnsi="Arial" w:cs="Arial"/>
-          <w:szCs w:val="22"/>
-        </w:rPr>
-      </w:pPr>
-      <w:r>
-        <w:rPr>
-          <w:rFonts w:ascii="Arial" w:hAnsi="Arial" w:cs="Arial"/>
-          <w:b/>
-          <w:bCs/>
-          <w:szCs w:val="22"/>
-        </w:rPr>
-        <w:t>1. What is Systems Analysis and Design?</w:t>
-      </w:r>
-      <w:r>
-        <w:rPr>
-          <w:rFonts w:ascii="Arial" w:hAnsi="Arial" w:cs="Arial"/>
-          <w:b/>
-          <w:bCs/>
-          <w:szCs w:val="22"/>
-        </w:rPr>
-        <w:br/>
-      </w:r>
-      <w:r>
-        <w:rPr>
-          <w:rFonts w:ascii="Arial" w:hAnsi="Arial" w:cs="Arial"/>
-          <w:szCs w:val="22"/>
-        </w:rPr>
-        <w:t>Systems Analysis and Design (SAD) is simply a structured way of solving business problems with technology (</w:t>
-      </w:r>
-      <w:proofErr w:type="spellStart"/>
-      <w:r>
-        <w:rPr>
-          <w:rFonts w:ascii="Arial" w:hAnsi="Arial" w:cs="Arial"/>
-          <w:szCs w:val="22"/>
-        </w:rPr>
-        <w:t>Satzinger</w:t>
-      </w:r>
-      <w:proofErr w:type="spellEnd"/>
-      <w:r>
-        <w:rPr>
-          <w:rFonts w:ascii="Arial" w:hAnsi="Arial" w:cs="Arial"/>
-          <w:szCs w:val="22"/>
-        </w:rPr>
-        <w:t>, Jackson and Burd, 2016). In the Analysis part, we focus on understanding the problem. We figure out exactly what the airport needs by talking to the people who will use the system and writing down their requirements (Kendall and Kendall, 2020). In the Design part, we focus on the solution. We decide exactly how the new system will work, including the software, data, and screens (Dennis, Wixom and Tegarden, 2015). For the new Airport Customer Relations Management System (ACRMS), SAD gives us the plan we need to turn your ideas about flight info, airport navigation, and emergency alerts into a reliable and easy-to-use system.</w:t>
-      </w:r>
-    </w:p>
-    <w:p>
-      <w:pPr>
-        <w:rPr>
-          <w:rFonts w:ascii="Arial" w:hAnsi="Arial" w:cs="Arial"/>
-          <w:szCs w:val="22"/>
-        </w:rPr>
-      </w:pPr>
-    </w:p>
-    <w:p>
-      <w:pPr>
-        <w:rPr>
-          <w:rFonts w:ascii="Arial" w:hAnsi="Arial" w:cs="Arial"/>
-          <w:szCs w:val="22"/>
-        </w:rPr>
-      </w:pPr>
-      <w:r>
-        <w:rPr>
-          <w:rFonts w:ascii="Arial" w:hAnsi="Arial" w:cs="Arial"/>
-          <w:b/>
-          <w:bCs/>
-          <w:szCs w:val="22"/>
-        </w:rPr>
-        <w:t>2. Why Getting SAD Right Matters for the ACRMS</w:t>
-      </w:r>
-      <w:r>
-        <w:rPr>
-          <w:rFonts w:ascii="Arial" w:hAnsi="Arial" w:cs="Arial"/>
-          <w:szCs w:val="22"/>
-        </w:rPr>
-        <w:br/>
-        <w:t>Doing this properly is very important for the ACRMS because an airport is a busy, high-pressure place.</w:t>
-      </w:r>
-    </w:p>
-    <w:p>
-      <w:pPr>
-        <w:numPr>
-          <w:ilvl w:val="0"/>
-          <w:numId w:val="22"/>
-        </w:numPr>
-        <w:rPr>
-          <w:rFonts w:ascii="Arial" w:hAnsi="Arial" w:cs="Arial"/>
-          <w:szCs w:val="22"/>
-        </w:rPr>
-      </w:pPr>
-      <w:r>
-        <w:rPr>
-          <w:rFonts w:ascii="Arial" w:hAnsi="Arial" w:cs="Arial"/>
-          <w:b/>
-          <w:bCs/>
-          <w:szCs w:val="22"/>
-        </w:rPr>
-        <w:t>It keeps everyone happy</w:t>
-      </w:r>
-      <w:r>
-        <w:rPr>
-          <w:rFonts w:ascii="Arial" w:hAnsi="Arial" w:cs="Arial"/>
-          <w:szCs w:val="22"/>
-        </w:rPr>
-        <w:t>: Different people will use this system, like tourists, airport staff, and medics. SAD gives us tools to balance their different needs, so the system works well for everyone. This approach is critical for stakeholder alignment, which is a known success factor in complex information system projects (Bourgeois, 2019).</w:t>
-      </w:r>
-    </w:p>
-    <w:p>
-      <w:pPr>
-        <w:numPr>
-          <w:ilvl w:val="0"/>
-          <w:numId w:val="22"/>
-        </w:numPr>
-        <w:rPr>
-          <w:rFonts w:ascii="Arial" w:hAnsi="Arial" w:cs="Arial"/>
-          <w:szCs w:val="22"/>
-        </w:rPr>
-      </w:pPr>
-      <w:r>
-        <w:rPr>
-          <w:rFonts w:ascii="Arial" w:hAnsi="Arial" w:cs="Arial"/>
-          <w:b/>
-          <w:bCs/>
-          <w:szCs w:val="22"/>
-        </w:rPr>
-        <w:t>It reduces risk</w:t>
-      </w:r>
-      <w:r>
-        <w:rPr>
-          <w:rFonts w:ascii="Arial" w:hAnsi="Arial" w:cs="Arial"/>
-          <w:szCs w:val="22"/>
-        </w:rPr>
-        <w:t>: Proper planning helps us find problems early. It’s much cheaper to fix a misunderstanding on paper now than to fix a system crash after it’s been built. This reflects the principle that the cost of fixing errors increases exponentially the later they are found in the development lifecycle (Boehm, 1981).</w:t>
-      </w:r>
-    </w:p>
-    <w:p>
-      <w:pPr>
-        <w:numPr>
-          <w:ilvl w:val="0"/>
-          <w:numId w:val="22"/>
-        </w:numPr>
-        <w:rPr>
-          <w:rFonts w:ascii="Arial" w:hAnsi="Arial" w:cs="Arial"/>
-          <w:szCs w:val="22"/>
-        </w:rPr>
-      </w:pPr>
-      <w:r>
-        <w:rPr>
-          <w:rFonts w:ascii="Arial" w:hAnsi="Arial" w:cs="Arial"/>
-          <w:b/>
-          <w:bCs/>
-          <w:szCs w:val="22"/>
-        </w:rPr>
-        <w:t>It covers the important details</w:t>
-      </w:r>
-      <w:r>
-        <w:rPr>
-          <w:rFonts w:ascii="Arial" w:hAnsi="Arial" w:cs="Arial"/>
-          <w:szCs w:val="22"/>
-        </w:rPr>
-        <w:t>: It makes sure we don't forget the behind-the-scenes stuff, like making sure the system is reliable during a medical emergency, the GPS is accurate, and the kiosks can handle hundreds of people at once. This focus on non-functional requirements, such as performance and reliability, is essential for mission-critical systems like those in airport operations (Stair and Reynolds, 2020).</w:t>
-      </w:r>
-    </w:p>
-    <w:p>
-      <w:pPr>
-        <w:rPr>
-          <w:rFonts w:ascii="Arial" w:hAnsi="Arial" w:cs="Arial"/>
-          <w:szCs w:val="22"/>
-        </w:rPr>
-      </w:pPr>
-    </w:p>
-    <w:p>
-      <w:pPr>
-        <w:rPr>
-          <w:rFonts w:ascii="Arial" w:hAnsi="Arial" w:cs="Arial"/>
-          <w:szCs w:val="22"/>
-        </w:rPr>
-      </w:pPr>
-      <w:r>
-        <w:rPr>
-          <w:rFonts w:ascii="Arial" w:hAnsi="Arial" w:cs="Arial"/>
-          <w:b/>
-          <w:bCs/>
-          <w:szCs w:val="22"/>
-        </w:rPr>
-        <w:t>3. What We'll Do During the Analysis Phase</w:t>
-      </w:r>
-      <w:r>
-        <w:rPr>
-          <w:rFonts w:ascii="Arial" w:hAnsi="Arial" w:cs="Arial"/>
-          <w:b/>
-          <w:bCs/>
-          <w:szCs w:val="22"/>
-        </w:rPr>
-        <w:br/>
-      </w:r>
-      <w:r>
-        <w:rPr>
-          <w:rFonts w:ascii="Arial" w:hAnsi="Arial" w:cs="Arial"/>
-          <w:szCs w:val="22"/>
-        </w:rPr>
-        <w:t>This phase is all about research and planning. Here’s what we’ll do to build a strong foundation:</w:t>
-      </w:r>
-    </w:p>
-    <w:p>
-      <w:pPr>
-        <w:numPr>
-          <w:ilvl w:val="0"/>
-          <w:numId w:val="23"/>
-        </w:numPr>
-        <w:rPr>
-          <w:rFonts w:ascii="Arial" w:hAnsi="Arial" w:cs="Arial"/>
-          <w:szCs w:val="22"/>
-        </w:rPr>
-      </w:pPr>
-      <w:r>
-        <w:rPr>
-          <w:rFonts w:ascii="Arial" w:hAnsi="Arial" w:cs="Arial"/>
-          <w:b/>
-          <w:bCs/>
-          <w:szCs w:val="22"/>
-        </w:rPr>
-        <w:t>Talk to the right people</w:t>
-      </w:r>
-      <w:r>
-        <w:rPr>
-          <w:rFonts w:ascii="Arial" w:hAnsi="Arial" w:cs="Arial"/>
-          <w:szCs w:val="22"/>
-        </w:rPr>
-        <w:t>: We’ll identify the key users (passengers, medical teams, airport management) and use interviews and surveys to understand exactly what they need from the flight info, navigation, and emergency features. Requirement gathering through stakeholder analysis is a foundational step in system design (Wiegers and Beatty, 2013).</w:t>
-      </w:r>
-    </w:p>
-    <w:p>
-      <w:pPr>
-        <w:numPr>
-          <w:ilvl w:val="0"/>
-          <w:numId w:val="23"/>
-        </w:numPr>
-        <w:rPr>
-          <w:rFonts w:ascii="Arial" w:hAnsi="Arial" w:cs="Arial"/>
-          <w:szCs w:val="22"/>
-        </w:rPr>
-      </w:pPr>
-      <w:r>
-        <w:rPr>
-          <w:rFonts w:ascii="Arial" w:hAnsi="Arial" w:cs="Arial"/>
-          <w:b/>
-          <w:bCs/>
-          <w:szCs w:val="22"/>
-        </w:rPr>
-        <w:t>Map out the scenarios</w:t>
-      </w:r>
-      <w:r>
-        <w:rPr>
-          <w:rFonts w:ascii="Arial" w:hAnsi="Arial" w:cs="Arial"/>
-          <w:szCs w:val="22"/>
-        </w:rPr>
-        <w:t xml:space="preserve">: We’ll use a technique called "event decomposition" to list </w:t>
-      </w:r>
-      <w:proofErr w:type="gramStart"/>
-      <w:r>
-        <w:rPr>
-          <w:rFonts w:ascii="Arial" w:hAnsi="Arial" w:cs="Arial"/>
-          <w:szCs w:val="22"/>
-        </w:rPr>
-        <w:t>every single thing</w:t>
-      </w:r>
-      <w:proofErr w:type="gramEnd"/>
-      <w:r>
-        <w:rPr>
-          <w:rFonts w:ascii="Arial" w:hAnsi="Arial" w:cs="Arial"/>
-          <w:szCs w:val="22"/>
-        </w:rPr>
-        <w:t xml:space="preserve"> the system needs to do. For example, what should happen when a </w:t>
-      </w:r>
-      <w:r>
-        <w:rPr>
-          <w:rFonts w:ascii="Arial" w:hAnsi="Arial" w:cs="Arial"/>
-          <w:szCs w:val="22"/>
-        </w:rPr>
-        <w:lastRenderedPageBreak/>
-        <w:t>"passenger asks for medical help" or when a "flight is delayed"? We’ll map out the system's response for each event. Event decomposition is a robust technique for identifying use cases by focusing on external events that a system must respond to (</w:t>
-      </w:r>
-      <w:proofErr w:type="spellStart"/>
-      <w:r>
-        <w:rPr>
-          <w:rFonts w:ascii="Arial" w:hAnsi="Arial" w:cs="Arial"/>
-          <w:szCs w:val="22"/>
-        </w:rPr>
-        <w:t>Satzinger</w:t>
-      </w:r>
-      <w:proofErr w:type="spellEnd"/>
-      <w:r>
-        <w:rPr>
-          <w:rFonts w:ascii="Arial" w:hAnsi="Arial" w:cs="Arial"/>
-          <w:szCs w:val="22"/>
-        </w:rPr>
-        <w:t>, Jackson and Burd, 2016).</w:t>
-      </w:r>
-    </w:p>
-    <w:p>
-      <w:pPr>
-        <w:numPr>
-          <w:ilvl w:val="0"/>
-          <w:numId w:val="23"/>
-        </w:numPr>
-        <w:rPr>
-          <w:rFonts w:ascii="Arial" w:hAnsi="Arial" w:cs="Arial"/>
-          <w:szCs w:val="22"/>
-        </w:rPr>
-      </w:pPr>
-      <w:r>
-        <w:rPr>
-          <w:rFonts w:ascii="Arial" w:hAnsi="Arial" w:cs="Arial"/>
-          <w:b/>
-          <w:bCs/>
-          <w:szCs w:val="22"/>
-        </w:rPr>
-        <w:t>Create a data map</w:t>
-      </w:r>
-      <w:r>
-        <w:rPr>
-          <w:rFonts w:ascii="Arial" w:hAnsi="Arial" w:cs="Arial"/>
-          <w:szCs w:val="22"/>
-        </w:rPr>
-        <w:t xml:space="preserve">: We’ll build a simple diagram showing the key pieces of information the system needs to manage, like Passenger, Flight, and </w:t>
-      </w:r>
-      <w:proofErr w:type="spellStart"/>
-      <w:r>
-        <w:rPr>
-          <w:rFonts w:ascii="Arial" w:hAnsi="Arial" w:cs="Arial"/>
-          <w:szCs w:val="22"/>
-        </w:rPr>
-        <w:t>MedicalEmergency</w:t>
-      </w:r>
-      <w:proofErr w:type="spellEnd"/>
-      <w:r>
-        <w:rPr>
-          <w:rFonts w:ascii="Arial" w:hAnsi="Arial" w:cs="Arial"/>
-          <w:szCs w:val="22"/>
-        </w:rPr>
-        <w:t>, and how they are all connected. This is typically represented in an Entity-Relationship Diagram (ERD), which forms the conceptual basis for database design (Hoffer, Venkataraman and Topi, 2019).</w:t>
-      </w:r>
-    </w:p>
-    <w:p>
-      <w:pPr>
-        <w:numPr>
-          <w:ilvl w:val="0"/>
-          <w:numId w:val="23"/>
-        </w:numPr>
-        <w:rPr>
-          <w:rFonts w:ascii="Arial" w:hAnsi="Arial" w:cs="Arial"/>
-          <w:szCs w:val="22"/>
-        </w:rPr>
-      </w:pPr>
-      <w:r>
-        <w:rPr>
-          <w:rFonts w:ascii="Arial" w:hAnsi="Arial" w:cs="Arial"/>
-          <w:b/>
-          <w:bCs/>
-          <w:szCs w:val="22"/>
-        </w:rPr>
-        <w:t>Write clear instructions</w:t>
-      </w:r>
-      <w:r>
-        <w:rPr>
-          <w:rFonts w:ascii="Arial" w:hAnsi="Arial" w:cs="Arial"/>
-          <w:szCs w:val="22"/>
-        </w:rPr>
-        <w:t>: For every action the system must perform, we’ll write a clear description. This covers the basic steps, what to do if something goes wrong, and what needs to happen before and after. These descriptions, known as use cases, are essential for capturing functional requirements and defining system behaviour (Cockburn, 2001).</w:t>
-      </w:r>
-    </w:p>
-    <w:p>
-      <w:pPr>
-        <w:rPr>
-          <w:rFonts w:ascii="Arial" w:hAnsi="Arial" w:cs="Arial"/>
-          <w:szCs w:val="22"/>
-        </w:rPr>
-      </w:pPr>
-    </w:p>
-    <w:p>
-      <w:pPr>
-        <w:rPr>
-          <w:rFonts w:ascii="Arial" w:hAnsi="Arial" w:cs="Arial"/>
-          <w:szCs w:val="22"/>
-        </w:rPr>
-      </w:pPr>
-      <w:r>
-        <w:rPr>
-          <w:rFonts w:ascii="Arial" w:hAnsi="Arial" w:cs="Arial"/>
-          <w:b/>
-          <w:bCs/>
-          <w:szCs w:val="22"/>
-        </w:rPr>
-        <w:t>4. What We'll Do During the Design Phase</w:t>
-      </w:r>
-      <w:r>
-        <w:rPr>
-          <w:rFonts w:ascii="Arial" w:hAnsi="Arial" w:cs="Arial"/>
-          <w:b/>
-          <w:bCs/>
-          <w:szCs w:val="22"/>
-        </w:rPr>
-        <w:br/>
-      </w:r>
-      <w:r>
-        <w:rPr>
-          <w:rFonts w:ascii="Arial" w:hAnsi="Arial" w:cs="Arial"/>
-          <w:szCs w:val="22"/>
-        </w:rPr>
-        <w:t>Now we take the research from the analysis phase and start building the blueprint for the actual software.</w:t>
-      </w:r>
-    </w:p>
-    <w:p>
-      <w:pPr>
-        <w:numPr>
-          <w:ilvl w:val="0"/>
-          <w:numId w:val="24"/>
-        </w:numPr>
-        <w:rPr>
-          <w:rFonts w:ascii="Arial" w:hAnsi="Arial" w:cs="Arial"/>
-          <w:szCs w:val="22"/>
-        </w:rPr>
-      </w:pPr>
-      <w:r>
-        <w:rPr>
-          <w:rFonts w:ascii="Arial" w:hAnsi="Arial" w:cs="Arial"/>
-          <w:b/>
-          <w:bCs/>
-          <w:szCs w:val="22"/>
-        </w:rPr>
-        <w:t>Break it down into parts</w:t>
-      </w:r>
-      <w:r>
-        <w:rPr>
-          <w:rFonts w:ascii="Arial" w:hAnsi="Arial" w:cs="Arial"/>
-          <w:szCs w:val="22"/>
-        </w:rPr>
-        <w:t>: To keep things organized, we’ll split the system into smaller, logical modules. This will likely include a Navigation part, an Emergency Services connector, a Flight Info updater, and a User Management section. This modular design, a form of systems architecture, improves maintainability and allows for parallel development (Dennis, Wixom and Tegarden, 2015).</w:t>
-      </w:r>
-    </w:p>
-    <w:p>
-      <w:pPr>
-        <w:numPr>
-          <w:ilvl w:val="0"/>
-          <w:numId w:val="24"/>
-        </w:numPr>
-        <w:rPr>
-          <w:rFonts w:ascii="Arial" w:hAnsi="Arial" w:cs="Arial"/>
-          <w:szCs w:val="22"/>
-        </w:rPr>
-      </w:pPr>
-      <w:r>
-        <w:rPr>
-          <w:rFonts w:ascii="Arial" w:hAnsi="Arial" w:cs="Arial"/>
-          <w:b/>
-          <w:bCs/>
-          <w:szCs w:val="22"/>
-        </w:rPr>
-        <w:t>Design the screens</w:t>
-      </w:r>
-      <w:r>
-        <w:rPr>
-          <w:rFonts w:ascii="Arial" w:hAnsi="Arial" w:cs="Arial"/>
-          <w:szCs w:val="22"/>
-        </w:rPr>
-        <w:t>: We’ll create simple mock-ups of what the airport kiosks and the mobile app will look like. We’ll focus on making it easy to use, ensuring that critical features like the "call for medical help" button is big, obvious, and easy to find. This user interface (UI) design process, often involving prototyping, is critical for usability and user adoption (Sharp, Rogers and Preece, 2019).</w:t>
-      </w:r>
-    </w:p>
-    <w:p>
-      <w:pPr>
-        <w:numPr>
-          <w:ilvl w:val="0"/>
-          <w:numId w:val="24"/>
-        </w:numPr>
-        <w:rPr>
-          <w:rFonts w:ascii="Arial" w:hAnsi="Arial" w:cs="Arial"/>
-          <w:szCs w:val="22"/>
-        </w:rPr>
-      </w:pPr>
-      <w:r>
-        <w:rPr>
-          <w:rFonts w:ascii="Arial" w:hAnsi="Arial" w:cs="Arial"/>
-          <w:b/>
-          <w:bCs/>
-          <w:szCs w:val="22"/>
-        </w:rPr>
-        <w:t>Design the database</w:t>
-      </w:r>
-      <w:r>
-        <w:rPr>
-          <w:rFonts w:ascii="Arial" w:hAnsi="Arial" w:cs="Arial"/>
-          <w:szCs w:val="22"/>
-        </w:rPr>
-        <w:t>: We’ll design the behind-the-scenes structure for storing all the information. This means figuring out the best way to save and quickly find things like flight updates, locations of shops and gates, and details of an active emergency. A well-structured database schema, typically in a relational model, is crucial for data integrity and retrieval efficiency (Connolly and Begg, 2015).</w:t>
-      </w:r>
-    </w:p>
-    <w:p>
-      <w:pPr>
-        <w:numPr>
-          <w:ilvl w:val="0"/>
-          <w:numId w:val="24"/>
-        </w:numPr>
-        <w:rPr>
-          <w:rFonts w:ascii="Arial" w:hAnsi="Arial" w:cs="Arial"/>
-          <w:szCs w:val="22"/>
-        </w:rPr>
-      </w:pPr>
-      <w:r>
-        <w:rPr>
-          <w:rFonts w:ascii="Arial" w:hAnsi="Arial" w:cs="Arial"/>
-          <w:b/>
-          <w:bCs/>
-          <w:szCs w:val="22"/>
-        </w:rPr>
-        <w:t>Plan how parts talk to each other</w:t>
-      </w:r>
-      <w:r>
-        <w:rPr>
-          <w:rFonts w:ascii="Arial" w:hAnsi="Arial" w:cs="Arial"/>
-          <w:szCs w:val="22"/>
-        </w:rPr>
-        <w:t xml:space="preserve">: We’ll map out how the different parts of the system (like the app and the navigation engine) will communicate. We'll also plan how the whole system will connect to the airport’s existing flight data and emergency dispatch networks. This involves defining application programming interfaces (APIs) and integration architectures, which are key to ensuring system interoperability (Bass, Clements and </w:t>
-      </w:r>
-      <w:proofErr w:type="spellStart"/>
-      <w:r>
-        <w:rPr>
-          <w:rFonts w:ascii="Arial" w:hAnsi="Arial" w:cs="Arial"/>
-          <w:szCs w:val="22"/>
-        </w:rPr>
-        <w:t>Kazman</w:t>
-      </w:r>
-      <w:proofErr w:type="spellEnd"/>
-      <w:r>
-        <w:rPr>
-          <w:rFonts w:ascii="Arial" w:hAnsi="Arial" w:cs="Arial"/>
-          <w:szCs w:val="22"/>
-        </w:rPr>
-        <w:t>, 2013).</w:t>
-      </w:r>
-    </w:p>
-    <w:p>
-      <w:pPr>
-        <w:rPr>
-          <w:rFonts w:ascii="Arial" w:hAnsi="Arial" w:cs="Arial"/>
-          <w:szCs w:val="22"/>
-        </w:rPr>
-      </w:pPr>
-    </w:p>
-    <w:p>
-      <w:pPr>
-        <w:rPr>
-          <w:rFonts w:ascii="Arial" w:hAnsi="Arial" w:cs="Arial"/>
-          <w:szCs w:val="22"/>
-        </w:rPr>
-      </w:pPr>
-      <w:r>
-        <w:rPr>
-          <w:rFonts w:ascii="Arial" w:hAnsi="Arial" w:cs="Arial"/>
-          <w:b/>
-          <w:bCs/>
-          <w:szCs w:val="22"/>
-        </w:rPr>
-        <w:t>5. Why We Recommend an Iterative Approach</w:t>
-      </w:r>
-      <w:r>
-        <w:rPr>
-          <w:rFonts w:ascii="Arial" w:hAnsi="Arial" w:cs="Arial"/>
-          <w:szCs w:val="22"/>
-        </w:rPr>
-        <w:br/>
-        <w:t xml:space="preserve">Instead of building everything in one long sequence, we suggest an iterative approach, </w:t>
-      </w:r>
-      <w:r>
-        <w:rPr>
-          <w:rFonts w:ascii="Arial" w:hAnsi="Arial" w:cs="Arial"/>
-          <w:szCs w:val="22"/>
-        </w:rPr>
-        <w:lastRenderedPageBreak/>
-        <w:t>which means building the system in repeated cycles. This is the best way to go for the ACRMS for a few reasons:</w:t>
-      </w:r>
-    </w:p>
-    <w:p>
-      <w:pPr>
-        <w:numPr>
-          <w:ilvl w:val="0"/>
-          <w:numId w:val="25"/>
-        </w:numPr>
-        <w:rPr>
-          <w:rFonts w:ascii="Arial" w:hAnsi="Arial" w:cs="Arial"/>
-          <w:szCs w:val="22"/>
-        </w:rPr>
-      </w:pPr>
-      <w:r>
-        <w:rPr>
-          <w:rFonts w:ascii="Arial" w:hAnsi="Arial" w:cs="Arial"/>
-          <w:b/>
-          <w:bCs/>
-          <w:szCs w:val="22"/>
-        </w:rPr>
-        <w:t>Test the tricky parts first</w:t>
-      </w:r>
-      <w:r>
-        <w:rPr>
-          <w:rFonts w:ascii="Arial" w:hAnsi="Arial" w:cs="Arial"/>
-          <w:szCs w:val="22"/>
-        </w:rPr>
-        <w:t>: The most complex feature is linking to medical services. By building a simple working version of this early on, we can test it thoroughly to make sure it's reliable before we build the rest of the system. This is a core principle of iterative development, where high-risk elements are addressed early in the project (Larman, 2004).</w:t>
-      </w:r>
-    </w:p>
-    <w:p>
-      <w:pPr>
-        <w:numPr>
-          <w:ilvl w:val="0"/>
-          <w:numId w:val="25"/>
-        </w:numPr>
-        <w:rPr>
-          <w:rFonts w:ascii="Arial" w:hAnsi="Arial" w:cs="Arial"/>
-          <w:szCs w:val="22"/>
-        </w:rPr>
-      </w:pPr>
-      <w:r>
-        <w:rPr>
-          <w:rFonts w:ascii="Arial" w:hAnsi="Arial" w:cs="Arial"/>
-          <w:b/>
-          <w:bCs/>
-          <w:szCs w:val="22"/>
-        </w:rPr>
-        <w:t>Adapt to changes easily</w:t>
-      </w:r>
-      <w:r>
-        <w:rPr>
-          <w:rFonts w:ascii="Arial" w:hAnsi="Arial" w:cs="Arial"/>
-          <w:szCs w:val="22"/>
-        </w:rPr>
-        <w:t>: Feedback might show that tourists find the GPS directions confusing. With an iterative approach, we can improve the design in the next cycle without throwing the whole project off track. Iterative methods like Agile are designed to accommodate changing requirements, a common challenge in software projects (Pressman, 2014).</w:t>
-      </w:r>
-    </w:p>
-    <w:p>
-      <w:pPr>
-        <w:numPr>
-          <w:ilvl w:val="0"/>
-          <w:numId w:val="25"/>
-        </w:numPr>
-        <w:rPr>
-          <w:rFonts w:ascii="Arial" w:hAnsi="Arial" w:cs="Arial"/>
-          <w:szCs w:val="22"/>
-        </w:rPr>
-      </w:pPr>
-      <w:r>
-        <w:rPr>
-          <w:rFonts w:ascii="Arial" w:hAnsi="Arial" w:cs="Arial"/>
-          <w:b/>
-          <w:bCs/>
-          <w:szCs w:val="22"/>
-        </w:rPr>
-        <w:t>Get feedback as we go</w:t>
-      </w:r>
-      <w:r>
-        <w:rPr>
-          <w:rFonts w:ascii="Arial" w:hAnsi="Arial" w:cs="Arial"/>
-          <w:szCs w:val="22"/>
-        </w:rPr>
-        <w:t>: This method lets users see and try parts of the system early. Their feedback helps us make sure the final product truly meets their needs, which leads to a better result and fewer expensive fixes after launch. User involvement through iterative prototyping significantly increases the likelihood of system success (Boehm and Turner, 2004).</w:t>
-      </w:r>
-    </w:p>
-    <w:p>
-      <w:pPr>
-        <w:rPr>
-          <w:rFonts w:ascii="Arial" w:hAnsi="Arial" w:cs="Arial"/>
-          <w:szCs w:val="22"/>
-        </w:rPr>
-      </w:pPr>
-    </w:p>
-    <w:p>
-      <w:pPr>
-        <w:rPr>
-          <w:rFonts w:ascii="Arial" w:hAnsi="Arial" w:cs="Arial"/>
-          <w:sz w:val="24"/>
-          <w:szCs w:val="28"/>
-        </w:rPr>
-      </w:pPr>
-      <w:r>
-        <w:rPr>
-          <w:rFonts w:ascii="Arial" w:hAnsi="Arial" w:cs="Arial"/>
-          <w:b/>
-          <w:bCs/>
-          <w:szCs w:val="22"/>
-        </w:rPr>
-        <w:t>6. Conclusion</w:t>
-      </w:r>
-      <w:r>
-        <w:rPr>
-          <w:rFonts w:ascii="Arial" w:hAnsi="Arial" w:cs="Arial"/>
-          <w:b/>
-          <w:bCs/>
-          <w:szCs w:val="22"/>
-        </w:rPr>
-        <w:br/>
-      </w:r>
-      <w:r>
-        <w:rPr>
-          <w:rFonts w:ascii="Arial" w:hAnsi="Arial" w:cs="Arial"/>
-          <w:szCs w:val="22"/>
-        </w:rPr>
-        <w:t xml:space="preserve">In short, building the ACRMS is about more than just writing code. It’s a journey from understanding your needs (Analysis) to planning the solution (Design). The steps we've outlined such as defining requirements, designing the architecture, and prototyping the screens aren't just paperwork. They are the essential steps that make sure the final system is reliable, can grow with your needs, and is simple for passengers to use (Avison and Fitzgerald, 2006). Our commitment to building in cycles means we can handle the challenge of combining flight data, GPS, and emergency alerts, all while staying flexible to your feedback. We have the skills to put this plan into action, and we are confident we can deliver a system that will improve the passenger experience and be </w:t>
-      </w:r>
-      <w:proofErr w:type="gramStart"/>
-      <w:r>
-        <w:rPr>
-          <w:rFonts w:ascii="Arial" w:hAnsi="Arial" w:cs="Arial"/>
-          <w:szCs w:val="22"/>
-        </w:rPr>
-        <w:t>a valuable asset</w:t>
-      </w:r>
-      <w:proofErr w:type="gramEnd"/>
-      <w:r>
-        <w:rPr>
-          <w:rFonts w:ascii="Arial" w:hAnsi="Arial" w:cs="Arial"/>
-          <w:szCs w:val="22"/>
-        </w:rPr>
-        <w:t xml:space="preserve"> for the airport.</w:t>
-      </w:r>
     </w:p>
     <w:p>
       <w:pPr>
@@ -1996,6 +1267,18 @@
         <w:rPr>
           <w:rFonts w:ascii="Arial" w:hAnsi="Arial" w:cs="Arial"/>
         </w:rPr>
+        <w:t xml:space="preserve">GitHub Repo Link: </w:t>
+      </w:r>
+      <w:r>
+        <w:rPr>
+          <w:rFonts w:ascii="Arial" w:hAnsi="Arial" w:cs="Arial"/>
+        </w:rPr>
+        <w:t>https://github.com/reabetswef/ST10493664-INSY6211-Assignment-1.git</w:t>
+      </w:r>
+      <w:r>
+        <w:rPr>
+          <w:rFonts w:ascii="Arial" w:hAnsi="Arial" w:cs="Arial"/>
+        </w:rPr>
         <w:br w:type="page"/>
       </w:r>
     </w:p>
@@ -2006,64 +1289,157 @@
           <w:rFonts w:ascii="Arial" w:hAnsi="Arial" w:cs="Arial"/>
         </w:rPr>
       </w:pPr>
-      <w:bookmarkStart w:id="1" w:name="_Toc225082625"/>
+      <w:bookmarkStart w:id="1" w:name="_Toc225083441"/>
       <w:r>
         <w:rPr>
           <w:rFonts w:ascii="Arial" w:hAnsi="Arial" w:cs="Arial"/>
         </w:rPr>
         <w:lastRenderedPageBreak/>
-        <w:t>Question 2</w:t>
-      </w:r>
-      <w:r>
-        <w:rPr>
-          <w:rFonts w:ascii="Arial" w:hAnsi="Arial" w:cs="Arial"/>
-        </w:rPr>
-        <w:t xml:space="preserve"> – Potential Stakeholders</w:t>
+        <w:t>Question 1</w:t>
+      </w:r>
+      <w:r>
+        <w:rPr>
+          <w:rFonts w:ascii="Arial" w:hAnsi="Arial" w:cs="Arial"/>
+        </w:rPr>
+        <w:t xml:space="preserve"> </w:t>
+      </w:r>
+      <w:r>
+        <w:rPr>
+          <w:rFonts w:ascii="Arial" w:hAnsi="Arial" w:cs="Arial"/>
+        </w:rPr>
+        <w:t>–</w:t>
+      </w:r>
+      <w:r>
+        <w:rPr>
+          <w:rFonts w:ascii="Arial" w:hAnsi="Arial" w:cs="Arial"/>
+        </w:rPr>
+        <w:t xml:space="preserve"> </w:t>
+      </w:r>
+      <w:r>
+        <w:rPr>
+          <w:rFonts w:ascii="Arial" w:hAnsi="Arial" w:cs="Arial"/>
+        </w:rPr>
+        <w:t xml:space="preserve">ACRMS </w:t>
+      </w:r>
+      <w:r>
+        <w:rPr>
+          <w:rFonts w:ascii="Arial" w:hAnsi="Arial" w:cs="Arial"/>
+        </w:rPr>
+        <w:t>Report</w:t>
       </w:r>
       <w:bookmarkEnd w:id="1"/>
     </w:p>
     <w:p>
       <w:pPr>
-        <w:rPr>
-          <w:rFonts w:ascii="Arial" w:hAnsi="Arial" w:cs="Arial"/>
-        </w:rPr>
-      </w:pPr>
-      <w:r>
-        <w:rPr>
-          <w:rFonts w:ascii="Arial" w:hAnsi="Arial" w:cs="Arial"/>
-        </w:rPr>
-        <w:t>Q.</w:t>
-      </w:r>
-      <w:r>
-        <w:rPr>
-          <w:rFonts w:ascii="Arial" w:hAnsi="Arial" w:cs="Arial"/>
-        </w:rPr>
-        <w:t>2.1)</w:t>
-      </w:r>
-    </w:p>
-    <w:p>
-      <w:pPr>
-        <w:rPr>
-          <w:rFonts w:ascii="Arial" w:hAnsi="Arial" w:cs="Arial"/>
-        </w:rPr>
-      </w:pPr>
-      <w:r>
+        <w:jc w:val="center"/>
         <w:rPr>
           <w:rFonts w:ascii="Arial" w:hAnsi="Arial" w:cs="Arial"/>
           <w:b/>
           <w:bCs/>
-        </w:rPr>
-        <w:t>1. Airport Management / Airport Authority</w:t>
+          <w:szCs w:val="22"/>
+        </w:rPr>
+      </w:pPr>
+      <w:r>
+        <w:rPr>
+          <w:rFonts w:ascii="Arial" w:hAnsi="Arial" w:cs="Arial"/>
+          <w:b/>
+          <w:bCs/>
+          <w:szCs w:val="22"/>
+        </w:rPr>
+        <w:t>A Case for Structured Development: The Role of Systems Analysis and Design in the Airport Customer Relations Management System</w:t>
+      </w:r>
+    </w:p>
+    <w:p>
+      <w:pPr>
+        <w:rPr>
+          <w:rFonts w:ascii="Arial" w:hAnsi="Arial" w:cs="Arial"/>
+          <w:szCs w:val="22"/>
+        </w:rPr>
+      </w:pPr>
+      <w:r>
+        <w:rPr>
+          <w:rFonts w:ascii="Arial" w:hAnsi="Arial" w:cs="Arial"/>
+          <w:b/>
+          <w:bCs/>
+          <w:szCs w:val="22"/>
+        </w:rPr>
+        <w:t>1. What is Systems Analysis and Design?</w:t>
+      </w:r>
+      <w:r>
+        <w:rPr>
+          <w:rFonts w:ascii="Arial" w:hAnsi="Arial" w:cs="Arial"/>
+          <w:b/>
+          <w:bCs/>
+          <w:szCs w:val="22"/>
+        </w:rPr>
+        <w:br/>
+      </w:r>
+      <w:r>
+        <w:rPr>
+          <w:rFonts w:ascii="Arial" w:hAnsi="Arial" w:cs="Arial"/>
+          <w:szCs w:val="22"/>
+        </w:rPr>
+        <w:t>Systems Analysis and Design (SAD) is simply a structured way of solving business problems with technology (</w:t>
+      </w:r>
+      <w:proofErr w:type="spellStart"/>
+      <w:r>
+        <w:rPr>
+          <w:rFonts w:ascii="Arial" w:hAnsi="Arial" w:cs="Arial"/>
+          <w:szCs w:val="22"/>
+        </w:rPr>
+        <w:t>Satzinger</w:t>
+      </w:r>
+      <w:proofErr w:type="spellEnd"/>
+      <w:r>
+        <w:rPr>
+          <w:rFonts w:ascii="Arial" w:hAnsi="Arial" w:cs="Arial"/>
+          <w:szCs w:val="22"/>
+        </w:rPr>
+        <w:t>, Jackson and Burd, 2016). In the Analysis part, we focus on understanding the problem. We figure out exactly what the airport needs by talking to the people who will use the system and writing down their requirements (Kendall and Kendall, 2020). In the Design part, we focus on the solution. We decide exactly how the new system will work, including the software, data, and screens (Dennis, Wixom and Tegarden, 2015). For the new Airport Customer Relations Management System (ACRMS), SAD gives us the plan we need to turn your ideas about flight info, airport navigation, and emergency alerts into a reliable and easy-to-use system.</w:t>
+      </w:r>
+    </w:p>
+    <w:p>
+      <w:pPr>
+        <w:rPr>
+          <w:rFonts w:ascii="Arial" w:hAnsi="Arial" w:cs="Arial"/>
+          <w:szCs w:val="22"/>
+        </w:rPr>
+      </w:pPr>
+    </w:p>
+    <w:p>
+      <w:pPr>
+        <w:rPr>
+          <w:rFonts w:ascii="Arial" w:hAnsi="Arial" w:cs="Arial"/>
+          <w:szCs w:val="22"/>
+        </w:rPr>
+      </w:pPr>
+      <w:r>
+        <w:rPr>
+          <w:rFonts w:ascii="Arial" w:hAnsi="Arial" w:cs="Arial"/>
+          <w:b/>
+          <w:bCs/>
+          <w:szCs w:val="22"/>
+        </w:rPr>
+        <w:t>2. Why Getting SAD Right Matters for the ACRMS</w:t>
+      </w:r>
+      <w:r>
+        <w:rPr>
+          <w:rFonts w:ascii="Arial" w:hAnsi="Arial" w:cs="Arial"/>
+          <w:szCs w:val="22"/>
+        </w:rPr>
+        <w:br/>
+        <w:t>Doing this properly is very important for the ACRMS because an airport is a busy, high-pressure place.</w:t>
       </w:r>
     </w:p>
     <w:p>
       <w:pPr>
         <w:numPr>
           <w:ilvl w:val="0"/>
-          <w:numId w:val="8"/>
+          <w:numId w:val="22"/>
         </w:numPr>
         <w:rPr>
           <w:rFonts w:ascii="Arial" w:hAnsi="Arial" w:cs="Arial"/>
+          <w:szCs w:val="22"/>
         </w:rPr>
       </w:pPr>
       <w:r>
@@ -2071,33 +1447,27 @@
           <w:rFonts w:ascii="Arial" w:hAnsi="Arial" w:cs="Arial"/>
           <w:b/>
           <w:bCs/>
-        </w:rPr>
-        <w:t>Contribution to Requirements Gathering:</w:t>
-      </w:r>
-      <w:r>
-        <w:rPr>
-          <w:rFonts w:ascii="Arial" w:hAnsi="Arial" w:cs="Arial"/>
-        </w:rPr>
-        <w:t> They provide the strategic vision and high-level business objectives for the system. They will clarify the airport's goals for customer satisfaction, define budget constraints, and outline the expected return on investment. Their input ensures the system aligns with the airport's overall direction</w:t>
-      </w:r>
-      <w:r>
-        <w:rPr>
-          <w:rFonts w:ascii="Arial" w:hAnsi="Arial" w:cs="Arial"/>
-        </w:rPr>
-        <w:t>.</w:t>
-      </w:r>
-    </w:p>
-    <w:p>
-      <w:pPr>
-        <w:rPr>
-          <w:rFonts w:ascii="Arial" w:hAnsi="Arial" w:cs="Arial"/>
-        </w:rPr>
-      </w:pPr>
-    </w:p>
-    <w:p>
-      <w:pPr>
-        <w:rPr>
-          <w:rFonts w:ascii="Arial" w:hAnsi="Arial" w:cs="Arial"/>
+          <w:szCs w:val="22"/>
+        </w:rPr>
+        <w:t>It keeps everyone happy</w:t>
+      </w:r>
+      <w:r>
+        <w:rPr>
+          <w:rFonts w:ascii="Arial" w:hAnsi="Arial" w:cs="Arial"/>
+          <w:szCs w:val="22"/>
+        </w:rPr>
+        <w:t>: Different people will use this system, like tourists, airport staff, and medics. SAD gives us tools to balance their different needs, so the system works well for everyone. This approach is critical for stakeholder alignment, which is a known success factor in complex information system projects (Bourgeois, 2019).</w:t>
+      </w:r>
+    </w:p>
+    <w:p>
+      <w:pPr>
+        <w:numPr>
+          <w:ilvl w:val="0"/>
+          <w:numId w:val="22"/>
+        </w:numPr>
+        <w:rPr>
+          <w:rFonts w:ascii="Arial" w:hAnsi="Arial" w:cs="Arial"/>
+          <w:szCs w:val="22"/>
         </w:rPr>
       </w:pPr>
       <w:r>
@@ -2105,18 +1475,27 @@
           <w:rFonts w:ascii="Arial" w:hAnsi="Arial" w:cs="Arial"/>
           <w:b/>
           <w:bCs/>
-        </w:rPr>
-        <w:t>2. Airline Representatives</w:t>
+          <w:szCs w:val="22"/>
+        </w:rPr>
+        <w:t>It reduces risk</w:t>
+      </w:r>
+      <w:r>
+        <w:rPr>
+          <w:rFonts w:ascii="Arial" w:hAnsi="Arial" w:cs="Arial"/>
+          <w:szCs w:val="22"/>
+        </w:rPr>
+        <w:t>: Proper planning helps us find problems early. It’s much cheaper to fix a misunderstanding on paper now than to fix a system crash after it’s been built. This reflects the principle that the cost of fixing errors increases exponentially the later they are found in the development lifecycle (Boehm, 1981).</w:t>
       </w:r>
     </w:p>
     <w:p>
       <w:pPr>
         <w:numPr>
           <w:ilvl w:val="0"/>
-          <w:numId w:val="9"/>
+          <w:numId w:val="22"/>
         </w:numPr>
         <w:rPr>
           <w:rFonts w:ascii="Arial" w:hAnsi="Arial" w:cs="Arial"/>
+          <w:szCs w:val="22"/>
         </w:rPr>
       </w:pPr>
       <w:r>
@@ -2124,33 +1503,31 @@
           <w:rFonts w:ascii="Arial" w:hAnsi="Arial" w:cs="Arial"/>
           <w:b/>
           <w:bCs/>
-        </w:rPr>
-        <w:t>Contribution to Requirements Gathering:</w:t>
-      </w:r>
-      <w:r>
-        <w:rPr>
-          <w:rFonts w:ascii="Arial" w:hAnsi="Arial" w:cs="Arial"/>
-        </w:rPr>
-        <w:t> Airlines are key partners who will share data regarding flight schedules, delays, and passenger connections. They can specify requirements for how flight information should be displayed and how the system should handle disruptions, ensuring smooth communication between the airport and its airline tenants</w:t>
-      </w:r>
-      <w:r>
-        <w:rPr>
-          <w:rFonts w:ascii="Arial" w:hAnsi="Arial" w:cs="Arial"/>
-        </w:rPr>
-        <w:t>.</w:t>
-      </w:r>
-    </w:p>
-    <w:p>
-      <w:pPr>
-        <w:rPr>
-          <w:rFonts w:ascii="Arial" w:hAnsi="Arial" w:cs="Arial"/>
-        </w:rPr>
-      </w:pPr>
-    </w:p>
-    <w:p>
-      <w:pPr>
-        <w:rPr>
-          <w:rFonts w:ascii="Arial" w:hAnsi="Arial" w:cs="Arial"/>
+          <w:szCs w:val="22"/>
+        </w:rPr>
+        <w:t>It covers the important details</w:t>
+      </w:r>
+      <w:r>
+        <w:rPr>
+          <w:rFonts w:ascii="Arial" w:hAnsi="Arial" w:cs="Arial"/>
+          <w:szCs w:val="22"/>
+        </w:rPr>
+        <w:t>: It makes sure we don't forget the behind-the-scenes stuff, like making sure the system is reliable during a medical emergency, the GPS is accurate, and the kiosks can handle hundreds of people at once. This focus on non-functional requirements, such as performance and reliability, is essential for mission-critical systems like those in airport operations (Stair and Reynolds, 2020).</w:t>
+      </w:r>
+    </w:p>
+    <w:p>
+      <w:pPr>
+        <w:rPr>
+          <w:rFonts w:ascii="Arial" w:hAnsi="Arial" w:cs="Arial"/>
+          <w:szCs w:val="22"/>
+        </w:rPr>
+      </w:pPr>
+    </w:p>
+    <w:p>
+      <w:pPr>
+        <w:rPr>
+          <w:rFonts w:ascii="Arial" w:hAnsi="Arial" w:cs="Arial"/>
+          <w:szCs w:val="22"/>
         </w:rPr>
       </w:pPr>
       <w:r>
@@ -2158,18 +1535,36 @@
           <w:rFonts w:ascii="Arial" w:hAnsi="Arial" w:cs="Arial"/>
           <w:b/>
           <w:bCs/>
-        </w:rPr>
-        <w:t>3. Passengers (End-Users)</w:t>
+          <w:szCs w:val="22"/>
+        </w:rPr>
+        <w:t>3. What We'll Do During the Analysis Phase</w:t>
+      </w:r>
+      <w:r>
+        <w:rPr>
+          <w:rFonts w:ascii="Arial" w:hAnsi="Arial" w:cs="Arial"/>
+          <w:b/>
+          <w:bCs/>
+          <w:szCs w:val="22"/>
+        </w:rPr>
+        <w:br/>
+      </w:r>
+      <w:r>
+        <w:rPr>
+          <w:rFonts w:ascii="Arial" w:hAnsi="Arial" w:cs="Arial"/>
+          <w:szCs w:val="22"/>
+        </w:rPr>
+        <w:t>This phase is all about research and planning. Here’s what we’ll do to build a strong foundation:</w:t>
       </w:r>
     </w:p>
     <w:p>
       <w:pPr>
         <w:numPr>
           <w:ilvl w:val="0"/>
-          <w:numId w:val="10"/>
+          <w:numId w:val="23"/>
         </w:numPr>
         <w:rPr>
           <w:rFonts w:ascii="Arial" w:hAnsi="Arial" w:cs="Arial"/>
+          <w:szCs w:val="22"/>
         </w:rPr>
       </w:pPr>
       <w:r>
@@ -2177,33 +1572,27 @@
           <w:rFonts w:ascii="Arial" w:hAnsi="Arial" w:cs="Arial"/>
           <w:b/>
           <w:bCs/>
-        </w:rPr>
-        <w:t>Contribution to Requirements Gathering:</w:t>
-      </w:r>
-      <w:r>
-        <w:rPr>
-          <w:rFonts w:ascii="Arial" w:hAnsi="Arial" w:cs="Arial"/>
-        </w:rPr>
-        <w:t> As the primary users of the system, passengers provide essential feedback on usability, desired features, and pain points. Through surveys, interviews, and usability testing, they help define requirements for intuitive navigation, clear flight information displays, and easy access to emergency services</w:t>
-      </w:r>
-      <w:r>
-        <w:rPr>
-          <w:rFonts w:ascii="Arial" w:hAnsi="Arial" w:cs="Arial"/>
-        </w:rPr>
-        <w:t>.</w:t>
-      </w:r>
-    </w:p>
-    <w:p>
-      <w:pPr>
-        <w:rPr>
-          <w:rFonts w:ascii="Arial" w:hAnsi="Arial" w:cs="Arial"/>
-        </w:rPr>
-      </w:pPr>
-    </w:p>
-    <w:p>
-      <w:pPr>
-        <w:rPr>
-          <w:rFonts w:ascii="Arial" w:hAnsi="Arial" w:cs="Arial"/>
+          <w:szCs w:val="22"/>
+        </w:rPr>
+        <w:t>Talk to the right people</w:t>
+      </w:r>
+      <w:r>
+        <w:rPr>
+          <w:rFonts w:ascii="Arial" w:hAnsi="Arial" w:cs="Arial"/>
+          <w:szCs w:val="22"/>
+        </w:rPr>
+        <w:t>: We’ll identify the key users (passengers, medical teams, airport management) and use interviews and surveys to understand exactly what they need from the flight info, navigation, and emergency features. Requirement gathering through stakeholder analysis is a foundational step in system design (Wiegers and Beatty, 2013).</w:t>
+      </w:r>
+    </w:p>
+    <w:p>
+      <w:pPr>
+        <w:numPr>
+          <w:ilvl w:val="0"/>
+          <w:numId w:val="23"/>
+        </w:numPr>
+        <w:rPr>
+          <w:rFonts w:ascii="Arial" w:hAnsi="Arial" w:cs="Arial"/>
+          <w:szCs w:val="22"/>
         </w:rPr>
       </w:pPr>
       <w:r>
@@ -2211,18 +1600,67 @@
           <w:rFonts w:ascii="Arial" w:hAnsi="Arial" w:cs="Arial"/>
           <w:b/>
           <w:bCs/>
-        </w:rPr>
-        <w:t>4. Ground Staff and Customer Service Agents</w:t>
+          <w:szCs w:val="22"/>
+        </w:rPr>
+        <w:t>Map out the scenarios</w:t>
+      </w:r>
+      <w:r>
+        <w:rPr>
+          <w:rFonts w:ascii="Arial" w:hAnsi="Arial" w:cs="Arial"/>
+          <w:szCs w:val="22"/>
+        </w:rPr>
+        <w:t xml:space="preserve">: We’ll use a technique called "event decomposition" to list </w:t>
+      </w:r>
+      <w:proofErr w:type="gramStart"/>
+      <w:r>
+        <w:rPr>
+          <w:rFonts w:ascii="Arial" w:hAnsi="Arial" w:cs="Arial"/>
+          <w:szCs w:val="22"/>
+        </w:rPr>
+        <w:t>every single thing</w:t>
+      </w:r>
+      <w:proofErr w:type="gramEnd"/>
+      <w:r>
+        <w:rPr>
+          <w:rFonts w:ascii="Arial" w:hAnsi="Arial" w:cs="Arial"/>
+          <w:szCs w:val="22"/>
+        </w:rPr>
+        <w:t xml:space="preserve"> the system needs to do. For example, what should happen when a </w:t>
+      </w:r>
+      <w:r>
+        <w:rPr>
+          <w:rFonts w:ascii="Arial" w:hAnsi="Arial" w:cs="Arial"/>
+          <w:szCs w:val="22"/>
+        </w:rPr>
+        <w:lastRenderedPageBreak/>
+        <w:t>"passenger asks for medical help" or when a "flight is delayed"? We’ll map out the system's response for each event. Event decomposition is a robust technique for identifying use cases by focusing on external events that a system must respond to (</w:t>
+      </w:r>
+      <w:proofErr w:type="spellStart"/>
+      <w:r>
+        <w:rPr>
+          <w:rFonts w:ascii="Arial" w:hAnsi="Arial" w:cs="Arial"/>
+          <w:szCs w:val="22"/>
+        </w:rPr>
+        <w:t>Satzinger</w:t>
+      </w:r>
+      <w:proofErr w:type="spellEnd"/>
+      <w:r>
+        <w:rPr>
+          <w:rFonts w:ascii="Arial" w:hAnsi="Arial" w:cs="Arial"/>
+          <w:szCs w:val="22"/>
+        </w:rPr>
+        <w:t>, Jackson and Burd, 2016).</w:t>
       </w:r>
     </w:p>
     <w:p>
       <w:pPr>
         <w:numPr>
           <w:ilvl w:val="0"/>
-          <w:numId w:val="11"/>
+          <w:numId w:val="23"/>
         </w:numPr>
         <w:rPr>
           <w:rFonts w:ascii="Arial" w:hAnsi="Arial" w:cs="Arial"/>
+          <w:szCs w:val="22"/>
         </w:rPr>
       </w:pPr>
       <w:r>
@@ -2230,33 +1668,43 @@
           <w:rFonts w:ascii="Arial" w:hAnsi="Arial" w:cs="Arial"/>
           <w:b/>
           <w:bCs/>
-        </w:rPr>
-        <w:t>Contribution to Requirements Gathering:</w:t>
-      </w:r>
-      <w:r>
-        <w:rPr>
-          <w:rFonts w:ascii="Arial" w:hAnsi="Arial" w:cs="Arial"/>
-        </w:rPr>
-        <w:t> These frontline employees interact with passengers daily and understand operational realities. They can identify practical needs such as how quickly emergency alerts must be received, what information is most helpful for assisting lost passengers, and how the system should integrate with their existing workflows</w:t>
-      </w:r>
-      <w:r>
-        <w:rPr>
-          <w:rFonts w:ascii="Arial" w:hAnsi="Arial" w:cs="Arial"/>
-        </w:rPr>
-        <w:t>.</w:t>
-      </w:r>
-    </w:p>
-    <w:p>
-      <w:pPr>
-        <w:rPr>
-          <w:rFonts w:ascii="Arial" w:hAnsi="Arial" w:cs="Arial"/>
-        </w:rPr>
-      </w:pPr>
-    </w:p>
-    <w:p>
-      <w:pPr>
-        <w:rPr>
-          <w:rFonts w:ascii="Arial" w:hAnsi="Arial" w:cs="Arial"/>
+          <w:szCs w:val="22"/>
+        </w:rPr>
+        <w:t>Create a data map</w:t>
+      </w:r>
+      <w:r>
+        <w:rPr>
+          <w:rFonts w:ascii="Arial" w:hAnsi="Arial" w:cs="Arial"/>
+          <w:szCs w:val="22"/>
+        </w:rPr>
+        <w:t xml:space="preserve">: We’ll build a simple diagram showing the key pieces of information the system needs to manage, like Passenger, Flight, and </w:t>
+      </w:r>
+      <w:proofErr w:type="spellStart"/>
+      <w:r>
+        <w:rPr>
+          <w:rFonts w:ascii="Arial" w:hAnsi="Arial" w:cs="Arial"/>
+          <w:szCs w:val="22"/>
+        </w:rPr>
+        <w:t>MedicalEmergency</w:t>
+      </w:r>
+      <w:proofErr w:type="spellEnd"/>
+      <w:r>
+        <w:rPr>
+          <w:rFonts w:ascii="Arial" w:hAnsi="Arial" w:cs="Arial"/>
+          <w:szCs w:val="22"/>
+        </w:rPr>
+        <w:t>, and how they are all connected. This is typically represented in an Entity-Relationship Diagram (ERD), which forms the conceptual basis for database design (Hoffer, Venkataraman and Topi, 2019).</w:t>
+      </w:r>
+    </w:p>
+    <w:p>
+      <w:pPr>
+        <w:numPr>
+          <w:ilvl w:val="0"/>
+          <w:numId w:val="23"/>
+        </w:numPr>
+        <w:rPr>
+          <w:rFonts w:ascii="Arial" w:hAnsi="Arial" w:cs="Arial"/>
+          <w:szCs w:val="22"/>
         </w:rPr>
       </w:pPr>
       <w:r>
@@ -2264,18 +1712,68 @@
           <w:rFonts w:ascii="Arial" w:hAnsi="Arial" w:cs="Arial"/>
           <w:b/>
           <w:bCs/>
-        </w:rPr>
-        <w:t>5. Medical and Emergency Services Personnel</w:t>
+          <w:szCs w:val="22"/>
+        </w:rPr>
+        <w:t>Write clear instructions</w:t>
+      </w:r>
+      <w:r>
+        <w:rPr>
+          <w:rFonts w:ascii="Arial" w:hAnsi="Arial" w:cs="Arial"/>
+          <w:szCs w:val="22"/>
+        </w:rPr>
+        <w:t>: For every action the system must perform, we’ll write a clear description. This covers the basic steps, what to do if something goes wrong, and what needs to happen before and after. These descriptions, known as use cases, are essential for capturing functional requirements and defining system behaviour (Cockburn, 2001).</w:t>
+      </w:r>
+    </w:p>
+    <w:p>
+      <w:pPr>
+        <w:rPr>
+          <w:rFonts w:ascii="Arial" w:hAnsi="Arial" w:cs="Arial"/>
+          <w:szCs w:val="22"/>
+        </w:rPr>
+      </w:pPr>
+    </w:p>
+    <w:p>
+      <w:pPr>
+        <w:rPr>
+          <w:rFonts w:ascii="Arial" w:hAnsi="Arial" w:cs="Arial"/>
+          <w:szCs w:val="22"/>
+        </w:rPr>
+      </w:pPr>
+      <w:r>
+        <w:rPr>
+          <w:rFonts w:ascii="Arial" w:hAnsi="Arial" w:cs="Arial"/>
+          <w:b/>
+          <w:bCs/>
+          <w:szCs w:val="22"/>
+        </w:rPr>
+        <w:t>4. What We'll Do During the Design Phase</w:t>
+      </w:r>
+      <w:r>
+        <w:rPr>
+          <w:rFonts w:ascii="Arial" w:hAnsi="Arial" w:cs="Arial"/>
+          <w:b/>
+          <w:bCs/>
+          <w:szCs w:val="22"/>
+        </w:rPr>
+        <w:br/>
+      </w:r>
+      <w:r>
+        <w:rPr>
+          <w:rFonts w:ascii="Arial" w:hAnsi="Arial" w:cs="Arial"/>
+          <w:szCs w:val="22"/>
+        </w:rPr>
+        <w:t>Now we take the research from the analysis phase and start building the blueprint for the actual software.</w:t>
       </w:r>
     </w:p>
     <w:p>
       <w:pPr>
         <w:numPr>
           <w:ilvl w:val="0"/>
-          <w:numId w:val="12"/>
+          <w:numId w:val="24"/>
         </w:numPr>
         <w:rPr>
           <w:rFonts w:ascii="Arial" w:hAnsi="Arial" w:cs="Arial"/>
+          <w:szCs w:val="22"/>
         </w:rPr>
       </w:pPr>
       <w:r>
@@ -2283,14 +1781,299 @@
           <w:rFonts w:ascii="Arial" w:hAnsi="Arial" w:cs="Arial"/>
           <w:b/>
           <w:bCs/>
-        </w:rPr>
-        <w:t>Contribution to Requirements Gathering:</w:t>
-      </w:r>
-      <w:r>
-        <w:rPr>
-          <w:rFonts w:ascii="Arial" w:hAnsi="Arial" w:cs="Arial"/>
-        </w:rPr>
-        <w:t xml:space="preserve"> As the system must provide "instant connection to medical and ambulatory services," these stakeholders are critical. They will specify requirements for alert accuracy, location precision, response time expectations, and what information they need immediately when responding to an emergency (e.g., passenger location, nature of the emergency) </w:t>
+          <w:szCs w:val="22"/>
+        </w:rPr>
+        <w:t>Break it down into parts</w:t>
+      </w:r>
+      <w:r>
+        <w:rPr>
+          <w:rFonts w:ascii="Arial" w:hAnsi="Arial" w:cs="Arial"/>
+          <w:szCs w:val="22"/>
+        </w:rPr>
+        <w:t>: To keep things organized, we’ll split the system into smaller, logical modules. This will likely include a Navigation part, an Emergency Services connector, a Flight Info updater, and a User Management section. This modular design, a form of systems architecture, improves maintainability and allows for parallel development (Dennis, Wixom and Tegarden, 2015).</w:t>
+      </w:r>
+    </w:p>
+    <w:p>
+      <w:pPr>
+        <w:numPr>
+          <w:ilvl w:val="0"/>
+          <w:numId w:val="24"/>
+        </w:numPr>
+        <w:rPr>
+          <w:rFonts w:ascii="Arial" w:hAnsi="Arial" w:cs="Arial"/>
+          <w:szCs w:val="22"/>
+        </w:rPr>
+      </w:pPr>
+      <w:r>
+        <w:rPr>
+          <w:rFonts w:ascii="Arial" w:hAnsi="Arial" w:cs="Arial"/>
+          <w:b/>
+          <w:bCs/>
+          <w:szCs w:val="22"/>
+        </w:rPr>
+        <w:t>Design the screens</w:t>
+      </w:r>
+      <w:r>
+        <w:rPr>
+          <w:rFonts w:ascii="Arial" w:hAnsi="Arial" w:cs="Arial"/>
+          <w:szCs w:val="22"/>
+        </w:rPr>
+        <w:t>: We’ll create simple mock-ups of what the airport kiosks and the mobile app will look like. We’ll focus on making it easy to use, ensuring that critical features like the "call for medical help" button is big, obvious, and easy to find. This user interface (UI) design process, often involving prototyping, is critical for usability and user adoption (Sharp, Rogers and Preece, 2019).</w:t>
+      </w:r>
+    </w:p>
+    <w:p>
+      <w:pPr>
+        <w:numPr>
+          <w:ilvl w:val="0"/>
+          <w:numId w:val="24"/>
+        </w:numPr>
+        <w:rPr>
+          <w:rFonts w:ascii="Arial" w:hAnsi="Arial" w:cs="Arial"/>
+          <w:szCs w:val="22"/>
+        </w:rPr>
+      </w:pPr>
+      <w:r>
+        <w:rPr>
+          <w:rFonts w:ascii="Arial" w:hAnsi="Arial" w:cs="Arial"/>
+          <w:b/>
+          <w:bCs/>
+          <w:szCs w:val="22"/>
+        </w:rPr>
+        <w:t>Design the database</w:t>
+      </w:r>
+      <w:r>
+        <w:rPr>
+          <w:rFonts w:ascii="Arial" w:hAnsi="Arial" w:cs="Arial"/>
+          <w:szCs w:val="22"/>
+        </w:rPr>
+        <w:t>: We’ll design the behind-the-scenes structure for storing all the information. This means figuring out the best way to save and quickly find things like flight updates, locations of shops and gates, and details of an active emergency. A well-structured database schema, typically in a relational model, is crucial for data integrity and retrieval efficiency (Connolly and Begg, 2015).</w:t>
+      </w:r>
+    </w:p>
+    <w:p>
+      <w:pPr>
+        <w:numPr>
+          <w:ilvl w:val="0"/>
+          <w:numId w:val="24"/>
+        </w:numPr>
+        <w:rPr>
+          <w:rFonts w:ascii="Arial" w:hAnsi="Arial" w:cs="Arial"/>
+          <w:szCs w:val="22"/>
+        </w:rPr>
+      </w:pPr>
+      <w:r>
+        <w:rPr>
+          <w:rFonts w:ascii="Arial" w:hAnsi="Arial" w:cs="Arial"/>
+          <w:b/>
+          <w:bCs/>
+          <w:szCs w:val="22"/>
+        </w:rPr>
+        <w:t>Plan how parts talk to each other</w:t>
+      </w:r>
+      <w:r>
+        <w:rPr>
+          <w:rFonts w:ascii="Arial" w:hAnsi="Arial" w:cs="Arial"/>
+          <w:szCs w:val="22"/>
+        </w:rPr>
+        <w:t xml:space="preserve">: We’ll map out how the different parts of the system (like the app and the navigation engine) will communicate. We'll also plan how the whole system will connect to the airport’s existing flight data and emergency dispatch networks. This involves defining application programming interfaces (APIs) and integration architectures, which are key to ensuring system interoperability (Bass, Clements and </w:t>
+      </w:r>
+      <w:proofErr w:type="spellStart"/>
+      <w:r>
+        <w:rPr>
+          <w:rFonts w:ascii="Arial" w:hAnsi="Arial" w:cs="Arial"/>
+          <w:szCs w:val="22"/>
+        </w:rPr>
+        <w:t>Kazman</w:t>
+      </w:r>
+      <w:proofErr w:type="spellEnd"/>
+      <w:r>
+        <w:rPr>
+          <w:rFonts w:ascii="Arial" w:hAnsi="Arial" w:cs="Arial"/>
+          <w:szCs w:val="22"/>
+        </w:rPr>
+        <w:t>, 2013).</w:t>
+      </w:r>
+    </w:p>
+    <w:p>
+      <w:pPr>
+        <w:rPr>
+          <w:rFonts w:ascii="Arial" w:hAnsi="Arial" w:cs="Arial"/>
+          <w:szCs w:val="22"/>
+        </w:rPr>
+      </w:pPr>
+    </w:p>
+    <w:p>
+      <w:pPr>
+        <w:rPr>
+          <w:rFonts w:ascii="Arial" w:hAnsi="Arial" w:cs="Arial"/>
+          <w:szCs w:val="22"/>
+        </w:rPr>
+      </w:pPr>
+      <w:r>
+        <w:rPr>
+          <w:rFonts w:ascii="Arial" w:hAnsi="Arial" w:cs="Arial"/>
+          <w:b/>
+          <w:bCs/>
+          <w:szCs w:val="22"/>
+        </w:rPr>
+        <w:t>5. Why We Recommend an Iterative Approach</w:t>
+      </w:r>
+      <w:r>
+        <w:rPr>
+          <w:rFonts w:ascii="Arial" w:hAnsi="Arial" w:cs="Arial"/>
+          <w:szCs w:val="22"/>
+        </w:rPr>
+        <w:br/>
+        <w:t xml:space="preserve">Instead of building everything in one long sequence, we suggest an iterative approach, </w:t>
+      </w:r>
+      <w:r>
+        <w:rPr>
+          <w:rFonts w:ascii="Arial" w:hAnsi="Arial" w:cs="Arial"/>
+          <w:szCs w:val="22"/>
+        </w:rPr>
+        <w:lastRenderedPageBreak/>
+        <w:t>which means building the system in repeated cycles. This is the best way to go for the ACRMS for a few reasons:</w:t>
+      </w:r>
+    </w:p>
+    <w:p>
+      <w:pPr>
+        <w:numPr>
+          <w:ilvl w:val="0"/>
+          <w:numId w:val="25"/>
+        </w:numPr>
+        <w:rPr>
+          <w:rFonts w:ascii="Arial" w:hAnsi="Arial" w:cs="Arial"/>
+          <w:szCs w:val="22"/>
+        </w:rPr>
+      </w:pPr>
+      <w:r>
+        <w:rPr>
+          <w:rFonts w:ascii="Arial" w:hAnsi="Arial" w:cs="Arial"/>
+          <w:b/>
+          <w:bCs/>
+          <w:szCs w:val="22"/>
+        </w:rPr>
+        <w:t>Test the tricky parts first</w:t>
+      </w:r>
+      <w:r>
+        <w:rPr>
+          <w:rFonts w:ascii="Arial" w:hAnsi="Arial" w:cs="Arial"/>
+          <w:szCs w:val="22"/>
+        </w:rPr>
+        <w:t>: The most complex feature is linking to medical services. By building a simple working version of this early on, we can test it thoroughly to make sure it's reliable before we build the rest of the system. This is a core principle of iterative development, where high-risk elements are addressed early in the project (Larman, 2004).</w:t>
+      </w:r>
+    </w:p>
+    <w:p>
+      <w:pPr>
+        <w:numPr>
+          <w:ilvl w:val="0"/>
+          <w:numId w:val="25"/>
+        </w:numPr>
+        <w:rPr>
+          <w:rFonts w:ascii="Arial" w:hAnsi="Arial" w:cs="Arial"/>
+          <w:szCs w:val="22"/>
+        </w:rPr>
+      </w:pPr>
+      <w:r>
+        <w:rPr>
+          <w:rFonts w:ascii="Arial" w:hAnsi="Arial" w:cs="Arial"/>
+          <w:b/>
+          <w:bCs/>
+          <w:szCs w:val="22"/>
+        </w:rPr>
+        <w:t>Adapt to changes easily</w:t>
+      </w:r>
+      <w:r>
+        <w:rPr>
+          <w:rFonts w:ascii="Arial" w:hAnsi="Arial" w:cs="Arial"/>
+          <w:szCs w:val="22"/>
+        </w:rPr>
+        <w:t>: Feedback might show that tourists find the GPS directions confusing. With an iterative approach, we can improve the design in the next cycle without throwing the whole project off track. Iterative methods like Agile are designed to accommodate changing requirements, a common challenge in software projects (Pressman, 2014).</w:t>
+      </w:r>
+    </w:p>
+    <w:p>
+      <w:pPr>
+        <w:numPr>
+          <w:ilvl w:val="0"/>
+          <w:numId w:val="25"/>
+        </w:numPr>
+        <w:rPr>
+          <w:rFonts w:ascii="Arial" w:hAnsi="Arial" w:cs="Arial"/>
+          <w:szCs w:val="22"/>
+        </w:rPr>
+      </w:pPr>
+      <w:r>
+        <w:rPr>
+          <w:rFonts w:ascii="Arial" w:hAnsi="Arial" w:cs="Arial"/>
+          <w:b/>
+          <w:bCs/>
+          <w:szCs w:val="22"/>
+        </w:rPr>
+        <w:t>Get feedback as we go</w:t>
+      </w:r>
+      <w:r>
+        <w:rPr>
+          <w:rFonts w:ascii="Arial" w:hAnsi="Arial" w:cs="Arial"/>
+          <w:szCs w:val="22"/>
+        </w:rPr>
+        <w:t>: This method lets users see and try parts of the system early. Their feedback helps us make sure the final product truly meets their needs, which leads to a better result and fewer expensive fixes after launch. User involvement through iterative prototyping significantly increases the likelihood of system success (Boehm and Turner, 2004).</w:t>
+      </w:r>
+    </w:p>
+    <w:p>
+      <w:pPr>
+        <w:rPr>
+          <w:rFonts w:ascii="Arial" w:hAnsi="Arial" w:cs="Arial"/>
+          <w:szCs w:val="22"/>
+        </w:rPr>
+      </w:pPr>
+    </w:p>
+    <w:p>
+      <w:pPr>
+        <w:rPr>
+          <w:rFonts w:ascii="Arial" w:hAnsi="Arial" w:cs="Arial"/>
+          <w:sz w:val="24"/>
+          <w:szCs w:val="28"/>
+        </w:rPr>
+      </w:pPr>
+      <w:r>
+        <w:rPr>
+          <w:rFonts w:ascii="Arial" w:hAnsi="Arial" w:cs="Arial"/>
+          <w:b/>
+          <w:bCs/>
+          <w:szCs w:val="22"/>
+        </w:rPr>
+        <w:t>6. Conclusion</w:t>
+      </w:r>
+      <w:r>
+        <w:rPr>
+          <w:rFonts w:ascii="Arial" w:hAnsi="Arial" w:cs="Arial"/>
+          <w:b/>
+          <w:bCs/>
+          <w:szCs w:val="22"/>
+        </w:rPr>
+        <w:br/>
+      </w:r>
+      <w:r>
+        <w:rPr>
+          <w:rFonts w:ascii="Arial" w:hAnsi="Arial" w:cs="Arial"/>
+          <w:szCs w:val="22"/>
+        </w:rPr>
+        <w:t xml:space="preserve">In short, building the ACRMS is about more than just writing code. It’s a journey from understanding your needs (Analysis) to planning the solution (Design). The steps we've outlined such as defining requirements, designing the architecture, and prototyping the screens aren't just paperwork. They are the essential steps that make sure the final system is reliable, can grow with your needs, and is simple for passengers to use (Avison and Fitzgerald, 2006). Our commitment to building in cycles means we can handle the challenge of combining flight data, GPS, and emergency alerts, all while staying flexible to your feedback. We have the skills to put this plan into action, and we are confident we can deliver a system that will improve the passenger experience and be </w:t>
+      </w:r>
+      <w:proofErr w:type="gramStart"/>
+      <w:r>
+        <w:rPr>
+          <w:rFonts w:ascii="Arial" w:hAnsi="Arial" w:cs="Arial"/>
+          <w:szCs w:val="22"/>
+        </w:rPr>
+        <w:t>a valuable asset</w:t>
+      </w:r>
+      <w:proofErr w:type="gramEnd"/>
+      <w:r>
+        <w:rPr>
+          <w:rFonts w:ascii="Arial" w:hAnsi="Arial" w:cs="Arial"/>
+          <w:szCs w:val="22"/>
+        </w:rPr>
+        <w:t xml:space="preserve"> for the airport.</w:t>
       </w:r>
     </w:p>
     <w:p>
@@ -2317,7 +2100,318 @@
           <w:rFonts w:ascii="Arial" w:hAnsi="Arial" w:cs="Arial"/>
         </w:rPr>
       </w:pPr>
-      <w:bookmarkStart w:id="2" w:name="_Toc225082626"/>
+      <w:bookmarkStart w:id="2" w:name="_Toc225083442"/>
+      <w:r>
+        <w:rPr>
+          <w:rFonts w:ascii="Arial" w:hAnsi="Arial" w:cs="Arial"/>
+        </w:rPr>
+        <w:lastRenderedPageBreak/>
+        <w:t>Question 2</w:t>
+      </w:r>
+      <w:r>
+        <w:rPr>
+          <w:rFonts w:ascii="Arial" w:hAnsi="Arial" w:cs="Arial"/>
+        </w:rPr>
+        <w:t xml:space="preserve"> – Potential Stakeholders</w:t>
+      </w:r>
+      <w:bookmarkEnd w:id="2"/>
+    </w:p>
+    <w:p>
+      <w:pPr>
+        <w:rPr>
+          <w:rFonts w:ascii="Arial" w:hAnsi="Arial" w:cs="Arial"/>
+        </w:rPr>
+      </w:pPr>
+      <w:r>
+        <w:rPr>
+          <w:rFonts w:ascii="Arial" w:hAnsi="Arial" w:cs="Arial"/>
+        </w:rPr>
+        <w:t>Q.</w:t>
+      </w:r>
+      <w:r>
+        <w:rPr>
+          <w:rFonts w:ascii="Arial" w:hAnsi="Arial" w:cs="Arial"/>
+        </w:rPr>
+        <w:t>2.1)</w:t>
+      </w:r>
+    </w:p>
+    <w:p>
+      <w:pPr>
+        <w:rPr>
+          <w:rFonts w:ascii="Arial" w:hAnsi="Arial" w:cs="Arial"/>
+        </w:rPr>
+      </w:pPr>
+      <w:r>
+        <w:rPr>
+          <w:rFonts w:ascii="Arial" w:hAnsi="Arial" w:cs="Arial"/>
+          <w:b/>
+          <w:bCs/>
+        </w:rPr>
+        <w:t>1. Airport Management / Airport Authority</w:t>
+      </w:r>
+    </w:p>
+    <w:p>
+      <w:pPr>
+        <w:numPr>
+          <w:ilvl w:val="0"/>
+          <w:numId w:val="8"/>
+        </w:numPr>
+        <w:rPr>
+          <w:rFonts w:ascii="Arial" w:hAnsi="Arial" w:cs="Arial"/>
+        </w:rPr>
+      </w:pPr>
+      <w:r>
+        <w:rPr>
+          <w:rFonts w:ascii="Arial" w:hAnsi="Arial" w:cs="Arial"/>
+          <w:b/>
+          <w:bCs/>
+        </w:rPr>
+        <w:t>Contribution to Requirements Gathering:</w:t>
+      </w:r>
+      <w:r>
+        <w:rPr>
+          <w:rFonts w:ascii="Arial" w:hAnsi="Arial" w:cs="Arial"/>
+        </w:rPr>
+        <w:t> They provide the strategic vision and high-level business objectives for the system. They will clarify the airport's goals for customer satisfaction, define budget constraints, and outline the expected return on investment. Their input ensures the system aligns with the airport's overall direction</w:t>
+      </w:r>
+      <w:r>
+        <w:rPr>
+          <w:rFonts w:ascii="Arial" w:hAnsi="Arial" w:cs="Arial"/>
+        </w:rPr>
+        <w:t>.</w:t>
+      </w:r>
+    </w:p>
+    <w:p>
+      <w:pPr>
+        <w:rPr>
+          <w:rFonts w:ascii="Arial" w:hAnsi="Arial" w:cs="Arial"/>
+        </w:rPr>
+      </w:pPr>
+    </w:p>
+    <w:p>
+      <w:pPr>
+        <w:rPr>
+          <w:rFonts w:ascii="Arial" w:hAnsi="Arial" w:cs="Arial"/>
+        </w:rPr>
+      </w:pPr>
+      <w:r>
+        <w:rPr>
+          <w:rFonts w:ascii="Arial" w:hAnsi="Arial" w:cs="Arial"/>
+          <w:b/>
+          <w:bCs/>
+        </w:rPr>
+        <w:t>2. Airline Representatives</w:t>
+      </w:r>
+    </w:p>
+    <w:p>
+      <w:pPr>
+        <w:numPr>
+          <w:ilvl w:val="0"/>
+          <w:numId w:val="9"/>
+        </w:numPr>
+        <w:rPr>
+          <w:rFonts w:ascii="Arial" w:hAnsi="Arial" w:cs="Arial"/>
+        </w:rPr>
+      </w:pPr>
+      <w:r>
+        <w:rPr>
+          <w:rFonts w:ascii="Arial" w:hAnsi="Arial" w:cs="Arial"/>
+          <w:b/>
+          <w:bCs/>
+        </w:rPr>
+        <w:t>Contribution to Requirements Gathering:</w:t>
+      </w:r>
+      <w:r>
+        <w:rPr>
+          <w:rFonts w:ascii="Arial" w:hAnsi="Arial" w:cs="Arial"/>
+        </w:rPr>
+        <w:t> Airlines are key partners who will share data regarding flight schedules, delays, and passenger connections. They can specify requirements for how flight information should be displayed and how the system should handle disruptions, ensuring smooth communication between the airport and its airline tenants</w:t>
+      </w:r>
+      <w:r>
+        <w:rPr>
+          <w:rFonts w:ascii="Arial" w:hAnsi="Arial" w:cs="Arial"/>
+        </w:rPr>
+        <w:t>.</w:t>
+      </w:r>
+    </w:p>
+    <w:p>
+      <w:pPr>
+        <w:rPr>
+          <w:rFonts w:ascii="Arial" w:hAnsi="Arial" w:cs="Arial"/>
+        </w:rPr>
+      </w:pPr>
+    </w:p>
+    <w:p>
+      <w:pPr>
+        <w:rPr>
+          <w:rFonts w:ascii="Arial" w:hAnsi="Arial" w:cs="Arial"/>
+        </w:rPr>
+      </w:pPr>
+      <w:r>
+        <w:rPr>
+          <w:rFonts w:ascii="Arial" w:hAnsi="Arial" w:cs="Arial"/>
+          <w:b/>
+          <w:bCs/>
+        </w:rPr>
+        <w:t>3. Passengers (End-Users)</w:t>
+      </w:r>
+    </w:p>
+    <w:p>
+      <w:pPr>
+        <w:numPr>
+          <w:ilvl w:val="0"/>
+          <w:numId w:val="10"/>
+        </w:numPr>
+        <w:rPr>
+          <w:rFonts w:ascii="Arial" w:hAnsi="Arial" w:cs="Arial"/>
+        </w:rPr>
+      </w:pPr>
+      <w:r>
+        <w:rPr>
+          <w:rFonts w:ascii="Arial" w:hAnsi="Arial" w:cs="Arial"/>
+          <w:b/>
+          <w:bCs/>
+        </w:rPr>
+        <w:t>Contribution to Requirements Gathering:</w:t>
+      </w:r>
+      <w:r>
+        <w:rPr>
+          <w:rFonts w:ascii="Arial" w:hAnsi="Arial" w:cs="Arial"/>
+        </w:rPr>
+        <w:t> As the primary users of the system, passengers provide essential feedback on usability, desired features, and pain points. Through surveys, interviews, and usability testing, they help define requirements for intuitive navigation, clear flight information displays, and easy access to emergency services</w:t>
+      </w:r>
+      <w:r>
+        <w:rPr>
+          <w:rFonts w:ascii="Arial" w:hAnsi="Arial" w:cs="Arial"/>
+        </w:rPr>
+        <w:t>.</w:t>
+      </w:r>
+    </w:p>
+    <w:p>
+      <w:pPr>
+        <w:rPr>
+          <w:rFonts w:ascii="Arial" w:hAnsi="Arial" w:cs="Arial"/>
+        </w:rPr>
+      </w:pPr>
+    </w:p>
+    <w:p>
+      <w:pPr>
+        <w:rPr>
+          <w:rFonts w:ascii="Arial" w:hAnsi="Arial" w:cs="Arial"/>
+        </w:rPr>
+      </w:pPr>
+      <w:r>
+        <w:rPr>
+          <w:rFonts w:ascii="Arial" w:hAnsi="Arial" w:cs="Arial"/>
+          <w:b/>
+          <w:bCs/>
+        </w:rPr>
+        <w:t>4. Ground Staff and Customer Service Agents</w:t>
+      </w:r>
+    </w:p>
+    <w:p>
+      <w:pPr>
+        <w:numPr>
+          <w:ilvl w:val="0"/>
+          <w:numId w:val="11"/>
+        </w:numPr>
+        <w:rPr>
+          <w:rFonts w:ascii="Arial" w:hAnsi="Arial" w:cs="Arial"/>
+        </w:rPr>
+      </w:pPr>
+      <w:r>
+        <w:rPr>
+          <w:rFonts w:ascii="Arial" w:hAnsi="Arial" w:cs="Arial"/>
+          <w:b/>
+          <w:bCs/>
+        </w:rPr>
+        <w:t>Contribution to Requirements Gathering:</w:t>
+      </w:r>
+      <w:r>
+        <w:rPr>
+          <w:rFonts w:ascii="Arial" w:hAnsi="Arial" w:cs="Arial"/>
+        </w:rPr>
+        <w:t> These frontline employees interact with passengers daily and understand operational realities. They can identify practical needs such as how quickly emergency alerts must be received, what information is most helpful for assisting lost passengers, and how the system should integrate with their existing workflows</w:t>
+      </w:r>
+      <w:r>
+        <w:rPr>
+          <w:rFonts w:ascii="Arial" w:hAnsi="Arial" w:cs="Arial"/>
+        </w:rPr>
+        <w:t>.</w:t>
+      </w:r>
+    </w:p>
+    <w:p>
+      <w:pPr>
+        <w:rPr>
+          <w:rFonts w:ascii="Arial" w:hAnsi="Arial" w:cs="Arial"/>
+        </w:rPr>
+      </w:pPr>
+    </w:p>
+    <w:p>
+      <w:pPr>
+        <w:rPr>
+          <w:rFonts w:ascii="Arial" w:hAnsi="Arial" w:cs="Arial"/>
+        </w:rPr>
+      </w:pPr>
+      <w:r>
+        <w:rPr>
+          <w:rFonts w:ascii="Arial" w:hAnsi="Arial" w:cs="Arial"/>
+          <w:b/>
+          <w:bCs/>
+        </w:rPr>
+        <w:t>5. Medical and Emergency Services Personnel</w:t>
+      </w:r>
+    </w:p>
+    <w:p>
+      <w:pPr>
+        <w:numPr>
+          <w:ilvl w:val="0"/>
+          <w:numId w:val="12"/>
+        </w:numPr>
+        <w:rPr>
+          <w:rFonts w:ascii="Arial" w:hAnsi="Arial" w:cs="Arial"/>
+        </w:rPr>
+      </w:pPr>
+      <w:r>
+        <w:rPr>
+          <w:rFonts w:ascii="Arial" w:hAnsi="Arial" w:cs="Arial"/>
+          <w:b/>
+          <w:bCs/>
+        </w:rPr>
+        <w:t>Contribution to Requirements Gathering:</w:t>
+      </w:r>
+      <w:r>
+        <w:rPr>
+          <w:rFonts w:ascii="Arial" w:hAnsi="Arial" w:cs="Arial"/>
+        </w:rPr>
+        <w:t xml:space="preserve"> As the system must provide "instant connection to medical and ambulatory services," these stakeholders are critical. They will specify requirements for alert accuracy, location precision, response time expectations, and what information they need immediately when responding to an emergency (e.g., passenger location, nature of the emergency) </w:t>
+      </w:r>
+    </w:p>
+    <w:p>
+      <w:pPr>
+        <w:rPr>
+          <w:rFonts w:ascii="Arial" w:eastAsiaTheme="majorEastAsia" w:hAnsi="Arial" w:cs="Arial"/>
+          <w:color w:val="000000" w:themeColor="text1"/>
+          <w:sz w:val="28"/>
+          <w:szCs w:val="40"/>
+          <w:u w:val="single"/>
+        </w:rPr>
+      </w:pPr>
+      <w:r>
+        <w:rPr>
+          <w:rFonts w:ascii="Arial" w:hAnsi="Arial" w:cs="Arial"/>
+        </w:rPr>
+        <w:br w:type="page"/>
+      </w:r>
+    </w:p>
+    <w:p>
+      <w:pPr>
+        <w:pStyle w:val="Heading1"/>
+        <w:rPr>
+          <w:rFonts w:ascii="Arial" w:hAnsi="Arial" w:cs="Arial"/>
+        </w:rPr>
+      </w:pPr>
+      <w:bookmarkStart w:id="3" w:name="_Toc225083443"/>
       <w:r>
         <w:rPr>
           <w:rFonts w:ascii="Arial" w:hAnsi="Arial" w:cs="Arial"/>
@@ -2331,7 +2425,7 @@
         </w:rPr>
         <w:t xml:space="preserve"> – Decomposition Technique and Use Case Description</w:t>
       </w:r>
-      <w:bookmarkEnd w:id="2"/>
+      <w:bookmarkEnd w:id="3"/>
     </w:p>
     <w:p>
       <w:pPr>
@@ -3372,6 +3466,7 @@
                 <w:b/>
                 <w:bCs/>
               </w:rPr>
+              <w:lastRenderedPageBreak/>
               <w:t>Postconditions</w:t>
             </w:r>
           </w:p>
@@ -3526,7 +3621,7 @@
           <w:rFonts w:ascii="Arial" w:hAnsi="Arial" w:cs="Arial"/>
         </w:rPr>
       </w:pPr>
-      <w:bookmarkStart w:id="3" w:name="_Toc225082627"/>
+      <w:bookmarkStart w:id="4" w:name="_Toc225083444"/>
       <w:r>
         <w:rPr>
           <w:rFonts w:ascii="Arial" w:hAnsi="Arial" w:cs="Arial"/>
@@ -3540,7 +3635,7 @@
         </w:rPr>
         <w:t xml:space="preserve"> – Domain Model Class Diagram</w:t>
       </w:r>
-      <w:bookmarkEnd w:id="3"/>
+      <w:bookmarkEnd w:id="4"/>
     </w:p>
     <w:p>
       <w:pPr>
@@ -3768,7 +3863,7 @@
           <w:rFonts w:ascii="Arial" w:hAnsi="Arial" w:cs="Arial"/>
         </w:rPr>
       </w:pPr>
-      <w:bookmarkStart w:id="4" w:name="_Toc225082628"/>
+      <w:bookmarkStart w:id="5" w:name="_Toc225083445"/>
       <w:r>
         <w:rPr>
           <w:rFonts w:ascii="Arial" w:hAnsi="Arial" w:cs="Arial"/>
@@ -3776,7 +3871,7 @@
         <w:lastRenderedPageBreak/>
         <w:t>References</w:t>
       </w:r>
-      <w:bookmarkEnd w:id="4"/>
+      <w:bookmarkEnd w:id="5"/>
     </w:p>
     <w:p>
       <w:pPr>
@@ -9486,6 +9581,7 @@
   <w:style w:type="character" w:default="1" w:styleId="DefaultParagraphFont">
     <w:name w:val="Default Paragraph Font"/>
     <w:uiPriority w:val="1"/>
+    <w:semiHidden/>
     <w:unhideWhenUsed/>
   </w:style>
   <w:style w:type="table" w:default="1" w:styleId="TableNormal">

</xml_diff>